<commit_message>
Agregado de pasos e informacion obtenida al informe
</commit_message>
<xml_diff>
--- a/Documentacion/Detection and Replace of Unsafe Code.docx
+++ b/Documentacion/Detection and Replace of Unsafe Code.docx
@@ -5,9 +5,12 @@
     <w:sdt>
       <w:sdtPr>
         <w:rPr>
-          <w:rFonts w:ascii="Times New Roman" w:hAnsi="Times New Roman" w:cs="Times New Roman"/>
+          <w:rFonts w:ascii="Times New Roman" w:eastAsiaTheme="minorHAnsi" w:hAnsi="Times New Roman" w:cs="Times New Roman"/>
           <w:b/>
           <w:bCs/>
+          <w:kern w:val="2"/>
+          <w:lang w:eastAsia="en-US"/>
+          <w14:ligatures w14:val="standardContextual"/>
         </w:rPr>
         <w:id w:val="1938564947"/>
         <w:docPartObj>
@@ -17,14 +20,10 @@
       </w:sdtPr>
       <w:sdtEndPr>
         <w:rPr>
-          <w:rFonts w:eastAsiaTheme="minorHAnsi"/>
           <w:b w:val="0"/>
           <w:bCs w:val="0"/>
-          <w:kern w:val="2"/>
-          <w:sz w:val="24"/>
-          <w:szCs w:val="24"/>
-          <w:lang w:eastAsia="en-US"/>
-          <w14:ligatures w14:val="standardContextual"/>
+          <w:sz w:val="24"/>
+          <w:szCs w:val="24"/>
         </w:rPr>
       </w:sdtEndPr>
       <w:sdtContent>
@@ -88,6 +87,18 @@
                 </w:rPr>
                 <w:t>Detection and Replace of Unsafe Code</w:t>
               </w:r>
+              <w:r>
+                <w:rPr>
+                  <w:rFonts w:ascii="Times New Roman" w:eastAsiaTheme="majorEastAsia" w:hAnsi="Times New Roman" w:cs="Times New Roman"/>
+                  <w:b/>
+                  <w:bCs/>
+                  <w:caps/>
+                  <w:sz w:val="40"/>
+                  <w:szCs w:val="40"/>
+                  <w:lang w:val="en-US"/>
+                </w:rPr>
+                <w:t xml:space="preserve"> on rust language</w:t>
+              </w:r>
             </w:p>
           </w:sdtContent>
         </w:sdt>
@@ -120,7 +131,6 @@
                   <w:bCs/>
                   <w:sz w:val="36"/>
                   <w:szCs w:val="36"/>
-                  <w:lang w:val="en-US"/>
                 </w:rPr>
               </w:pPr>
               <w:r>
@@ -167,25 +177,17 @@
             <w:jc w:val="center"/>
             <w:rPr>
               <w:rFonts w:ascii="Times New Roman" w:hAnsi="Times New Roman" w:cs="Times New Roman"/>
-              <w:sz w:val="24"/>
-              <w:szCs w:val="24"/>
+              <w:sz w:val="28"/>
+              <w:szCs w:val="28"/>
             </w:rPr>
           </w:pPr>
           <w:r>
             <w:rPr>
               <w:rFonts w:ascii="Times New Roman" w:hAnsi="Times New Roman" w:cs="Times New Roman"/>
-              <w:sz w:val="24"/>
-              <w:szCs w:val="24"/>
+              <w:sz w:val="28"/>
+              <w:szCs w:val="28"/>
             </w:rPr>
-            <w:t xml:space="preserve">Alexis Uriel </w:t>
-          </w:r>
-          <w:r>
-            <w:rPr>
-              <w:rFonts w:ascii="Times New Roman" w:hAnsi="Times New Roman" w:cs="Times New Roman"/>
-              <w:sz w:val="24"/>
-              <w:szCs w:val="24"/>
-            </w:rPr>
-            <w:t>Guzman</w:t>
+            <w:t>Alexis Uriel Guzman</w:t>
           </w:r>
         </w:p>
         <w:p>
@@ -252,7 +254,7 @@
               <w:sz w:val="24"/>
               <w:szCs w:val="24"/>
             </w:rPr>
-            <w:t>Director de tesis: Marcelo Arroyo</w:t>
+            <w:t>Director: Marcelo</w:t>
           </w:r>
           <w:r>
             <w:rPr>
@@ -260,7 +262,47 @@
               <w:sz w:val="24"/>
               <w:szCs w:val="24"/>
             </w:rPr>
-            <w:t>, Doctor en algo</w:t>
+            <w:t xml:space="preserve"> Daniel</w:t>
+          </w:r>
+          <w:r>
+            <w:rPr>
+              <w:rFonts w:ascii="Times New Roman" w:hAnsi="Times New Roman" w:cs="Times New Roman"/>
+              <w:sz w:val="24"/>
+              <w:szCs w:val="24"/>
+            </w:rPr>
+            <w:t xml:space="preserve"> Arroyo</w:t>
+          </w:r>
+          <w:r>
+            <w:rPr>
+              <w:rFonts w:ascii="Times New Roman" w:hAnsi="Times New Roman" w:cs="Times New Roman"/>
+              <w:sz w:val="24"/>
+              <w:szCs w:val="24"/>
+            </w:rPr>
+            <w:t>, Dr</w:t>
+          </w:r>
+          <w:r>
+            <w:rPr>
+              <w:rFonts w:ascii="Times New Roman" w:hAnsi="Times New Roman" w:cs="Times New Roman"/>
+              <w:sz w:val="24"/>
+              <w:szCs w:val="24"/>
+            </w:rPr>
+            <w:t>.</w:t>
+          </w:r>
+          <w:r>
+            <w:rPr>
+              <w:rFonts w:ascii="Times New Roman" w:hAnsi="Times New Roman" w:cs="Times New Roman"/>
+              <w:sz w:val="24"/>
+              <w:szCs w:val="24"/>
+            </w:rPr>
+            <w:t xml:space="preserve"> en </w:t>
+          </w:r>
+          <w:r>
+            <w:rPr>
+              <w:rFonts w:ascii="Times New Roman" w:hAnsi="Times New Roman" w:cs="Times New Roman"/>
+              <w:sz w:val="24"/>
+              <w:szCs w:val="24"/>
+            </w:rPr>
+            <w:t>Computación</w:t>
           </w:r>
         </w:p>
         <w:p>
@@ -295,7 +337,7 @@
               <w14:ligatures w14:val="standardContextual"/>
             </w:rPr>
             <w:drawing>
-              <wp:anchor distT="0" distB="0" distL="114300" distR="114300" simplePos="0" relativeHeight="251661312" behindDoc="0" locked="0" layoutInCell="1" allowOverlap="1" wp14:anchorId="2A3E0791" wp14:editId="77BB52A1">
+              <wp:anchor distT="0" distB="0" distL="114300" distR="114300" simplePos="0" relativeHeight="251661312" behindDoc="0" locked="0" layoutInCell="1" allowOverlap="1" wp14:anchorId="2A3E0791" wp14:editId="772FFFEE">
                 <wp:simplePos x="0" y="0"/>
                 <wp:positionH relativeFrom="column">
                   <wp:posOffset>3154045</wp:posOffset>
@@ -318,7 +360,7 @@
                         <pic:cNvPicPr/>
                       </pic:nvPicPr>
                       <pic:blipFill>
-                        <a:blip r:embed="rId4" cstate="print">
+                        <a:blip r:embed="rId7" cstate="print">
                           <a:extLst>
                             <a:ext uri="{28A0092B-C50C-407E-A947-70E740481C1C}">
                               <a14:useLocalDpi xmlns:a14="http://schemas.microsoft.com/office/drawing/2010/main" val="0"/>
@@ -382,7 +424,7 @@
                         <pic:cNvPicPr/>
                       </pic:nvPicPr>
                       <pic:blipFill>
-                        <a:blip r:embed="rId5" cstate="print">
+                        <a:blip r:embed="rId8" cstate="print">
                           <a:extLst>
                             <a:ext uri="{28A0092B-C50C-407E-A947-70E740481C1C}">
                               <a14:useLocalDpi xmlns:a14="http://schemas.microsoft.com/office/drawing/2010/main" val="0"/>
@@ -572,6 +614,2955 @@
     </w:sdt>
     <w:p>
       <w:pPr>
+        <w:jc w:val="center"/>
+        <w:rPr>
+          <w:rFonts w:ascii="Times New Roman" w:hAnsi="Times New Roman" w:cs="Times New Roman"/>
+          <w:sz w:val="32"/>
+          <w:szCs w:val="32"/>
+        </w:rPr>
+      </w:pPr>
+      <w:r>
+        <w:rPr>
+          <w:rFonts w:ascii="Times New Roman" w:hAnsi="Times New Roman" w:cs="Times New Roman"/>
+          <w:sz w:val="32"/>
+          <w:szCs w:val="32"/>
+        </w:rPr>
+        <w:lastRenderedPageBreak/>
+        <w:t>Resumen</w:t>
+      </w:r>
+    </w:p>
+    <w:p>
+      <w:pPr>
+        <w:rPr>
+          <w:rFonts w:ascii="Times New Roman" w:hAnsi="Times New Roman" w:cs="Times New Roman"/>
+          <w:sz w:val="24"/>
+          <w:szCs w:val="24"/>
+        </w:rPr>
+      </w:pPr>
+      <w:r>
+        <w:rPr>
+          <w:rFonts w:ascii="Times New Roman" w:hAnsi="Times New Roman" w:cs="Times New Roman"/>
+          <w:sz w:val="24"/>
+          <w:szCs w:val="24"/>
+        </w:rPr>
+        <w:t>Esta tesis analiza algunas de l</w:t>
+      </w:r>
+      <w:r>
+        <w:rPr>
+          <w:rFonts w:ascii="Times New Roman" w:hAnsi="Times New Roman" w:cs="Times New Roman"/>
+          <w:sz w:val="24"/>
+          <w:szCs w:val="24"/>
+        </w:rPr>
+        <w:t>o</w:t>
+      </w:r>
+      <w:r>
+        <w:rPr>
+          <w:rFonts w:ascii="Times New Roman" w:hAnsi="Times New Roman" w:cs="Times New Roman"/>
+          <w:sz w:val="24"/>
+          <w:szCs w:val="24"/>
+        </w:rPr>
+        <w:t xml:space="preserve">s diferentes </w:t>
+      </w:r>
+      <w:r>
+        <w:rPr>
+          <w:rFonts w:ascii="Times New Roman" w:hAnsi="Times New Roman" w:cs="Times New Roman"/>
+          <w:sz w:val="24"/>
+          <w:szCs w:val="24"/>
+        </w:rPr>
+        <w:t xml:space="preserve">usos de los bloques </w:t>
+      </w:r>
+      <w:r>
+        <w:rPr>
+          <w:rFonts w:ascii="Times New Roman" w:hAnsi="Times New Roman" w:cs="Times New Roman"/>
+          <w:i/>
+          <w:iCs/>
+          <w:sz w:val="24"/>
+          <w:szCs w:val="24"/>
+        </w:rPr>
+        <w:t xml:space="preserve">unsafe </w:t>
+      </w:r>
+      <w:r>
+        <w:rPr>
+          <w:rFonts w:ascii="Times New Roman" w:hAnsi="Times New Roman" w:cs="Times New Roman"/>
+          <w:sz w:val="24"/>
+          <w:szCs w:val="24"/>
+        </w:rPr>
+        <w:t xml:space="preserve">en el lenguaje rust, entre estas se podrán diferenciar distintas </w:t>
+      </w:r>
+      <w:r>
+        <w:rPr>
+          <w:rFonts w:ascii="Times New Roman" w:hAnsi="Times New Roman" w:cs="Times New Roman"/>
+          <w:sz w:val="24"/>
+          <w:szCs w:val="24"/>
+        </w:rPr>
+        <w:t>maneras</w:t>
+      </w:r>
+      <w:r>
+        <w:rPr>
+          <w:rFonts w:ascii="Times New Roman" w:hAnsi="Times New Roman" w:cs="Times New Roman"/>
+          <w:sz w:val="24"/>
+          <w:szCs w:val="24"/>
+        </w:rPr>
+        <w:t xml:space="preserve"> en</w:t>
+      </w:r>
+      <w:r>
+        <w:rPr>
+          <w:rFonts w:ascii="Times New Roman" w:hAnsi="Times New Roman" w:cs="Times New Roman"/>
+          <w:sz w:val="24"/>
+          <w:szCs w:val="24"/>
+        </w:rPr>
+        <w:t xml:space="preserve"> que </w:t>
+      </w:r>
+      <w:r>
+        <w:rPr>
+          <w:rFonts w:ascii="Times New Roman" w:hAnsi="Times New Roman" w:cs="Times New Roman"/>
+          <w:sz w:val="24"/>
+          <w:szCs w:val="24"/>
+        </w:rPr>
+        <w:t xml:space="preserve">los programadores (principiantes o de nivel intermedio) los emplean. Dado que el lenguaje tiene manejo estricto de referencias a bajo nivel, el uso de los </w:t>
+      </w:r>
+      <w:r>
+        <w:rPr>
+          <w:rFonts w:ascii="Times New Roman" w:hAnsi="Times New Roman" w:cs="Times New Roman"/>
+          <w:sz w:val="24"/>
+          <w:szCs w:val="24"/>
+        </w:rPr>
+        <w:t xml:space="preserve">mencionados </w:t>
+      </w:r>
+      <w:r>
+        <w:rPr>
+          <w:rFonts w:ascii="Times New Roman" w:hAnsi="Times New Roman" w:cs="Times New Roman"/>
+          <w:sz w:val="24"/>
+          <w:szCs w:val="24"/>
+        </w:rPr>
+        <w:t>bloques es muy común, no obstante</w:t>
+      </w:r>
+      <w:r>
+        <w:rPr>
+          <w:rFonts w:ascii="Times New Roman" w:hAnsi="Times New Roman" w:cs="Times New Roman"/>
+          <w:sz w:val="24"/>
+          <w:szCs w:val="24"/>
+        </w:rPr>
+        <w:t xml:space="preserve">, en mucho de los casos analizados se vio la posibilidad de generar una sustitución equivalente aproximada por alguna función de biblioteca, facilitando el manejo de los mismo y evitando su uso. No en todo escenario esta idea es </w:t>
+      </w:r>
+      <w:r>
+        <w:rPr>
+          <w:rFonts w:ascii="Times New Roman" w:hAnsi="Times New Roman" w:cs="Times New Roman"/>
+          <w:sz w:val="24"/>
+          <w:szCs w:val="24"/>
+        </w:rPr>
+        <w:t>factible</w:t>
+      </w:r>
+      <w:r>
+        <w:rPr>
+          <w:rFonts w:ascii="Times New Roman" w:hAnsi="Times New Roman" w:cs="Times New Roman"/>
+          <w:sz w:val="24"/>
+          <w:szCs w:val="24"/>
+        </w:rPr>
+        <w:t>, por dicho motivo</w:t>
+      </w:r>
+      <w:r>
+        <w:rPr>
+          <w:rFonts w:ascii="Times New Roman" w:hAnsi="Times New Roman" w:cs="Times New Roman"/>
+          <w:sz w:val="24"/>
+          <w:szCs w:val="24"/>
+        </w:rPr>
+        <w:t xml:space="preserve"> en ocurrencias de estos inconvenientes se opta por sustituir todo lo </w:t>
+      </w:r>
+      <w:commentRangeStart w:id="0"/>
+      <w:r>
+        <w:rPr>
+          <w:rFonts w:ascii="Times New Roman" w:hAnsi="Times New Roman" w:cs="Times New Roman"/>
+          <w:sz w:val="24"/>
+          <w:szCs w:val="24"/>
+        </w:rPr>
+        <w:t>posible</w:t>
+      </w:r>
+      <w:commentRangeEnd w:id="0"/>
+      <w:r>
+        <w:rPr>
+          <w:rStyle w:val="Refdecomentario"/>
+        </w:rPr>
+        <w:commentReference w:id="0"/>
+      </w:r>
+      <w:r>
+        <w:rPr>
+          <w:rFonts w:ascii="Times New Roman" w:hAnsi="Times New Roman" w:cs="Times New Roman"/>
+          <w:sz w:val="24"/>
+          <w:szCs w:val="24"/>
+        </w:rPr>
+        <w:t>, manteniendo la coherencia con el código circundante.</w:t>
+      </w:r>
+    </w:p>
+    <w:p>
+      <w:pPr>
+        <w:rPr>
+          <w:rFonts w:ascii="Times New Roman" w:hAnsi="Times New Roman" w:cs="Times New Roman"/>
+          <w:sz w:val="24"/>
+          <w:szCs w:val="24"/>
+        </w:rPr>
+      </w:pPr>
+      <w:r>
+        <w:rPr>
+          <w:rFonts w:ascii="Times New Roman" w:hAnsi="Times New Roman" w:cs="Times New Roman"/>
+          <w:sz w:val="24"/>
+          <w:szCs w:val="24"/>
+        </w:rPr>
+        <w:t xml:space="preserve">En el presente documento se explica </w:t>
+      </w:r>
+      <w:r>
+        <w:rPr>
+          <w:rFonts w:ascii="Times New Roman" w:hAnsi="Times New Roman" w:cs="Times New Roman"/>
+          <w:sz w:val="24"/>
+          <w:szCs w:val="24"/>
+        </w:rPr>
+        <w:t>el origen, el formato y posiblemente algún ejemplo de los usos mencionados, sin embargo, hay secciones que hacen referencia al material analizado, con lo cual para una mayor compresión, visitar dichos repositorios para comprender mejor el funcionamiento del código.</w:t>
+      </w:r>
+    </w:p>
+    <w:p>
+      <w:pPr>
+        <w:rPr>
+          <w:rFonts w:ascii="Times New Roman" w:hAnsi="Times New Roman" w:cs="Times New Roman"/>
+          <w:sz w:val="24"/>
+          <w:szCs w:val="24"/>
+        </w:rPr>
+      </w:pPr>
+    </w:p>
+    <w:p>
+      <w:pPr>
+        <w:rPr>
+          <w:rFonts w:ascii="Times New Roman" w:hAnsi="Times New Roman" w:cs="Times New Roman"/>
+          <w:sz w:val="24"/>
+          <w:szCs w:val="24"/>
+        </w:rPr>
+      </w:pPr>
+    </w:p>
+    <w:p>
+      <w:pPr>
+        <w:rPr>
+          <w:rFonts w:ascii="Times New Roman" w:hAnsi="Times New Roman" w:cs="Times New Roman"/>
+          <w:sz w:val="24"/>
+          <w:szCs w:val="24"/>
+        </w:rPr>
+      </w:pPr>
+      <w:r>
+        <w:rPr>
+          <w:rFonts w:ascii="Times New Roman" w:hAnsi="Times New Roman" w:cs="Times New Roman"/>
+          <w:sz w:val="24"/>
+          <w:szCs w:val="24"/>
+        </w:rPr>
+        <w:t>Palabras claves: producción de código rust, código unsafe, reemplazo de código, manejo de punteros, uso de bibliotecas estándares.</w:t>
+      </w:r>
+    </w:p>
+    <w:p>
+      <w:pPr>
+        <w:rPr>
+          <w:rFonts w:ascii="Times New Roman" w:hAnsi="Times New Roman" w:cs="Times New Roman"/>
+          <w:sz w:val="24"/>
+          <w:szCs w:val="24"/>
+        </w:rPr>
+      </w:pPr>
+      <w:r>
+        <w:rPr>
+          <w:rFonts w:ascii="Times New Roman" w:hAnsi="Times New Roman" w:cs="Times New Roman"/>
+          <w:sz w:val="24"/>
+          <w:szCs w:val="24"/>
+        </w:rPr>
+        <w:br w:type="page"/>
+      </w:r>
+    </w:p>
+    <w:p>
+      <w:pPr>
+        <w:jc w:val="center"/>
+        <w:rPr>
+          <w:rFonts w:ascii="Times New Roman" w:hAnsi="Times New Roman" w:cs="Times New Roman"/>
+          <w:sz w:val="32"/>
+          <w:szCs w:val="32"/>
+          <w:lang w:val="en-US"/>
+        </w:rPr>
+      </w:pPr>
+      <w:r>
+        <w:rPr>
+          <w:rFonts w:ascii="Times New Roman" w:hAnsi="Times New Roman" w:cs="Times New Roman"/>
+          <w:sz w:val="32"/>
+          <w:szCs w:val="32"/>
+          <w:lang w:val="en-US"/>
+        </w:rPr>
+        <w:lastRenderedPageBreak/>
+        <w:t>Abstract</w:t>
+      </w:r>
+    </w:p>
+    <w:p>
+      <w:pPr>
+        <w:rPr>
+          <w:rFonts w:ascii="Times New Roman" w:hAnsi="Times New Roman" w:cs="Times New Roman"/>
+          <w:sz w:val="24"/>
+          <w:szCs w:val="24"/>
+          <w:lang w:val="en-US"/>
+        </w:rPr>
+      </w:pPr>
+      <w:r>
+        <w:rPr>
+          <w:rFonts w:ascii="Times New Roman" w:hAnsi="Times New Roman" w:cs="Times New Roman"/>
+          <w:sz w:val="24"/>
+          <w:szCs w:val="24"/>
+          <w:lang w:val="en-US"/>
+        </w:rPr>
+        <w:t xml:space="preserve">This thesis analyzes some of the different uses of </w:t>
+      </w:r>
+      <w:r>
+        <w:rPr>
+          <w:rFonts w:ascii="Times New Roman" w:hAnsi="Times New Roman" w:cs="Times New Roman"/>
+          <w:i/>
+          <w:iCs/>
+          <w:sz w:val="24"/>
+          <w:szCs w:val="24"/>
+          <w:lang w:val="en-US"/>
+        </w:rPr>
+        <w:t xml:space="preserve">unsafe </w:t>
+      </w:r>
+      <w:r>
+        <w:rPr>
+          <w:rFonts w:ascii="Times New Roman" w:hAnsi="Times New Roman" w:cs="Times New Roman"/>
+          <w:sz w:val="24"/>
+          <w:szCs w:val="24"/>
+          <w:lang w:val="en-US"/>
+        </w:rPr>
+        <w:t>blocks in rust language, among these it will be possible to differentiate different ways in which programmers (beginners or intermediate level) use them. Since the language has strict handling of low-level references, the use of the aforementioned blocks is very common, however, in many of the cases analyzed the possibility of generating an approximate equivalent substitution for some library function was seen, facilitating the management of them and avoiding their use. Not in every scenario this idea is feasible, for this reason in occurrences of these inconveniences it is chosen to replace as much as possible, maintaining coherence with the surrounding code.</w:t>
+      </w:r>
+    </w:p>
+    <w:p>
+      <w:pPr>
+        <w:rPr>
+          <w:rFonts w:ascii="Times New Roman" w:hAnsi="Times New Roman" w:cs="Times New Roman"/>
+          <w:sz w:val="24"/>
+          <w:szCs w:val="24"/>
+          <w:lang w:val="en-US"/>
+        </w:rPr>
+      </w:pPr>
+      <w:r>
+        <w:rPr>
+          <w:rFonts w:ascii="Times New Roman" w:hAnsi="Times New Roman" w:cs="Times New Roman"/>
+          <w:sz w:val="24"/>
+          <w:szCs w:val="24"/>
+          <w:lang w:val="en-US"/>
+        </w:rPr>
+        <w:t>This document explains the origin, format and possibly some examples of the uses mentioned, however, there are sections that refer to the material analyzed, so for greater understanding, visit these repositories to better understand the operation of the code.</w:t>
+      </w:r>
+    </w:p>
+    <w:p>
+      <w:pPr>
+        <w:rPr>
+          <w:rFonts w:ascii="Times New Roman" w:hAnsi="Times New Roman" w:cs="Times New Roman"/>
+          <w:sz w:val="24"/>
+          <w:szCs w:val="24"/>
+          <w:lang w:val="en-US"/>
+        </w:rPr>
+      </w:pPr>
+    </w:p>
+    <w:p>
+      <w:pPr>
+        <w:rPr>
+          <w:rFonts w:ascii="Times New Roman" w:hAnsi="Times New Roman" w:cs="Times New Roman"/>
+          <w:sz w:val="24"/>
+          <w:szCs w:val="24"/>
+          <w:lang w:val="en-US"/>
+        </w:rPr>
+      </w:pPr>
+    </w:p>
+    <w:p>
+      <w:pPr>
+        <w:rPr>
+          <w:rFonts w:ascii="Times New Roman" w:hAnsi="Times New Roman" w:cs="Times New Roman"/>
+          <w:sz w:val="24"/>
+          <w:szCs w:val="24"/>
+          <w:lang w:val="en-US"/>
+        </w:rPr>
+      </w:pPr>
+      <w:r>
+        <w:rPr>
+          <w:rFonts w:ascii="Times New Roman" w:hAnsi="Times New Roman" w:cs="Times New Roman"/>
+          <w:sz w:val="24"/>
+          <w:szCs w:val="24"/>
+          <w:lang w:val="en-US"/>
+        </w:rPr>
+        <w:t>Keywords: rust code production, unsafe code, code replacement, pointer handling, use of standard libraries.</w:t>
+      </w:r>
+    </w:p>
+    <w:p>
+      <w:pPr>
+        <w:rPr>
+          <w:rFonts w:ascii="Times New Roman" w:hAnsi="Times New Roman" w:cs="Times New Roman"/>
+          <w:sz w:val="24"/>
+          <w:szCs w:val="24"/>
+          <w:lang w:val="en-US"/>
+        </w:rPr>
+      </w:pPr>
+      <w:r>
+        <w:rPr>
+          <w:rFonts w:ascii="Times New Roman" w:hAnsi="Times New Roman" w:cs="Times New Roman"/>
+          <w:sz w:val="24"/>
+          <w:szCs w:val="24"/>
+          <w:lang w:val="en-US"/>
+        </w:rPr>
+        <w:br w:type="page"/>
+      </w:r>
+    </w:p>
+    <w:p>
+      <w:pPr>
+        <w:jc w:val="center"/>
+        <w:rPr>
+          <w:rFonts w:ascii="Times New Roman" w:hAnsi="Times New Roman" w:cs="Times New Roman"/>
+          <w:sz w:val="32"/>
+          <w:szCs w:val="32"/>
+        </w:rPr>
+      </w:pPr>
+      <w:r>
+        <w:rPr>
+          <w:rFonts w:ascii="Times New Roman" w:hAnsi="Times New Roman" w:cs="Times New Roman"/>
+          <w:sz w:val="32"/>
+          <w:szCs w:val="32"/>
+        </w:rPr>
+        <w:lastRenderedPageBreak/>
+        <w:t>Agradecimientos</w:t>
+      </w:r>
+    </w:p>
+    <w:p>
+      <w:pPr>
+        <w:rPr>
+          <w:rFonts w:ascii="Times New Roman" w:hAnsi="Times New Roman" w:cs="Times New Roman"/>
+          <w:sz w:val="24"/>
+          <w:szCs w:val="24"/>
+        </w:rPr>
+      </w:pPr>
+    </w:p>
+    <w:p>
+      <w:pPr>
+        <w:rPr>
+          <w:rFonts w:ascii="Times New Roman" w:hAnsi="Times New Roman" w:cs="Times New Roman"/>
+          <w:sz w:val="24"/>
+          <w:szCs w:val="24"/>
+        </w:rPr>
+      </w:pPr>
+      <w:r>
+        <w:rPr>
+          <w:rFonts w:ascii="Times New Roman" w:hAnsi="Times New Roman" w:cs="Times New Roman"/>
+          <w:sz w:val="24"/>
+          <w:szCs w:val="24"/>
+        </w:rPr>
+        <w:t>Agradezco a la gente que estuvo apoyando mi progreso, ya sea de lejos o de cerca, a la que está en el presente, al momento de escribir estas palabras y que muy posiblemente estén en un futuro. Entre esas personas, las que siempre estuvieron: mi familia, las que han ido y venido con el tiempo, los años y la carrera, mis compañeros, y las demás personas de mi entorno cercano, que vieron una algo en mi que ni yo pude ver. Por supuesto no me puedo olvidar de quien me metió en esto, mi director Marcelo Arroyo, un diferente en la carrera, pero con mucho conocimiento y experiencia para brindar.</w:t>
+      </w:r>
+    </w:p>
+    <w:p>
+      <w:pPr>
+        <w:rPr>
+          <w:rFonts w:ascii="Times New Roman" w:hAnsi="Times New Roman" w:cs="Times New Roman"/>
+          <w:sz w:val="24"/>
+          <w:szCs w:val="24"/>
+        </w:rPr>
+      </w:pPr>
+    </w:p>
+    <w:p>
+      <w:pPr>
+        <w:rPr>
+          <w:rFonts w:ascii="Times New Roman" w:hAnsi="Times New Roman" w:cs="Times New Roman"/>
+          <w:sz w:val="24"/>
+          <w:szCs w:val="24"/>
+        </w:rPr>
+      </w:pPr>
+      <w:r>
+        <w:rPr>
+          <w:rFonts w:ascii="Times New Roman" w:hAnsi="Times New Roman" w:cs="Times New Roman"/>
+          <w:sz w:val="24"/>
+          <w:szCs w:val="24"/>
+        </w:rPr>
+        <w:br w:type="page"/>
+      </w:r>
+    </w:p>
+    <w:sdt>
+      <w:sdtPr>
+        <w:rPr>
+          <w:rFonts w:asciiTheme="minorHAnsi" w:eastAsiaTheme="minorHAnsi" w:hAnsiTheme="minorHAnsi" w:cstheme="minorBidi"/>
+          <w:color w:val="auto"/>
+          <w:kern w:val="2"/>
+          <w:sz w:val="22"/>
+          <w:szCs w:val="22"/>
+          <w:lang w:eastAsia="en-US"/>
+          <w14:ligatures w14:val="standardContextual"/>
+        </w:rPr>
+        <w:id w:val="806750222"/>
+        <w:docPartObj>
+          <w:docPartGallery w:val="Table of Contents"/>
+          <w:docPartUnique/>
+        </w:docPartObj>
+      </w:sdtPr>
+      <w:sdtEndPr>
+        <w:rPr>
+          <w:b/>
+          <w:bCs/>
+        </w:rPr>
+      </w:sdtEndPr>
+      <w:sdtContent>
+        <w:p>
+          <w:pPr>
+            <w:pStyle w:val="TtuloTDC"/>
+            <w:jc w:val="center"/>
+            <w:rPr>
+              <w:rFonts w:ascii="Times New Roman" w:hAnsi="Times New Roman" w:cs="Times New Roman"/>
+              <w:b/>
+              <w:bCs/>
+              <w:color w:val="auto"/>
+            </w:rPr>
+          </w:pPr>
+          <w:r>
+            <w:rPr>
+              <w:rFonts w:ascii="Times New Roman" w:hAnsi="Times New Roman" w:cs="Times New Roman"/>
+              <w:b/>
+              <w:bCs/>
+              <w:color w:val="auto"/>
+            </w:rPr>
+            <w:t>Índice</w:t>
+          </w:r>
+        </w:p>
+        <w:p>
+          <w:pPr>
+            <w:rPr>
+              <w:lang w:eastAsia="es-MX"/>
+            </w:rPr>
+          </w:pPr>
+        </w:p>
+        <w:p>
+          <w:pPr>
+            <w:pStyle w:val="TDC2"/>
+            <w:tabs>
+              <w:tab w:val="right" w:leader="dot" w:pos="9060"/>
+            </w:tabs>
+            <w:rPr>
+              <w:rFonts w:cstheme="minorBidi"/>
+              <w:noProof/>
+              <w:kern w:val="2"/>
+              <w:sz w:val="24"/>
+              <w:szCs w:val="24"/>
+              <w14:ligatures w14:val="standardContextual"/>
+            </w:rPr>
+          </w:pPr>
+          <w:r>
+            <w:fldChar w:fldCharType="begin"/>
+          </w:r>
+          <w:r>
+            <w:instrText xml:space="preserve"> TOC \o "1-3" \h \z \u </w:instrText>
+          </w:r>
+          <w:r>
+            <w:fldChar w:fldCharType="separate"/>
+          </w:r>
+          <w:hyperlink w:anchor="_Toc207098401" w:history="1">
+            <w:r>
+              <w:rPr>
+                <w:rStyle w:val="Hipervnculo"/>
+                <w:rFonts w:ascii="Times New Roman" w:hAnsi="Times New Roman"/>
+                <w:noProof/>
+              </w:rPr>
+              <w:t>Datos recolectados</w:t>
+            </w:r>
+            <w:r>
+              <w:rPr>
+                <w:noProof/>
+                <w:webHidden/>
+              </w:rPr>
+              <w:tab/>
+            </w:r>
+            <w:r>
+              <w:rPr>
+                <w:noProof/>
+                <w:webHidden/>
+              </w:rPr>
+              <w:fldChar w:fldCharType="begin"/>
+            </w:r>
+            <w:r>
+              <w:rPr>
+                <w:noProof/>
+                <w:webHidden/>
+              </w:rPr>
+              <w:instrText xml:space="preserve"> PAGEREF _Toc207098401 \h </w:instrText>
+            </w:r>
+            <w:r>
+              <w:rPr>
+                <w:noProof/>
+                <w:webHidden/>
+              </w:rPr>
+            </w:r>
+            <w:r>
+              <w:rPr>
+                <w:noProof/>
+                <w:webHidden/>
+              </w:rPr>
+              <w:fldChar w:fldCharType="separate"/>
+            </w:r>
+            <w:r>
+              <w:rPr>
+                <w:noProof/>
+                <w:webHidden/>
+              </w:rPr>
+              <w:t>1</w:t>
+            </w:r>
+            <w:r>
+              <w:rPr>
+                <w:noProof/>
+                <w:webHidden/>
+              </w:rPr>
+              <w:fldChar w:fldCharType="end"/>
+            </w:r>
+          </w:hyperlink>
+        </w:p>
+        <w:p>
+          <w:pPr>
+            <w:pStyle w:val="TDC2"/>
+            <w:tabs>
+              <w:tab w:val="right" w:leader="dot" w:pos="9060"/>
+            </w:tabs>
+            <w:rPr>
+              <w:rFonts w:cstheme="minorBidi"/>
+              <w:noProof/>
+              <w:kern w:val="2"/>
+              <w:sz w:val="24"/>
+              <w:szCs w:val="24"/>
+              <w14:ligatures w14:val="standardContextual"/>
+            </w:rPr>
+          </w:pPr>
+          <w:hyperlink w:anchor="_Toc207098402" w:history="1">
+            <w:r>
+              <w:rPr>
+                <w:rStyle w:val="Hipervnculo"/>
+                <w:rFonts w:ascii="Times New Roman" w:hAnsi="Times New Roman"/>
+                <w:noProof/>
+              </w:rPr>
+              <w:t>Posibles reemplazos de código</w:t>
+            </w:r>
+            <w:r>
+              <w:rPr>
+                <w:noProof/>
+                <w:webHidden/>
+              </w:rPr>
+              <w:tab/>
+            </w:r>
+            <w:r>
+              <w:rPr>
+                <w:noProof/>
+                <w:webHidden/>
+              </w:rPr>
+              <w:fldChar w:fldCharType="begin"/>
+            </w:r>
+            <w:r>
+              <w:rPr>
+                <w:noProof/>
+                <w:webHidden/>
+              </w:rPr>
+              <w:instrText xml:space="preserve"> PAGEREF _Toc207098402 \h </w:instrText>
+            </w:r>
+            <w:r>
+              <w:rPr>
+                <w:noProof/>
+                <w:webHidden/>
+              </w:rPr>
+            </w:r>
+            <w:r>
+              <w:rPr>
+                <w:noProof/>
+                <w:webHidden/>
+              </w:rPr>
+              <w:fldChar w:fldCharType="separate"/>
+            </w:r>
+            <w:r>
+              <w:rPr>
+                <w:noProof/>
+                <w:webHidden/>
+              </w:rPr>
+              <w:t>1</w:t>
+            </w:r>
+            <w:r>
+              <w:rPr>
+                <w:noProof/>
+                <w:webHidden/>
+              </w:rPr>
+              <w:fldChar w:fldCharType="end"/>
+            </w:r>
+          </w:hyperlink>
+        </w:p>
+        <w:p>
+          <w:r>
+            <w:rPr>
+              <w:b/>
+              <w:bCs/>
+            </w:rPr>
+            <w:fldChar w:fldCharType="end"/>
+          </w:r>
+        </w:p>
+      </w:sdtContent>
+    </w:sdt>
+    <w:p>
+      <w:pPr>
+        <w:rPr>
+          <w:rFonts w:ascii="Times New Roman" w:hAnsi="Times New Roman" w:cs="Times New Roman"/>
+          <w:sz w:val="24"/>
+          <w:szCs w:val="24"/>
+        </w:rPr>
+      </w:pPr>
+    </w:p>
+    <w:p>
+      <w:pPr>
+        <w:rPr>
+          <w:rFonts w:ascii="Times New Roman" w:hAnsi="Times New Roman" w:cs="Times New Roman"/>
+          <w:sz w:val="24"/>
+          <w:szCs w:val="24"/>
+        </w:rPr>
+      </w:pPr>
+    </w:p>
+    <w:p>
+      <w:pPr>
+        <w:rPr>
+          <w:rFonts w:ascii="Times New Roman" w:hAnsi="Times New Roman" w:cs="Times New Roman"/>
+          <w:sz w:val="24"/>
+          <w:szCs w:val="24"/>
+        </w:rPr>
+      </w:pPr>
+    </w:p>
+    <w:p>
+      <w:pPr>
+        <w:rPr>
+          <w:rFonts w:ascii="Times New Roman" w:hAnsi="Times New Roman" w:cs="Times New Roman"/>
+          <w:sz w:val="24"/>
+          <w:szCs w:val="24"/>
+        </w:rPr>
+      </w:pPr>
+    </w:p>
+    <w:p>
+      <w:pPr>
+        <w:tabs>
+          <w:tab w:val="left" w:pos="7851"/>
+        </w:tabs>
+        <w:rPr>
+          <w:rFonts w:ascii="Times New Roman" w:hAnsi="Times New Roman" w:cs="Times New Roman"/>
+          <w:sz w:val="24"/>
+          <w:szCs w:val="24"/>
+        </w:rPr>
+      </w:pPr>
+      <w:r>
+        <w:rPr>
+          <w:rFonts w:ascii="Times New Roman" w:hAnsi="Times New Roman" w:cs="Times New Roman"/>
+          <w:sz w:val="24"/>
+          <w:szCs w:val="24"/>
+        </w:rPr>
+        <w:tab/>
+      </w:r>
+    </w:p>
+    <w:p>
+      <w:pPr>
+        <w:tabs>
+          <w:tab w:val="left" w:pos="7851"/>
+        </w:tabs>
+        <w:rPr>
+          <w:rFonts w:ascii="Times New Roman" w:hAnsi="Times New Roman" w:cs="Times New Roman"/>
+          <w:sz w:val="24"/>
+          <w:szCs w:val="24"/>
+        </w:rPr>
+        <w:sectPr>
+          <w:footerReference w:type="default" r:id="rId13"/>
+          <w:headerReference w:type="first" r:id="rId14"/>
+          <w:footerReference w:type="first" r:id="rId15"/>
+          <w:pgSz w:w="11906" w:h="16838" w:code="9"/>
+          <w:pgMar w:top="1418" w:right="1418" w:bottom="1418" w:left="1418" w:header="567" w:footer="567" w:gutter="0"/>
+          <w:pgNumType w:fmt="upperRoman" w:start="0"/>
+          <w:cols w:space="708"/>
+          <w:titlePg/>
+          <w:docGrid w:linePitch="360"/>
+        </w:sectPr>
+      </w:pPr>
+      <w:r>
+        <w:rPr>
+          <w:rFonts w:ascii="Times New Roman" w:hAnsi="Times New Roman" w:cs="Times New Roman"/>
+          <w:sz w:val="24"/>
+          <w:szCs w:val="24"/>
+        </w:rPr>
+        <w:tab/>
+      </w:r>
+    </w:p>
+    <w:p>
+      <w:pPr>
+        <w:pStyle w:val="Ttulo2"/>
+        <w:spacing w:before="0" w:after="0" w:line="240" w:lineRule="auto"/>
+        <w:rPr>
+          <w:rFonts w:ascii="Times New Roman" w:hAnsi="Times New Roman" w:cs="Times New Roman"/>
+          <w:color w:val="auto"/>
+        </w:rPr>
+      </w:pPr>
+      <w:bookmarkStart w:id="1" w:name="_Toc207098401"/>
+      <w:r>
+        <w:rPr>
+          <w:rFonts w:ascii="Times New Roman" w:hAnsi="Times New Roman" w:cs="Times New Roman"/>
+          <w:color w:val="auto"/>
+        </w:rPr>
+        <w:lastRenderedPageBreak/>
+        <w:t>Datos recolectados</w:t>
+      </w:r>
+      <w:bookmarkEnd w:id="1"/>
+    </w:p>
+    <w:p>
+      <w:pPr>
+        <w:spacing w:after="0" w:line="240" w:lineRule="auto"/>
+        <w:rPr>
+          <w:rFonts w:ascii="Times New Roman" w:hAnsi="Times New Roman" w:cs="Times New Roman"/>
+          <w:sz w:val="24"/>
+          <w:szCs w:val="24"/>
+        </w:rPr>
+      </w:pPr>
+    </w:p>
+    <w:p>
+      <w:pPr>
+        <w:spacing w:after="0" w:line="240" w:lineRule="auto"/>
+        <w:rPr>
+          <w:rFonts w:ascii="Times New Roman" w:hAnsi="Times New Roman" w:cs="Times New Roman"/>
+          <w:sz w:val="24"/>
+          <w:szCs w:val="24"/>
+        </w:rPr>
+      </w:pPr>
+      <w:r>
+        <w:rPr>
+          <w:rFonts w:ascii="Times New Roman" w:hAnsi="Times New Roman" w:cs="Times New Roman"/>
+          <w:sz w:val="24"/>
+          <w:szCs w:val="24"/>
+        </w:rPr>
+        <w:t>Partiendo del análisis realizado a una cierta cantidad de repositorios obtenidos de la plataforma ‘Github’,</w:t>
+      </w:r>
+      <w:r>
+        <w:rPr>
+          <w:rFonts w:ascii="Times New Roman" w:hAnsi="Times New Roman" w:cs="Times New Roman"/>
+          <w:sz w:val="24"/>
+          <w:szCs w:val="24"/>
+        </w:rPr>
+        <w:t xml:space="preserve"> los cuales son en su generalidad bibliotecas </w:t>
+      </w:r>
+      <w:r>
+        <w:rPr>
+          <w:rFonts w:ascii="Times New Roman" w:hAnsi="Times New Roman" w:cs="Times New Roman"/>
+          <w:sz w:val="24"/>
+          <w:szCs w:val="24"/>
+        </w:rPr>
+        <w:t>del lenguaje</w:t>
+      </w:r>
+      <w:r>
+        <w:rPr>
+          <w:rFonts w:ascii="Times New Roman" w:hAnsi="Times New Roman" w:cs="Times New Roman"/>
+          <w:sz w:val="24"/>
+          <w:szCs w:val="24"/>
+        </w:rPr>
+        <w:t xml:space="preserve">, proyectos como sistemas operativos, compiladores y algunos proyectos pequeños tales como estructuras de datos y mini aplicaciones de las mismas, se pudo obtener fragmentos de programas donde se emplean bloques </w:t>
+      </w:r>
+      <w:r>
+        <w:rPr>
+          <w:rFonts w:ascii="Times New Roman" w:hAnsi="Times New Roman" w:cs="Times New Roman"/>
+          <w:i/>
+          <w:iCs/>
+          <w:sz w:val="24"/>
+          <w:szCs w:val="24"/>
+        </w:rPr>
+        <w:t>unsafe</w:t>
+      </w:r>
+      <w:r>
+        <w:rPr>
+          <w:rFonts w:ascii="Times New Roman" w:hAnsi="Times New Roman" w:cs="Times New Roman"/>
+          <w:sz w:val="24"/>
+          <w:szCs w:val="24"/>
+        </w:rPr>
+        <w:t>, los mismos comparten similitudes en el momento de su aplicación</w:t>
+      </w:r>
+      <w:r>
+        <w:rPr>
+          <w:rFonts w:ascii="Times New Roman" w:hAnsi="Times New Roman" w:cs="Times New Roman"/>
+          <w:sz w:val="24"/>
+          <w:szCs w:val="24"/>
+        </w:rPr>
+        <w:t>, la mayoría esta presente en momentos donde se debe modificar, acceder y modificar, o simplemente devolver valores almacenados en variables que, una vez creadas y/o escritas, no se puede modificar su valor.</w:t>
+      </w:r>
+      <w:r>
+        <w:rPr>
+          <w:rFonts w:ascii="Times New Roman" w:hAnsi="Times New Roman" w:cs="Times New Roman"/>
+          <w:sz w:val="24"/>
+          <w:szCs w:val="24"/>
+        </w:rPr>
+        <w:t xml:space="preserve"> Esto se ha tenido en cuenta principalmente porque el lenguaje rust no permite modificación de valores por la propiedad de ownership, la cual maneja </w:t>
+      </w:r>
+      <w:r>
+        <w:rPr>
+          <w:rFonts w:ascii="Times New Roman" w:hAnsi="Times New Roman" w:cs="Times New Roman"/>
+          <w:sz w:val="24"/>
+          <w:szCs w:val="24"/>
+        </w:rPr>
+        <w:t xml:space="preserve">a </w:t>
+      </w:r>
+      <w:r>
+        <w:rPr>
+          <w:rFonts w:ascii="Times New Roman" w:hAnsi="Times New Roman" w:cs="Times New Roman"/>
+          <w:sz w:val="24"/>
+          <w:szCs w:val="24"/>
+        </w:rPr>
+        <w:t xml:space="preserve"> variable o estructuras</w:t>
+      </w:r>
+      <w:r>
+        <w:rPr>
+          <w:rFonts w:ascii="Times New Roman" w:hAnsi="Times New Roman" w:cs="Times New Roman"/>
+          <w:sz w:val="24"/>
+          <w:szCs w:val="24"/>
+        </w:rPr>
+        <w:t xml:space="preserve"> impidiendoles</w:t>
+      </w:r>
+      <w:r>
+        <w:rPr>
+          <w:rFonts w:ascii="Times New Roman" w:hAnsi="Times New Roman" w:cs="Times New Roman"/>
+          <w:sz w:val="24"/>
+          <w:szCs w:val="24"/>
+        </w:rPr>
+        <w:t xml:space="preserve"> devolver su valor o modificarlo, dado que al cambiarlo estaría </w:t>
+      </w:r>
+      <w:r>
+        <w:rPr>
+          <w:rFonts w:ascii="Times New Roman" w:hAnsi="Times New Roman" w:cs="Times New Roman"/>
+          <w:sz w:val="24"/>
+          <w:szCs w:val="24"/>
+        </w:rPr>
+        <w:t>accediendo a su dirección en memoria y lo cual es lo que intenta evitar.</w:t>
+      </w:r>
+    </w:p>
+    <w:p>
+      <w:pPr>
+        <w:spacing w:after="0" w:line="240" w:lineRule="auto"/>
+        <w:rPr>
+          <w:rFonts w:ascii="Times New Roman" w:hAnsi="Times New Roman" w:cs="Times New Roman"/>
+          <w:sz w:val="24"/>
+          <w:szCs w:val="24"/>
+        </w:rPr>
+      </w:pPr>
+    </w:p>
+    <w:p>
+      <w:pPr>
+        <w:spacing w:after="0" w:line="240" w:lineRule="auto"/>
+        <w:rPr>
+          <w:rFonts w:ascii="Times New Roman" w:hAnsi="Times New Roman" w:cs="Times New Roman"/>
+          <w:sz w:val="24"/>
+          <w:szCs w:val="24"/>
+        </w:rPr>
+      </w:pPr>
+    </w:p>
+    <w:p>
+      <w:pPr>
+        <w:pStyle w:val="Ttulo2"/>
+        <w:spacing w:before="0" w:after="0" w:line="240" w:lineRule="auto"/>
+        <w:rPr>
+          <w:rFonts w:ascii="Times New Roman" w:hAnsi="Times New Roman" w:cs="Times New Roman"/>
+          <w:color w:val="auto"/>
+        </w:rPr>
+      </w:pPr>
+      <w:bookmarkStart w:id="2" w:name="_Toc207098402"/>
+      <w:r>
+        <w:rPr>
+          <w:rFonts w:ascii="Times New Roman" w:hAnsi="Times New Roman" w:cs="Times New Roman"/>
+          <w:color w:val="auto"/>
+        </w:rPr>
+        <w:t xml:space="preserve">Posibles reemplazos de </w:t>
+      </w:r>
+      <w:r>
+        <w:rPr>
+          <w:rFonts w:ascii="Times New Roman" w:hAnsi="Times New Roman" w:cs="Times New Roman"/>
+          <w:color w:val="auto"/>
+        </w:rPr>
+        <w:t>código</w:t>
+      </w:r>
+      <w:bookmarkEnd w:id="2"/>
+      <w:r>
+        <w:rPr>
+          <w:rFonts w:ascii="Times New Roman" w:hAnsi="Times New Roman" w:cs="Times New Roman"/>
+          <w:color w:val="auto"/>
+        </w:rPr>
+        <w:t xml:space="preserve"> </w:t>
+      </w:r>
+    </w:p>
+    <w:p>
+      <w:pPr>
+        <w:rPr>
+          <w:rFonts w:ascii="Times New Roman" w:hAnsi="Times New Roman" w:cs="Times New Roman"/>
+          <w:sz w:val="24"/>
+          <w:szCs w:val="24"/>
+        </w:rPr>
+      </w:pPr>
+    </w:p>
+    <w:p>
+      <w:pPr>
+        <w:rPr>
+          <w:rFonts w:ascii="Times New Roman" w:hAnsi="Times New Roman" w:cs="Times New Roman"/>
+          <w:sz w:val="24"/>
+          <w:szCs w:val="24"/>
+        </w:rPr>
+      </w:pPr>
+      <w:r>
+        <w:rPr>
+          <w:rFonts w:ascii="Times New Roman" w:hAnsi="Times New Roman" w:cs="Times New Roman"/>
+          <w:sz w:val="24"/>
+          <w:szCs w:val="24"/>
+        </w:rPr>
+        <w:t>E</w:t>
+      </w:r>
+      <w:r>
+        <w:rPr>
+          <w:rFonts w:ascii="Times New Roman" w:hAnsi="Times New Roman" w:cs="Times New Roman"/>
+          <w:sz w:val="24"/>
+          <w:szCs w:val="24"/>
+        </w:rPr>
+        <w:t>n base a la bibliotecas estándares</w:t>
+      </w:r>
+      <w:r>
+        <w:rPr>
+          <w:rFonts w:ascii="Times New Roman" w:hAnsi="Times New Roman" w:cs="Times New Roman"/>
+          <w:sz w:val="24"/>
+          <w:szCs w:val="24"/>
+        </w:rPr>
+        <w:t xml:space="preserve"> de rust y empleando las extracciones de código provistas desde los repositorios analizados, se obtiene, de manera simplificada, la siguiente tabla con una posible serie de sustituciones para el código mencionando.</w:t>
+      </w:r>
+    </w:p>
+    <w:p>
+      <w:pPr>
+        <w:spacing w:after="0" w:line="240" w:lineRule="auto"/>
+        <w:rPr>
+          <w:rFonts w:ascii="Times New Roman" w:hAnsi="Times New Roman" w:cs="Times New Roman"/>
+          <w:sz w:val="24"/>
+          <w:szCs w:val="24"/>
+        </w:rPr>
+      </w:pPr>
+    </w:p>
+    <w:p>
+      <w:pPr>
+        <w:spacing w:after="0" w:line="240" w:lineRule="auto"/>
+        <w:rPr>
+          <w:rFonts w:ascii="Times New Roman" w:hAnsi="Times New Roman" w:cs="Times New Roman"/>
+          <w:sz w:val="24"/>
+          <w:szCs w:val="24"/>
+        </w:rPr>
+      </w:pPr>
+    </w:p>
+    <w:tbl>
+      <w:tblPr>
+        <w:tblStyle w:val="Tablaconcuadrcula"/>
+        <w:tblpPr w:leftFromText="141" w:rightFromText="141" w:vertAnchor="text" w:horzAnchor="margin" w:tblpXSpec="center" w:tblpY="79"/>
+        <w:tblW w:w="10860" w:type="dxa"/>
+        <w:tblLook w:val="04A0" w:firstRow="1" w:lastRow="0" w:firstColumn="1" w:lastColumn="0" w:noHBand="0" w:noVBand="1"/>
+      </w:tblPr>
+      <w:tblGrid>
+        <w:gridCol w:w="1828"/>
+        <w:gridCol w:w="1336"/>
+        <w:gridCol w:w="4514"/>
+        <w:gridCol w:w="3182"/>
+      </w:tblGrid>
+      <w:tr>
+        <w:trPr>
+          <w:trHeight w:val="322"/>
+        </w:trPr>
+        <w:tc>
+          <w:tcPr>
+            <w:tcW w:w="3164" w:type="dxa"/>
+            <w:gridSpan w:val="2"/>
+            <w:shd w:val="clear" w:color="auto" w:fill="B4C6E7" w:themeFill="accent1" w:themeFillTint="66"/>
+            <w:vAlign w:val="center"/>
+          </w:tcPr>
+          <w:p>
+            <w:pPr>
+              <w:jc w:val="center"/>
+              <w:rPr>
+                <w:rFonts w:ascii="Times New Roman" w:hAnsi="Times New Roman" w:cs="Times New Roman"/>
+                <w:sz w:val="24"/>
+                <w:szCs w:val="24"/>
+              </w:rPr>
+            </w:pPr>
+            <w:r>
+              <w:rPr>
+                <w:rFonts w:ascii="Times New Roman" w:hAnsi="Times New Roman" w:cs="Times New Roman"/>
+                <w:sz w:val="24"/>
+                <w:szCs w:val="24"/>
+              </w:rPr>
+              <w:t>Casos de interés</w:t>
+            </w:r>
+          </w:p>
+        </w:tc>
+        <w:tc>
+          <w:tcPr>
+            <w:tcW w:w="4514" w:type="dxa"/>
+            <w:shd w:val="clear" w:color="auto" w:fill="B4C6E7" w:themeFill="accent1" w:themeFillTint="66"/>
+          </w:tcPr>
+          <w:p>
+            <w:pPr>
+              <w:jc w:val="center"/>
+              <w:rPr>
+                <w:rFonts w:ascii="Times New Roman" w:hAnsi="Times New Roman" w:cs="Times New Roman"/>
+                <w:sz w:val="24"/>
+                <w:szCs w:val="24"/>
+              </w:rPr>
+            </w:pPr>
+            <w:r>
+              <w:rPr>
+                <w:rFonts w:ascii="Times New Roman" w:hAnsi="Times New Roman" w:cs="Times New Roman"/>
+                <w:sz w:val="24"/>
+                <w:szCs w:val="24"/>
+              </w:rPr>
+              <w:t>Código a reemplazar</w:t>
+            </w:r>
+          </w:p>
+        </w:tc>
+        <w:tc>
+          <w:tcPr>
+            <w:tcW w:w="3182" w:type="dxa"/>
+            <w:shd w:val="clear" w:color="auto" w:fill="B4C6E7" w:themeFill="accent1" w:themeFillTint="66"/>
+          </w:tcPr>
+          <w:p>
+            <w:pPr>
+              <w:jc w:val="center"/>
+              <w:rPr>
+                <w:rFonts w:ascii="Times New Roman" w:hAnsi="Times New Roman" w:cs="Times New Roman"/>
+                <w:sz w:val="24"/>
+                <w:szCs w:val="24"/>
+              </w:rPr>
+            </w:pPr>
+            <w:r>
+              <w:rPr>
+                <w:rFonts w:ascii="Times New Roman" w:hAnsi="Times New Roman" w:cs="Times New Roman"/>
+                <w:sz w:val="24"/>
+                <w:szCs w:val="24"/>
+              </w:rPr>
+              <w:t>Posible reemplazo</w:t>
+            </w:r>
+          </w:p>
+        </w:tc>
+      </w:tr>
+      <w:tr>
+        <w:trPr>
+          <w:trHeight w:val="322"/>
+        </w:trPr>
+        <w:tc>
+          <w:tcPr>
+            <w:tcW w:w="3164" w:type="dxa"/>
+            <w:gridSpan w:val="2"/>
+            <w:vAlign w:val="center"/>
+          </w:tcPr>
+          <w:p>
+            <w:pPr>
+              <w:jc w:val="center"/>
+              <w:rPr>
+                <w:rFonts w:ascii="Times New Roman" w:hAnsi="Times New Roman" w:cs="Times New Roman"/>
+                <w:sz w:val="24"/>
+                <w:szCs w:val="24"/>
+              </w:rPr>
+            </w:pPr>
+            <w:r>
+              <w:rPr>
+                <w:rFonts w:ascii="Times New Roman" w:hAnsi="Times New Roman" w:cs="Times New Roman"/>
+              </w:rPr>
+              <w:t>A</w:t>
+            </w:r>
+            <w:r>
+              <w:rPr>
+                <w:rFonts w:ascii="Times New Roman" w:hAnsi="Times New Roman" w:cs="Times New Roman"/>
+              </w:rPr>
+              <w:t>signación directa</w:t>
+            </w:r>
+          </w:p>
+        </w:tc>
+        <w:tc>
+          <w:tcPr>
+            <w:tcW w:w="4514" w:type="dxa"/>
+            <w:vAlign w:val="center"/>
+          </w:tcPr>
+          <w:p>
+            <w:pPr>
+              <w:rPr>
+                <w:rFonts w:ascii="Times New Roman" w:hAnsi="Times New Roman" w:cs="Times New Roman"/>
+                <w:sz w:val="20"/>
+                <w:szCs w:val="20"/>
+                <w:lang w:val="en-US"/>
+              </w:rPr>
+            </w:pPr>
+            <w:r>
+              <w:rPr>
+                <w:rFonts w:ascii="Times New Roman" w:hAnsi="Times New Roman" w:cs="Times New Roman"/>
+                <w:sz w:val="20"/>
+                <w:szCs w:val="20"/>
+                <w:lang w:val="en-US"/>
+              </w:rPr>
+              <w:t>let nodo: &amp;mut Nodo = &amp;mut *nodo;</w:t>
+            </w:r>
+          </w:p>
+          <w:p>
+            <w:pPr>
+              <w:rPr>
+                <w:rFonts w:ascii="Times New Roman" w:hAnsi="Times New Roman" w:cs="Times New Roman"/>
+                <w:sz w:val="20"/>
+                <w:szCs w:val="20"/>
+              </w:rPr>
+            </w:pPr>
+            <w:r>
+              <w:rPr>
+                <w:rFonts w:ascii="Times New Roman" w:hAnsi="Times New Roman" w:cs="Times New Roman"/>
+                <w:sz w:val="20"/>
+                <w:szCs w:val="20"/>
+              </w:rPr>
+              <w:t>nodo.altura = 1 + std::cmp::max(</w:t>
+            </w:r>
+          </w:p>
+          <w:p>
+            <w:pPr>
+              <w:rPr>
+                <w:rFonts w:ascii="Times New Roman" w:hAnsi="Times New Roman" w:cs="Times New Roman"/>
+                <w:sz w:val="20"/>
+                <w:szCs w:val="20"/>
+              </w:rPr>
+            </w:pPr>
+            <w:r>
+              <w:rPr>
+                <w:rFonts w:ascii="Times New Roman" w:hAnsi="Times New Roman" w:cs="Times New Roman"/>
+                <w:sz w:val="20"/>
+                <w:szCs w:val="20"/>
+              </w:rPr>
+              <w:t xml:space="preserve">          Self::obtener_altura(nodo.izquierda),     </w:t>
+            </w:r>
+            <w:r>
+              <w:rPr>
+                <w:rStyle w:val="Refdenotaalpie"/>
+                <w:rFonts w:ascii="Times New Roman" w:hAnsi="Times New Roman" w:cs="Times New Roman"/>
+                <w:sz w:val="20"/>
+                <w:szCs w:val="20"/>
+              </w:rPr>
+              <w:footnoteReference w:id="1"/>
+            </w:r>
+          </w:p>
+          <w:p>
+            <w:pPr>
+              <w:rPr>
+                <w:rFonts w:ascii="Times New Roman" w:hAnsi="Times New Roman" w:cs="Times New Roman"/>
+                <w:sz w:val="20"/>
+                <w:szCs w:val="20"/>
+              </w:rPr>
+            </w:pPr>
+            <w:r>
+              <w:rPr>
+                <w:rFonts w:ascii="Times New Roman" w:hAnsi="Times New Roman" w:cs="Times New Roman"/>
+                <w:sz w:val="20"/>
+                <w:szCs w:val="20"/>
+              </w:rPr>
+              <w:t xml:space="preserve">          Self::obtener_altura(nodo.derecha),</w:t>
+            </w:r>
+          </w:p>
+          <w:p>
+            <w:pPr>
+              <w:rPr>
+                <w:rFonts w:ascii="Times New Roman" w:hAnsi="Times New Roman" w:cs="Times New Roman"/>
+                <w:sz w:val="20"/>
+                <w:szCs w:val="20"/>
+              </w:rPr>
+            </w:pPr>
+            <w:r>
+              <w:rPr>
+                <w:rFonts w:ascii="Times New Roman" w:hAnsi="Times New Roman" w:cs="Times New Roman"/>
+                <w:sz w:val="20"/>
+                <w:szCs w:val="20"/>
+              </w:rPr>
+              <w:t>);</w:t>
+            </w:r>
+          </w:p>
+        </w:tc>
+        <w:tc>
+          <w:tcPr>
+            <w:tcW w:w="3182" w:type="dxa"/>
+            <w:vAlign w:val="center"/>
+          </w:tcPr>
+          <w:p>
+            <w:pPr>
+              <w:rPr>
+                <w:rFonts w:ascii="Times New Roman" w:hAnsi="Times New Roman" w:cs="Times New Roman"/>
+                <w:sz w:val="20"/>
+                <w:szCs w:val="20"/>
+                <w:lang w:val="en-US"/>
+              </w:rPr>
+            </w:pPr>
+            <w:r>
+              <w:rPr>
+                <w:rFonts w:ascii="Times New Roman" w:hAnsi="Times New Roman" w:cs="Times New Roman"/>
+                <w:sz w:val="20"/>
+                <w:szCs w:val="20"/>
+                <w:lang w:val="en-US"/>
+              </w:rPr>
+              <w:t>replace(</w:t>
+            </w:r>
+            <w:r>
+              <w:rPr>
+                <w:rFonts w:ascii="Times New Roman" w:hAnsi="Times New Roman" w:cs="Times New Roman"/>
+                <w:sz w:val="20"/>
+                <w:szCs w:val="20"/>
+                <w:lang w:val="en-US"/>
+              </w:rPr>
+              <w:t>&amp;</w:t>
+            </w:r>
+            <w:r>
+              <w:rPr>
+                <w:rFonts w:ascii="Times New Roman" w:hAnsi="Times New Roman" w:cs="Times New Roman"/>
+                <w:sz w:val="20"/>
+                <w:szCs w:val="20"/>
+                <w:lang w:val="en-US"/>
+              </w:rPr>
+              <w:t>nodo.altura, 1 + std::cmp::max(</w:t>
+            </w:r>
+          </w:p>
+          <w:p>
+            <w:pPr>
+              <w:rPr>
+                <w:rFonts w:ascii="Times New Roman" w:hAnsi="Times New Roman" w:cs="Times New Roman"/>
+                <w:sz w:val="20"/>
+                <w:szCs w:val="20"/>
+              </w:rPr>
+            </w:pPr>
+            <w:r>
+              <w:rPr>
+                <w:rFonts w:ascii="Times New Roman" w:hAnsi="Times New Roman" w:cs="Times New Roman"/>
+                <w:sz w:val="20"/>
+                <w:szCs w:val="20"/>
+              </w:rPr>
+              <w:t xml:space="preserve">Self::obtener_altura(nodo.izquierda),                </w:t>
+            </w:r>
+          </w:p>
+          <w:p>
+            <w:pPr>
+              <w:rPr>
+                <w:rFonts w:ascii="Times New Roman" w:hAnsi="Times New Roman" w:cs="Times New Roman"/>
+                <w:sz w:val="20"/>
+                <w:szCs w:val="20"/>
+              </w:rPr>
+            </w:pPr>
+            <w:r>
+              <w:rPr>
+                <w:rFonts w:ascii="Times New Roman" w:hAnsi="Times New Roman" w:cs="Times New Roman"/>
+                <w:sz w:val="20"/>
+                <w:szCs w:val="20"/>
+              </w:rPr>
+              <w:t>Self::obtener_altura(nodo.derecha),</w:t>
+            </w:r>
+          </w:p>
+          <w:p>
+            <w:pPr>
+              <w:rPr>
+                <w:rFonts w:ascii="Times New Roman" w:hAnsi="Times New Roman" w:cs="Times New Roman"/>
+                <w:sz w:val="20"/>
+                <w:szCs w:val="20"/>
+              </w:rPr>
+            </w:pPr>
+            <w:r>
+              <w:rPr>
+                <w:rFonts w:ascii="Times New Roman" w:hAnsi="Times New Roman" w:cs="Times New Roman"/>
+                <w:sz w:val="20"/>
+                <w:szCs w:val="20"/>
+              </w:rPr>
+              <w:t>));</w:t>
+            </w:r>
+          </w:p>
+        </w:tc>
+      </w:tr>
+      <w:tr>
+        <w:trPr>
+          <w:trHeight w:val="401"/>
+        </w:trPr>
+        <w:tc>
+          <w:tcPr>
+            <w:tcW w:w="1828" w:type="dxa"/>
+            <w:vMerge w:val="restart"/>
+            <w:vAlign w:val="center"/>
+          </w:tcPr>
+          <w:p>
+            <w:pPr>
+              <w:jc w:val="center"/>
+              <w:rPr>
+                <w:rFonts w:ascii="Times New Roman" w:hAnsi="Times New Roman" w:cs="Times New Roman"/>
+              </w:rPr>
+            </w:pPr>
+            <w:r>
+              <w:rPr>
+                <w:rFonts w:ascii="Times New Roman" w:hAnsi="Times New Roman" w:cs="Times New Roman"/>
+              </w:rPr>
+              <w:t>Desreferenciación</w:t>
+            </w:r>
+          </w:p>
+        </w:tc>
+        <w:tc>
+          <w:tcPr>
+            <w:tcW w:w="1336" w:type="dxa"/>
+            <w:vAlign w:val="center"/>
+          </w:tcPr>
+          <w:p>
+            <w:pPr>
+              <w:jc w:val="center"/>
+              <w:rPr>
+                <w:rFonts w:ascii="Times New Roman" w:hAnsi="Times New Roman" w:cs="Times New Roman"/>
+                <w:sz w:val="24"/>
+                <w:szCs w:val="24"/>
+              </w:rPr>
+            </w:pPr>
+            <w:r>
+              <w:rPr>
+                <w:rFonts w:ascii="Times New Roman" w:hAnsi="Times New Roman" w:cs="Times New Roman"/>
+                <w:sz w:val="24"/>
+                <w:szCs w:val="24"/>
+              </w:rPr>
+              <w:t>Evasión de match</w:t>
+            </w:r>
+          </w:p>
+        </w:tc>
+        <w:tc>
+          <w:tcPr>
+            <w:tcW w:w="4514" w:type="dxa"/>
+            <w:vAlign w:val="center"/>
+          </w:tcPr>
+          <w:p>
+            <w:pPr>
+              <w:rPr>
+                <w:rFonts w:ascii="Times New Roman" w:hAnsi="Times New Roman" w:cs="Times New Roman"/>
+                <w:sz w:val="20"/>
+                <w:szCs w:val="20"/>
+                <w:lang w:val="en-US"/>
+              </w:rPr>
+            </w:pPr>
+            <w:r>
+              <w:rPr>
+                <w:rFonts w:ascii="Times New Roman" w:hAnsi="Times New Roman" w:cs="Times New Roman"/>
+                <w:sz w:val="20"/>
+                <w:szCs w:val="20"/>
+                <w:lang w:val="en-US"/>
+              </w:rPr>
+              <w:t xml:space="preserve">let direccion = self.elementos.add(self.tamano - 1);    </w:t>
+            </w:r>
+          </w:p>
+          <w:p>
+            <w:pPr>
+              <w:rPr>
+                <w:rFonts w:ascii="Times New Roman" w:hAnsi="Times New Roman" w:cs="Times New Roman"/>
+                <w:sz w:val="20"/>
+                <w:szCs w:val="20"/>
+              </w:rPr>
+            </w:pPr>
+            <w:r>
+              <w:rPr>
+                <w:rFonts w:ascii="Times New Roman" w:hAnsi="Times New Roman" w:cs="Times New Roman"/>
+                <w:sz w:val="20"/>
+                <w:szCs w:val="20"/>
+                <w:lang w:val="en-US"/>
+              </w:rPr>
+              <w:t>Some(&amp;*direccion)</w:t>
+            </w:r>
+            <w:r>
+              <w:rPr>
+                <w:rFonts w:ascii="Times New Roman" w:hAnsi="Times New Roman" w:cs="Times New Roman"/>
+                <w:sz w:val="20"/>
+                <w:szCs w:val="20"/>
+                <w:lang w:val="en-US"/>
+              </w:rPr>
+              <w:t xml:space="preserve">      </w:t>
+            </w:r>
+            <w:r>
+              <w:rPr>
+                <w:rStyle w:val="Refdenotaalpie"/>
+                <w:rFonts w:ascii="Times New Roman" w:hAnsi="Times New Roman" w:cs="Times New Roman"/>
+                <w:sz w:val="20"/>
+                <w:szCs w:val="20"/>
+              </w:rPr>
+              <w:footnoteReference w:id="2"/>
+            </w:r>
+          </w:p>
+        </w:tc>
+        <w:tc>
+          <w:tcPr>
+            <w:tcW w:w="3182" w:type="dxa"/>
+            <w:vAlign w:val="center"/>
+          </w:tcPr>
+          <w:p>
+            <w:pPr>
+              <w:rPr>
+                <w:rFonts w:ascii="Times New Roman" w:hAnsi="Times New Roman" w:cs="Times New Roman"/>
+                <w:sz w:val="20"/>
+                <w:szCs w:val="20"/>
+              </w:rPr>
+            </w:pPr>
+            <w:r>
+              <w:rPr>
+                <w:rFonts w:ascii="Times New Roman" w:hAnsi="Times New Roman" w:cs="Times New Roman"/>
+                <w:sz w:val="20"/>
+                <w:szCs w:val="20"/>
+              </w:rPr>
+              <w:t xml:space="preserve">Match(dirección) { </w:t>
+            </w:r>
+          </w:p>
+          <w:p>
+            <w:pPr>
+              <w:rPr>
+                <w:rFonts w:ascii="Times New Roman" w:hAnsi="Times New Roman" w:cs="Times New Roman"/>
+                <w:sz w:val="20"/>
+                <w:szCs w:val="20"/>
+              </w:rPr>
+            </w:pPr>
+            <w:r>
+              <w:rPr>
+                <w:rFonts w:ascii="Times New Roman" w:hAnsi="Times New Roman" w:cs="Times New Roman"/>
+                <w:sz w:val="20"/>
+                <w:szCs w:val="20"/>
+              </w:rPr>
+              <w:t xml:space="preserve">   Ok(): …</w:t>
+            </w:r>
+          </w:p>
+          <w:p>
+            <w:pPr>
+              <w:rPr>
+                <w:rFonts w:ascii="Times New Roman" w:hAnsi="Times New Roman" w:cs="Times New Roman"/>
+                <w:sz w:val="20"/>
+                <w:szCs w:val="20"/>
+              </w:rPr>
+            </w:pPr>
+            <w:r>
+              <w:rPr>
+                <w:rFonts w:ascii="Times New Roman" w:hAnsi="Times New Roman" w:cs="Times New Roman"/>
+                <w:sz w:val="20"/>
+                <w:szCs w:val="20"/>
+              </w:rPr>
+              <w:t xml:space="preserve">   None: </w:t>
+            </w:r>
+          </w:p>
+          <w:p>
+            <w:pPr>
+              <w:rPr>
+                <w:rFonts w:ascii="Times New Roman" w:hAnsi="Times New Roman" w:cs="Times New Roman"/>
+                <w:sz w:val="20"/>
+                <w:szCs w:val="20"/>
+              </w:rPr>
+            </w:pPr>
+            <w:r>
+              <w:rPr>
+                <w:rFonts w:ascii="Times New Roman" w:hAnsi="Times New Roman" w:cs="Times New Roman"/>
+                <w:sz w:val="20"/>
+                <w:szCs w:val="20"/>
+              </w:rPr>
+              <w:t xml:space="preserve"> }</w:t>
+            </w:r>
+          </w:p>
+        </w:tc>
+      </w:tr>
+      <w:tr>
+        <w:trPr>
+          <w:trHeight w:val="451"/>
+        </w:trPr>
+        <w:tc>
+          <w:tcPr>
+            <w:tcW w:w="1828" w:type="dxa"/>
+            <w:vMerge/>
+            <w:vAlign w:val="center"/>
+          </w:tcPr>
+          <w:p>
+            <w:pPr>
+              <w:jc w:val="center"/>
+              <w:rPr>
+                <w:rFonts w:ascii="Times New Roman" w:hAnsi="Times New Roman" w:cs="Times New Roman"/>
+              </w:rPr>
+            </w:pPr>
+          </w:p>
+        </w:tc>
+        <w:tc>
+          <w:tcPr>
+            <w:tcW w:w="1336" w:type="dxa"/>
+            <w:vAlign w:val="center"/>
+          </w:tcPr>
+          <w:p>
+            <w:pPr>
+              <w:jc w:val="center"/>
+              <w:rPr>
+                <w:rFonts w:ascii="Times New Roman" w:hAnsi="Times New Roman" w:cs="Times New Roman"/>
+                <w:sz w:val="24"/>
+                <w:szCs w:val="24"/>
+              </w:rPr>
+            </w:pPr>
+            <w:r>
+              <w:rPr>
+                <w:rFonts w:ascii="Times New Roman" w:hAnsi="Times New Roman" w:cs="Times New Roman"/>
+                <w:sz w:val="24"/>
+                <w:szCs w:val="24"/>
+              </w:rPr>
+              <w:t>Devolución de valor</w:t>
+            </w:r>
+          </w:p>
+        </w:tc>
+        <w:tc>
+          <w:tcPr>
+            <w:tcW w:w="4514" w:type="dxa"/>
+            <w:vAlign w:val="center"/>
+          </w:tcPr>
+          <w:p>
+            <w:pPr>
+              <w:rPr>
+                <w:rFonts w:ascii="Times New Roman" w:hAnsi="Times New Roman" w:cs="Times New Roman"/>
+                <w:sz w:val="20"/>
+                <w:szCs w:val="20"/>
+              </w:rPr>
+            </w:pPr>
+            <w:r>
+              <w:rPr>
+                <w:rFonts w:ascii="Times New Roman" w:hAnsi="Times New Roman" w:cs="Times New Roman"/>
+                <w:sz w:val="20"/>
+                <w:szCs w:val="20"/>
+              </w:rPr>
+              <w:t>(*nodo).derecha</w:t>
+            </w:r>
+            <w:r>
+              <w:rPr>
+                <w:rFonts w:ascii="Times New Roman" w:hAnsi="Times New Roman" w:cs="Times New Roman"/>
+                <w:sz w:val="20"/>
+                <w:szCs w:val="20"/>
+              </w:rPr>
+              <w:t xml:space="preserve">    </w:t>
+            </w:r>
+            <w:r>
+              <w:rPr>
+                <w:rStyle w:val="Refdenotaalpie"/>
+                <w:rFonts w:ascii="Times New Roman" w:hAnsi="Times New Roman" w:cs="Times New Roman"/>
+                <w:sz w:val="20"/>
+                <w:szCs w:val="20"/>
+              </w:rPr>
+              <w:footnoteReference w:id="3"/>
+            </w:r>
+          </w:p>
+        </w:tc>
+        <w:tc>
+          <w:tcPr>
+            <w:tcW w:w="3182" w:type="dxa"/>
+            <w:vAlign w:val="center"/>
+          </w:tcPr>
+          <w:p>
+            <w:pPr>
+              <w:rPr>
+                <w:rFonts w:ascii="Times New Roman" w:hAnsi="Times New Roman" w:cs="Times New Roman"/>
+                <w:sz w:val="20"/>
+                <w:szCs w:val="20"/>
+              </w:rPr>
+            </w:pPr>
+            <w:r>
+              <w:rPr>
+                <w:rFonts w:ascii="Times New Roman" w:hAnsi="Times New Roman" w:cs="Times New Roman"/>
+                <w:sz w:val="20"/>
+                <w:szCs w:val="20"/>
+              </w:rPr>
+              <w:t>-</w:t>
+            </w:r>
+          </w:p>
+        </w:tc>
+      </w:tr>
+      <w:tr>
+        <w:trPr>
+          <w:trHeight w:val="634"/>
+        </w:trPr>
+        <w:tc>
+          <w:tcPr>
+            <w:tcW w:w="1828" w:type="dxa"/>
+            <w:vMerge/>
+            <w:vAlign w:val="center"/>
+          </w:tcPr>
+          <w:p>
+            <w:pPr>
+              <w:jc w:val="center"/>
+              <w:rPr>
+                <w:rFonts w:ascii="Times New Roman" w:hAnsi="Times New Roman" w:cs="Times New Roman"/>
+              </w:rPr>
+            </w:pPr>
+          </w:p>
+        </w:tc>
+        <w:tc>
+          <w:tcPr>
+            <w:tcW w:w="1336" w:type="dxa"/>
+            <w:vAlign w:val="center"/>
+          </w:tcPr>
+          <w:p>
+            <w:pPr>
+              <w:jc w:val="center"/>
+              <w:rPr>
+                <w:rFonts w:ascii="Times New Roman" w:hAnsi="Times New Roman" w:cs="Times New Roman"/>
+                <w:sz w:val="24"/>
+                <w:szCs w:val="24"/>
+              </w:rPr>
+            </w:pPr>
+            <w:r>
+              <w:rPr>
+                <w:rFonts w:ascii="Times New Roman" w:hAnsi="Times New Roman" w:cs="Times New Roman"/>
+                <w:sz w:val="24"/>
+                <w:szCs w:val="24"/>
+              </w:rPr>
+              <w:t>Valor de un puntero</w:t>
+            </w:r>
+          </w:p>
+        </w:tc>
+        <w:tc>
+          <w:tcPr>
+            <w:tcW w:w="4514" w:type="dxa"/>
+            <w:vAlign w:val="center"/>
+          </w:tcPr>
+          <w:p>
+            <w:pPr>
+              <w:rPr>
+                <w:rFonts w:ascii="Times New Roman" w:hAnsi="Times New Roman" w:cs="Times New Roman"/>
+                <w:sz w:val="20"/>
+                <w:szCs w:val="20"/>
+              </w:rPr>
+            </w:pPr>
+            <w:r>
+              <w:rPr>
+                <w:rFonts w:ascii="Times New Roman" w:hAnsi="Times New Roman" w:cs="Times New Roman"/>
+                <w:sz w:val="20"/>
+                <w:szCs w:val="20"/>
+              </w:rPr>
+              <w:t>&amp;mut *nodo</w:t>
+            </w:r>
+            <w:r>
+              <w:rPr>
+                <w:rFonts w:ascii="Times New Roman" w:hAnsi="Times New Roman" w:cs="Times New Roman"/>
+                <w:sz w:val="20"/>
+                <w:szCs w:val="20"/>
+              </w:rPr>
+              <w:t xml:space="preserve">         </w:t>
+            </w:r>
+            <w:r>
+              <w:rPr>
+                <w:rStyle w:val="Refdenotaalpie"/>
+                <w:rFonts w:ascii="Times New Roman" w:hAnsi="Times New Roman" w:cs="Times New Roman"/>
+                <w:sz w:val="20"/>
+                <w:szCs w:val="20"/>
+              </w:rPr>
+              <w:footnoteReference w:id="4"/>
+            </w:r>
+          </w:p>
+        </w:tc>
+        <w:tc>
+          <w:tcPr>
+            <w:tcW w:w="3182" w:type="dxa"/>
+            <w:vAlign w:val="center"/>
+          </w:tcPr>
+          <w:p>
+            <w:pPr>
+              <w:rPr>
+                <w:rFonts w:ascii="Times New Roman" w:hAnsi="Times New Roman" w:cs="Times New Roman"/>
+                <w:sz w:val="20"/>
+                <w:szCs w:val="20"/>
+              </w:rPr>
+            </w:pPr>
+            <w:r>
+              <w:rPr>
+                <w:rFonts w:ascii="Times New Roman" w:hAnsi="Times New Roman" w:cs="Times New Roman"/>
+                <w:sz w:val="20"/>
+                <w:szCs w:val="20"/>
+              </w:rPr>
+              <w:t>-</w:t>
+            </w:r>
+          </w:p>
+        </w:tc>
+      </w:tr>
+      <w:tr>
+        <w:trPr>
+          <w:trHeight w:val="634"/>
+        </w:trPr>
+        <w:tc>
+          <w:tcPr>
+            <w:tcW w:w="3164" w:type="dxa"/>
+            <w:gridSpan w:val="2"/>
+            <w:vAlign w:val="center"/>
+          </w:tcPr>
+          <w:p>
+            <w:pPr>
+              <w:jc w:val="center"/>
+              <w:rPr>
+                <w:rFonts w:ascii="Times New Roman" w:hAnsi="Times New Roman" w:cs="Times New Roman"/>
+                <w:sz w:val="24"/>
+                <w:szCs w:val="24"/>
+              </w:rPr>
+            </w:pPr>
+            <w:r>
+              <w:rPr>
+                <w:rFonts w:ascii="Times New Roman" w:hAnsi="Times New Roman" w:cs="Times New Roman"/>
+              </w:rPr>
+              <w:t>A</w:t>
+            </w:r>
+            <w:r>
+              <w:rPr>
+                <w:rFonts w:ascii="Times New Roman" w:hAnsi="Times New Roman" w:cs="Times New Roman"/>
+              </w:rPr>
+              <w:t>signación de referencias</w:t>
+            </w:r>
+          </w:p>
+        </w:tc>
+        <w:tc>
+          <w:tcPr>
+            <w:tcW w:w="4514" w:type="dxa"/>
+            <w:vAlign w:val="center"/>
+          </w:tcPr>
+          <w:p>
+            <w:pPr>
+              <w:rPr>
+                <w:rFonts w:ascii="Times New Roman" w:hAnsi="Times New Roman" w:cs="Times New Roman"/>
+                <w:sz w:val="20"/>
+                <w:szCs w:val="20"/>
+              </w:rPr>
+            </w:pPr>
+            <w:r>
+              <w:rPr>
+                <w:rFonts w:ascii="Times New Roman" w:hAnsi="Times New Roman" w:cs="Times New Roman"/>
+                <w:sz w:val="20"/>
+                <w:szCs w:val="20"/>
+              </w:rPr>
+              <w:t>-</w:t>
+            </w:r>
+          </w:p>
+        </w:tc>
+        <w:tc>
+          <w:tcPr>
+            <w:tcW w:w="3182" w:type="dxa"/>
+            <w:vAlign w:val="center"/>
+          </w:tcPr>
+          <w:p>
+            <w:pPr>
+              <w:rPr>
+                <w:rFonts w:ascii="Times New Roman" w:hAnsi="Times New Roman" w:cs="Times New Roman"/>
+                <w:sz w:val="20"/>
+                <w:szCs w:val="20"/>
+              </w:rPr>
+            </w:pPr>
+            <w:r>
+              <w:rPr>
+                <w:rFonts w:ascii="Times New Roman" w:hAnsi="Times New Roman" w:cs="Times New Roman"/>
+                <w:sz w:val="20"/>
+                <w:szCs w:val="20"/>
+              </w:rPr>
+              <w:t>-</w:t>
+            </w:r>
+          </w:p>
+        </w:tc>
+      </w:tr>
+      <w:tr>
+        <w:trPr>
+          <w:trHeight w:val="634"/>
+        </w:trPr>
+        <w:tc>
+          <w:tcPr>
+            <w:tcW w:w="3164" w:type="dxa"/>
+            <w:gridSpan w:val="2"/>
+            <w:vAlign w:val="center"/>
+          </w:tcPr>
+          <w:p>
+            <w:pPr>
+              <w:jc w:val="center"/>
+              <w:rPr>
+                <w:rFonts w:ascii="Times New Roman" w:hAnsi="Times New Roman" w:cs="Times New Roman"/>
+                <w:sz w:val="24"/>
+                <w:szCs w:val="24"/>
+              </w:rPr>
+            </w:pPr>
+            <w:r>
+              <w:rPr>
+                <w:rFonts w:ascii="Times New Roman" w:hAnsi="Times New Roman" w:cs="Times New Roman"/>
+              </w:rPr>
+              <w:t>A</w:t>
+            </w:r>
+            <w:r>
+              <w:rPr>
+                <w:rFonts w:ascii="Times New Roman" w:hAnsi="Times New Roman" w:cs="Times New Roman"/>
+              </w:rPr>
+              <w:t>signación de bloques unsafe</w:t>
+            </w:r>
+          </w:p>
+        </w:tc>
+        <w:tc>
+          <w:tcPr>
+            <w:tcW w:w="4514" w:type="dxa"/>
+            <w:vAlign w:val="center"/>
+          </w:tcPr>
+          <w:p>
+            <w:pPr>
+              <w:rPr>
+                <w:rFonts w:ascii="Times New Roman" w:hAnsi="Times New Roman" w:cs="Times New Roman"/>
+                <w:sz w:val="20"/>
+                <w:szCs w:val="20"/>
+                <w:lang w:val="en-US"/>
+              </w:rPr>
+            </w:pPr>
+            <w:r>
+              <w:rPr>
+                <w:rFonts w:ascii="Times New Roman" w:hAnsi="Times New Roman" w:cs="Times New Roman"/>
+                <w:sz w:val="20"/>
+                <w:szCs w:val="20"/>
+                <w:lang w:val="en-US"/>
+              </w:rPr>
+              <w:t>let perm_u8 = unsafe {</w:t>
+            </w:r>
+          </w:p>
+          <w:p>
+            <w:pPr>
+              <w:rPr>
+                <w:rFonts w:ascii="Times New Roman" w:hAnsi="Times New Roman" w:cs="Times New Roman"/>
+                <w:sz w:val="20"/>
+                <w:szCs w:val="20"/>
+                <w:lang w:val="en-US"/>
+              </w:rPr>
+            </w:pPr>
+            <w:r>
+              <w:rPr>
+                <w:rFonts w:ascii="Times New Roman" w:hAnsi="Times New Roman" w:cs="Times New Roman"/>
+                <w:sz w:val="20"/>
+                <w:szCs w:val="20"/>
+                <w:lang w:val="en-US"/>
+              </w:rPr>
+              <w:t xml:space="preserve">  </w:t>
+            </w:r>
+            <w:r>
+              <w:rPr>
+                <w:rFonts w:ascii="Times New Roman" w:hAnsi="Times New Roman" w:cs="Times New Roman"/>
+                <w:sz w:val="20"/>
+                <w:szCs w:val="20"/>
+                <w:lang w:val="en-US"/>
+              </w:rPr>
+              <w:t>slice::from_raw_parts(d.as_ptr() as *const u8, len)</w:t>
+            </w:r>
+            <w:r>
+              <w:rPr>
+                <w:rFonts w:ascii="Times New Roman" w:hAnsi="Times New Roman" w:cs="Times New Roman"/>
+                <w:sz w:val="20"/>
+                <w:szCs w:val="20"/>
+                <w:lang w:val="en-US"/>
+              </w:rPr>
+              <w:t xml:space="preserve">  </w:t>
+            </w:r>
+          </w:p>
+          <w:p>
+            <w:pPr>
+              <w:rPr>
+                <w:rFonts w:ascii="Times New Roman" w:hAnsi="Times New Roman" w:cs="Times New Roman"/>
+                <w:sz w:val="20"/>
+                <w:szCs w:val="20"/>
+              </w:rPr>
+            </w:pPr>
+            <w:r>
+              <w:rPr>
+                <w:rFonts w:ascii="Times New Roman" w:hAnsi="Times New Roman" w:cs="Times New Roman"/>
+                <w:sz w:val="20"/>
+                <w:szCs w:val="20"/>
+              </w:rPr>
+              <w:t>};</w:t>
+            </w:r>
+            <w:r>
+              <w:rPr>
+                <w:rFonts w:ascii="Times New Roman" w:hAnsi="Times New Roman" w:cs="Times New Roman"/>
+                <w:sz w:val="20"/>
+                <w:szCs w:val="20"/>
+              </w:rPr>
+              <w:t xml:space="preserve">     </w:t>
+            </w:r>
+            <w:r>
+              <w:rPr>
+                <w:rStyle w:val="Refdenotaalpie"/>
+                <w:rFonts w:ascii="Times New Roman" w:hAnsi="Times New Roman" w:cs="Times New Roman"/>
+                <w:sz w:val="20"/>
+                <w:szCs w:val="20"/>
+                <w:lang w:val="en-US"/>
+              </w:rPr>
+              <w:footnoteReference w:id="5"/>
+            </w:r>
+          </w:p>
+        </w:tc>
+        <w:tc>
+          <w:tcPr>
+            <w:tcW w:w="3182" w:type="dxa"/>
+            <w:vAlign w:val="center"/>
+          </w:tcPr>
+          <w:p>
+            <w:pPr>
+              <w:rPr>
+                <w:rFonts w:ascii="Times New Roman" w:hAnsi="Times New Roman" w:cs="Times New Roman"/>
+                <w:sz w:val="20"/>
+                <w:szCs w:val="20"/>
+                <w:lang w:val="en-US"/>
+              </w:rPr>
+            </w:pPr>
+            <w:r>
+              <w:rPr>
+                <w:rFonts w:ascii="Times New Roman" w:hAnsi="Times New Roman" w:cs="Times New Roman"/>
+                <w:sz w:val="20"/>
+                <w:szCs w:val="20"/>
+                <w:lang w:val="en-US"/>
+              </w:rPr>
+              <w:t>let perm_u8 = Box::f</w:t>
+            </w:r>
+            <w:r>
+              <w:rPr>
+                <w:rFonts w:ascii="Times New Roman" w:hAnsi="Times New Roman" w:cs="Times New Roman"/>
+                <w:sz w:val="20"/>
+                <w:szCs w:val="20"/>
+                <w:lang w:val="en-US"/>
+              </w:rPr>
+              <w:t>rom_raw(</w:t>
+            </w:r>
+            <w:r>
+              <w:rPr>
+                <w:rFonts w:ascii="Times New Roman" w:hAnsi="Times New Roman" w:cs="Times New Roman"/>
+                <w:sz w:val="20"/>
+                <w:szCs w:val="20"/>
+                <w:lang w:val="en-US"/>
+              </w:rPr>
+              <w:t xml:space="preserve"> slice::from_raw_parts(d.as_ptr() as *const u8, len)</w:t>
+            </w:r>
+            <w:r>
+              <w:rPr>
+                <w:rFonts w:ascii="Times New Roman" w:hAnsi="Times New Roman" w:cs="Times New Roman"/>
+                <w:sz w:val="20"/>
+                <w:szCs w:val="20"/>
+                <w:lang w:val="en-US"/>
+              </w:rPr>
+              <w:t xml:space="preserve">  </w:t>
+            </w:r>
+          </w:p>
+          <w:p>
+            <w:pPr>
+              <w:rPr>
+                <w:rFonts w:ascii="Times New Roman" w:hAnsi="Times New Roman" w:cs="Times New Roman"/>
+                <w:sz w:val="20"/>
+                <w:szCs w:val="20"/>
+                <w:lang w:val="en-US"/>
+              </w:rPr>
+            </w:pPr>
+            <w:r>
+              <w:rPr>
+                <w:rFonts w:ascii="Times New Roman" w:hAnsi="Times New Roman" w:cs="Times New Roman"/>
+                <w:sz w:val="20"/>
+                <w:szCs w:val="20"/>
+                <w:lang w:val="en-US"/>
+              </w:rPr>
+              <w:t>);</w:t>
+            </w:r>
+          </w:p>
+        </w:tc>
+      </w:tr>
+      <w:tr>
+        <w:trPr>
+          <w:trHeight w:val="548"/>
+        </w:trPr>
+        <w:tc>
+          <w:tcPr>
+            <w:tcW w:w="3164" w:type="dxa"/>
+            <w:gridSpan w:val="2"/>
+            <w:vAlign w:val="center"/>
+          </w:tcPr>
+          <w:p>
+            <w:pPr>
+              <w:jc w:val="center"/>
+              <w:rPr>
+                <w:rFonts w:ascii="Times New Roman" w:hAnsi="Times New Roman" w:cs="Times New Roman"/>
+                <w:sz w:val="24"/>
+                <w:szCs w:val="24"/>
+              </w:rPr>
+            </w:pPr>
+            <w:r>
+              <w:rPr>
+                <w:rFonts w:ascii="Times New Roman" w:hAnsi="Times New Roman" w:cs="Times New Roman"/>
+              </w:rPr>
+              <w:lastRenderedPageBreak/>
+              <w:t>A</w:t>
+            </w:r>
+            <w:r>
+              <w:rPr>
+                <w:rFonts w:ascii="Times New Roman" w:hAnsi="Times New Roman" w:cs="Times New Roman"/>
+              </w:rPr>
+              <w:t xml:space="preserve">signación </w:t>
+            </w:r>
+            <w:r>
+              <w:rPr>
+                <w:rFonts w:ascii="Times New Roman" w:hAnsi="Times New Roman" w:cs="Times New Roman"/>
+              </w:rPr>
+              <w:t>a</w:t>
+            </w:r>
+            <w:r>
+              <w:rPr>
+                <w:rFonts w:ascii="Times New Roman" w:hAnsi="Times New Roman" w:cs="Times New Roman"/>
+              </w:rPr>
+              <w:t xml:space="preserve"> bloques unsafe</w:t>
+            </w:r>
+            <w:r>
+              <w:rPr>
+                <w:rFonts w:ascii="Times New Roman" w:hAnsi="Times New Roman" w:cs="Times New Roman"/>
+              </w:rPr>
+              <w:t xml:space="preserve"> punteros</w:t>
+            </w:r>
+          </w:p>
+        </w:tc>
+        <w:tc>
+          <w:tcPr>
+            <w:tcW w:w="4514" w:type="dxa"/>
+            <w:vAlign w:val="center"/>
+          </w:tcPr>
+          <w:p>
+            <w:pPr>
+              <w:rPr>
+                <w:rFonts w:ascii="Times New Roman" w:hAnsi="Times New Roman" w:cs="Times New Roman"/>
+                <w:sz w:val="20"/>
+                <w:szCs w:val="20"/>
+                <w:lang w:val="en-US"/>
+              </w:rPr>
+            </w:pPr>
+            <w:r>
+              <w:rPr>
+                <w:rFonts w:ascii="Times New Roman" w:hAnsi="Times New Roman" w:cs="Times New Roman"/>
+                <w:sz w:val="20"/>
+                <w:szCs w:val="20"/>
+                <w:lang w:val="en-US"/>
+              </w:rPr>
+              <w:t>*unsafe { &amp;mut *req }.0.uri_mut() = u;</w:t>
+            </w:r>
+            <w:r>
+              <w:rPr>
+                <w:rFonts w:ascii="Times New Roman" w:hAnsi="Times New Roman" w:cs="Times New Roman"/>
+                <w:sz w:val="20"/>
+                <w:szCs w:val="20"/>
+                <w:lang w:val="en-US"/>
+              </w:rPr>
+              <w:t xml:space="preserve">    </w:t>
+            </w:r>
+            <w:r>
+              <w:rPr>
+                <w:rStyle w:val="Refdenotaalpie"/>
+                <w:rFonts w:ascii="Times New Roman" w:hAnsi="Times New Roman" w:cs="Times New Roman"/>
+                <w:sz w:val="20"/>
+                <w:szCs w:val="20"/>
+                <w:lang w:val="en-US"/>
+              </w:rPr>
+              <w:footnoteReference w:id="6"/>
+            </w:r>
+          </w:p>
+        </w:tc>
+        <w:tc>
+          <w:tcPr>
+            <w:tcW w:w="3182" w:type="dxa"/>
+            <w:vAlign w:val="center"/>
+          </w:tcPr>
+          <w:p>
+            <w:pPr>
+              <w:rPr>
+                <w:rFonts w:ascii="Times New Roman" w:hAnsi="Times New Roman" w:cs="Times New Roman"/>
+                <w:sz w:val="20"/>
+                <w:szCs w:val="20"/>
+                <w:lang w:val="en-US"/>
+              </w:rPr>
+            </w:pPr>
+            <w:r>
+              <w:rPr>
+                <w:rFonts w:ascii="Times New Roman" w:hAnsi="Times New Roman" w:cs="Times New Roman"/>
+                <w:sz w:val="20"/>
+                <w:szCs w:val="20"/>
+                <w:lang w:val="en-US"/>
+              </w:rPr>
+              <w:t>-</w:t>
+            </w:r>
+          </w:p>
+        </w:tc>
+      </w:tr>
+      <w:tr>
+        <w:trPr>
+          <w:trHeight w:val="548"/>
+        </w:trPr>
+        <w:tc>
+          <w:tcPr>
+            <w:tcW w:w="3164" w:type="dxa"/>
+            <w:gridSpan w:val="2"/>
+            <w:vAlign w:val="center"/>
+          </w:tcPr>
+          <w:p>
+            <w:pPr>
+              <w:jc w:val="center"/>
+              <w:rPr>
+                <w:rFonts w:ascii="Times New Roman" w:hAnsi="Times New Roman" w:cs="Times New Roman"/>
+              </w:rPr>
+            </w:pPr>
+            <w:r>
+              <w:rPr>
+                <w:rFonts w:ascii="Times New Roman" w:hAnsi="Times New Roman" w:cs="Times New Roman"/>
+              </w:rPr>
+              <w:t>Llamada a funciones externas</w:t>
+            </w:r>
+          </w:p>
+        </w:tc>
+        <w:tc>
+          <w:tcPr>
+            <w:tcW w:w="4514" w:type="dxa"/>
+            <w:vAlign w:val="center"/>
+          </w:tcPr>
+          <w:p>
+            <w:pPr>
+              <w:rPr>
+                <w:rFonts w:ascii="Times New Roman" w:hAnsi="Times New Roman" w:cs="Times New Roman"/>
+                <w:sz w:val="20"/>
+                <w:szCs w:val="20"/>
+                <w:lang w:val="en-US"/>
+              </w:rPr>
+            </w:pPr>
+            <w:r>
+              <w:rPr>
+                <w:rFonts w:ascii="Times New Roman" w:hAnsi="Times New Roman" w:cs="Times New Roman"/>
+                <w:sz w:val="20"/>
+                <w:szCs w:val="20"/>
+                <w:lang w:val="en-US"/>
+              </w:rPr>
+              <w:t>extern "C" fn run_guest(_vmctx: *const lucet_vmctx) {</w:t>
+            </w:r>
+          </w:p>
+          <w:p>
+            <w:pPr>
+              <w:rPr>
+                <w:rFonts w:ascii="Times New Roman" w:hAnsi="Times New Roman" w:cs="Times New Roman"/>
+                <w:sz w:val="20"/>
+                <w:szCs w:val="20"/>
+                <w:lang w:val="en-US"/>
+              </w:rPr>
+            </w:pPr>
+            <w:r>
+              <w:rPr>
+                <w:rFonts w:ascii="Times New Roman" w:hAnsi="Times New Roman" w:cs="Times New Roman"/>
+                <w:sz w:val="20"/>
+                <w:szCs w:val="20"/>
+                <w:lang w:val="en-US"/>
+              </w:rPr>
+              <w:t xml:space="preserve"> unsafe {</w:t>
+            </w:r>
+          </w:p>
+          <w:p>
+            <w:pPr>
+              <w:rPr>
+                <w:rFonts w:ascii="Times New Roman" w:hAnsi="Times New Roman" w:cs="Times New Roman"/>
+                <w:sz w:val="20"/>
+                <w:szCs w:val="20"/>
+                <w:lang w:val="en-US"/>
+              </w:rPr>
+            </w:pPr>
+            <w:r>
+              <w:rPr>
+                <w:rFonts w:ascii="Times New Roman" w:hAnsi="Times New Roman" w:cs="Times New Roman"/>
+                <w:sz w:val="20"/>
+                <w:szCs w:val="20"/>
+                <w:lang w:val="en-US"/>
+              </w:rPr>
+              <w:t xml:space="preserve">  // ENTERING_GUEST is only populated if the test requires this syncpoint be checked.</w:t>
+            </w:r>
+          </w:p>
+          <w:p>
+            <w:pPr>
+              <w:rPr>
+                <w:rFonts w:ascii="Times New Roman" w:hAnsi="Times New Roman" w:cs="Times New Roman"/>
+                <w:sz w:val="20"/>
+                <w:szCs w:val="20"/>
+                <w:lang w:val="en-US"/>
+              </w:rPr>
+            </w:pPr>
+            <w:r>
+              <w:rPr>
+                <w:rFonts w:ascii="Times New Roman" w:hAnsi="Times New Roman" w:cs="Times New Roman"/>
+                <w:sz w:val="20"/>
+                <w:szCs w:val="20"/>
+                <w:lang w:val="en-US"/>
+              </w:rPr>
+              <w:t xml:space="preserve">  if let Some(entering_guest) = ENTERING_GUEST.as_ref() {</w:t>
+            </w:r>
+            <w:r>
+              <w:rPr>
+                <w:rFonts w:ascii="Times New Roman" w:hAnsi="Times New Roman" w:cs="Times New Roman"/>
+                <w:sz w:val="20"/>
+                <w:szCs w:val="20"/>
+                <w:lang w:val="en-US"/>
+              </w:rPr>
+              <w:t xml:space="preserve">            </w:t>
+            </w:r>
+            <w:r>
+              <w:rPr>
+                <w:rStyle w:val="Refdenotaalpie"/>
+                <w:rFonts w:ascii="Times New Roman" w:hAnsi="Times New Roman" w:cs="Times New Roman"/>
+                <w:sz w:val="20"/>
+                <w:szCs w:val="20"/>
+                <w:lang w:val="en-US"/>
+              </w:rPr>
+              <w:footnoteReference w:id="7"/>
+            </w:r>
+          </w:p>
+          <w:p>
+            <w:pPr>
+              <w:rPr>
+                <w:rFonts w:ascii="Times New Roman" w:hAnsi="Times New Roman" w:cs="Times New Roman"/>
+                <w:sz w:val="20"/>
+                <w:szCs w:val="20"/>
+              </w:rPr>
+            </w:pPr>
+            <w:r>
+              <w:rPr>
+                <w:rFonts w:ascii="Times New Roman" w:hAnsi="Times New Roman" w:cs="Times New Roman"/>
+                <w:sz w:val="20"/>
+                <w:szCs w:val="20"/>
+                <w:lang w:val="en-US"/>
+              </w:rPr>
+              <w:t xml:space="preserve">                </w:t>
+            </w:r>
+            <w:r>
+              <w:rPr>
+                <w:rFonts w:ascii="Times New Roman" w:hAnsi="Times New Roman" w:cs="Times New Roman"/>
+                <w:sz w:val="20"/>
+                <w:szCs w:val="20"/>
+              </w:rPr>
+              <w:t>entering_guest.check();</w:t>
+            </w:r>
+          </w:p>
+          <w:p>
+            <w:pPr>
+              <w:rPr>
+                <w:rFonts w:ascii="Times New Roman" w:hAnsi="Times New Roman" w:cs="Times New Roman"/>
+                <w:sz w:val="20"/>
+                <w:szCs w:val="20"/>
+              </w:rPr>
+            </w:pPr>
+            <w:r>
+              <w:rPr>
+                <w:rFonts w:ascii="Times New Roman" w:hAnsi="Times New Roman" w:cs="Times New Roman"/>
+                <w:sz w:val="20"/>
+                <w:szCs w:val="20"/>
+              </w:rPr>
+              <w:t xml:space="preserve">            }</w:t>
+            </w:r>
+          </w:p>
+          <w:p>
+            <w:pPr>
+              <w:rPr>
+                <w:rFonts w:ascii="Times New Roman" w:hAnsi="Times New Roman" w:cs="Times New Roman"/>
+                <w:sz w:val="20"/>
+                <w:szCs w:val="20"/>
+              </w:rPr>
+            </w:pPr>
+            <w:r>
+              <w:rPr>
+                <w:rFonts w:ascii="Times New Roman" w:hAnsi="Times New Roman" w:cs="Times New Roman"/>
+                <w:sz w:val="20"/>
+                <w:szCs w:val="20"/>
+              </w:rPr>
+              <w:t xml:space="preserve">        }</w:t>
+            </w:r>
+          </w:p>
+          <w:p>
+            <w:pPr>
+              <w:rPr>
+                <w:rFonts w:ascii="Times New Roman" w:hAnsi="Times New Roman" w:cs="Times New Roman"/>
+                <w:sz w:val="20"/>
+                <w:szCs w:val="20"/>
+              </w:rPr>
+            </w:pPr>
+            <w:r>
+              <w:rPr>
+                <w:rFonts w:ascii="Times New Roman" w:hAnsi="Times New Roman" w:cs="Times New Roman"/>
+                <w:sz w:val="20"/>
+                <w:szCs w:val="20"/>
+              </w:rPr>
+              <w:t xml:space="preserve">    }</w:t>
+            </w:r>
+          </w:p>
+        </w:tc>
+        <w:tc>
+          <w:tcPr>
+            <w:tcW w:w="3182" w:type="dxa"/>
+            <w:vAlign w:val="center"/>
+          </w:tcPr>
+          <w:p>
+            <w:pPr>
+              <w:rPr>
+                <w:rFonts w:ascii="Times New Roman" w:hAnsi="Times New Roman" w:cs="Times New Roman"/>
+                <w:sz w:val="20"/>
+                <w:szCs w:val="20"/>
+              </w:rPr>
+            </w:pPr>
+            <w:r>
+              <w:rPr>
+                <w:rFonts w:ascii="Times New Roman" w:hAnsi="Times New Roman" w:cs="Times New Roman"/>
+                <w:sz w:val="20"/>
+                <w:szCs w:val="20"/>
+              </w:rPr>
+              <w:t>-</w:t>
+            </w:r>
+          </w:p>
+        </w:tc>
+      </w:tr>
+      <w:tr>
+        <w:trPr>
+          <w:trHeight w:val="548"/>
+        </w:trPr>
+        <w:tc>
+          <w:tcPr>
+            <w:tcW w:w="3164" w:type="dxa"/>
+            <w:gridSpan w:val="2"/>
+            <w:vAlign w:val="center"/>
+          </w:tcPr>
+          <w:p>
+            <w:pPr>
+              <w:jc w:val="center"/>
+              <w:rPr>
+                <w:rFonts w:ascii="Times New Roman" w:hAnsi="Times New Roman" w:cs="Times New Roman"/>
+              </w:rPr>
+            </w:pPr>
+            <w:r>
+              <w:rPr>
+                <w:rFonts w:ascii="Times New Roman" w:hAnsi="Times New Roman" w:cs="Times New Roman"/>
+              </w:rPr>
+              <w:t>------------------------</w:t>
+            </w:r>
+          </w:p>
+        </w:tc>
+        <w:tc>
+          <w:tcPr>
+            <w:tcW w:w="4514" w:type="dxa"/>
+            <w:vAlign w:val="center"/>
+          </w:tcPr>
+          <w:p>
+            <w:pPr>
+              <w:rPr>
+                <w:rFonts w:ascii="Times New Roman" w:hAnsi="Times New Roman" w:cs="Times New Roman"/>
+                <w:sz w:val="20"/>
+                <w:szCs w:val="20"/>
+              </w:rPr>
+            </w:pPr>
+            <w:r>
+              <w:rPr>
+                <w:rFonts w:ascii="Times New Roman" w:hAnsi="Times New Roman" w:cs="Times New Roman"/>
+                <w:sz w:val="20"/>
+                <w:szCs w:val="20"/>
+              </w:rPr>
+              <w:t>------- caso de modificación sin omitir unsafe -------</w:t>
+            </w:r>
+          </w:p>
+        </w:tc>
+        <w:tc>
+          <w:tcPr>
+            <w:tcW w:w="3182" w:type="dxa"/>
+            <w:vAlign w:val="center"/>
+          </w:tcPr>
+          <w:p>
+            <w:pPr>
+              <w:rPr>
+                <w:rFonts w:ascii="Times New Roman" w:hAnsi="Times New Roman" w:cs="Times New Roman"/>
+                <w:sz w:val="20"/>
+                <w:szCs w:val="20"/>
+              </w:rPr>
+            </w:pPr>
+            <w:r>
+              <w:rPr>
+                <w:rFonts w:ascii="Times New Roman" w:hAnsi="Times New Roman" w:cs="Times New Roman"/>
+                <w:sz w:val="20"/>
+                <w:szCs w:val="20"/>
+              </w:rPr>
+              <w:t>-----------------------------------</w:t>
+            </w:r>
+          </w:p>
+        </w:tc>
+      </w:tr>
+      <w:tr>
+        <w:trPr>
+          <w:trHeight w:val="548"/>
+        </w:trPr>
+        <w:tc>
+          <w:tcPr>
+            <w:tcW w:w="3164" w:type="dxa"/>
+            <w:gridSpan w:val="2"/>
+            <w:vAlign w:val="center"/>
+          </w:tcPr>
+          <w:p>
+            <w:pPr>
+              <w:jc w:val="center"/>
+              <w:rPr>
+                <w:rFonts w:ascii="Times New Roman" w:hAnsi="Times New Roman" w:cs="Times New Roman"/>
+              </w:rPr>
+            </w:pPr>
+            <w:r>
+              <w:rPr>
+                <w:rFonts w:ascii="Times New Roman" w:hAnsi="Times New Roman" w:cs="Times New Roman"/>
+              </w:rPr>
+              <w:t>Sustitución de casteo por método que devuelve puntero</w:t>
+            </w:r>
+          </w:p>
+        </w:tc>
+        <w:tc>
+          <w:tcPr>
+            <w:tcW w:w="4514" w:type="dxa"/>
+            <w:vAlign w:val="center"/>
+          </w:tcPr>
+          <w:p>
+            <w:pPr>
+              <w:rPr>
+                <w:rFonts w:ascii="Times New Roman" w:hAnsi="Times New Roman" w:cs="Times New Roman"/>
+                <w:sz w:val="20"/>
+                <w:szCs w:val="20"/>
+                <w:lang w:val="en-US"/>
+              </w:rPr>
+            </w:pPr>
+            <w:r>
+              <w:rPr>
+                <w:rFonts w:ascii="Times New Roman" w:hAnsi="Times New Roman" w:cs="Times New Roman"/>
+                <w:sz w:val="20"/>
+                <w:szCs w:val="20"/>
+                <w:lang w:val="en-US"/>
+              </w:rPr>
+              <w:t>&amp;mut *(raw as *mut [u8] as *mut [MaybeUninit])</w:t>
+            </w:r>
+            <w:r>
+              <w:rPr>
+                <w:rFonts w:ascii="Times New Roman" w:hAnsi="Times New Roman" w:cs="Times New Roman"/>
+                <w:sz w:val="20"/>
+                <w:szCs w:val="20"/>
+                <w:lang w:val="en-US"/>
+              </w:rPr>
+              <w:t xml:space="preserve">   </w:t>
+            </w:r>
+            <w:r>
+              <w:rPr>
+                <w:rStyle w:val="Refdenotaalpie"/>
+                <w:rFonts w:ascii="Times New Roman" w:hAnsi="Times New Roman" w:cs="Times New Roman"/>
+                <w:sz w:val="20"/>
+                <w:szCs w:val="20"/>
+                <w:lang w:val="en-US"/>
+              </w:rPr>
+              <w:footnoteReference w:id="8"/>
+            </w:r>
+          </w:p>
+        </w:tc>
+        <w:tc>
+          <w:tcPr>
+            <w:tcW w:w="3182" w:type="dxa"/>
+            <w:vAlign w:val="center"/>
+          </w:tcPr>
+          <w:p>
+            <w:pPr>
+              <w:rPr>
+                <w:rFonts w:ascii="Times New Roman" w:hAnsi="Times New Roman" w:cs="Times New Roman"/>
+                <w:sz w:val="20"/>
+                <w:szCs w:val="20"/>
+                <w:lang w:val="en-US"/>
+              </w:rPr>
+            </w:pPr>
+            <w:r>
+              <w:rPr>
+                <w:rFonts w:ascii="Times New Roman" w:hAnsi="Times New Roman" w:cs="Times New Roman"/>
+                <w:sz w:val="20"/>
+                <w:szCs w:val="20"/>
+                <w:lang w:val="en-US"/>
+              </w:rPr>
+              <w:t>&amp;mut *raw.as_mut_ptr()</w:t>
+            </w:r>
+          </w:p>
+        </w:tc>
+      </w:tr>
+    </w:tbl>
+    <w:p>
+      <w:pPr>
+        <w:spacing w:after="0" w:line="240" w:lineRule="auto"/>
+        <w:rPr>
+          <w:rFonts w:ascii="Times New Roman" w:hAnsi="Times New Roman" w:cs="Times New Roman"/>
+          <w:sz w:val="24"/>
+          <w:szCs w:val="24"/>
+          <w:lang w:val="en-US"/>
+        </w:rPr>
+      </w:pPr>
+    </w:p>
+    <w:p>
+      <w:pPr>
+        <w:jc w:val="center"/>
+        <w:rPr>
+          <w:i/>
+          <w:iCs/>
+          <w:color w:val="404040" w:themeColor="text1" w:themeTint="BF"/>
+        </w:rPr>
+      </w:pPr>
+      <w:r>
+        <w:rPr>
+          <w:rStyle w:val="nfasissutil"/>
+        </w:rPr>
+        <w:t xml:space="preserve">Tabla </w:t>
+      </w:r>
+      <w:r>
+        <w:rPr>
+          <w:rStyle w:val="nfasissutil"/>
+        </w:rPr>
+        <w:t>con cambios factibles para el código analizado</w:t>
+      </w:r>
+    </w:p>
+    <w:p>
+      <w:pPr>
+        <w:spacing w:after="0" w:line="240" w:lineRule="auto"/>
+        <w:rPr>
+          <w:rFonts w:ascii="Times New Roman" w:hAnsi="Times New Roman" w:cs="Times New Roman"/>
+          <w:sz w:val="24"/>
+          <w:szCs w:val="24"/>
+        </w:rPr>
+      </w:pPr>
+    </w:p>
+    <w:p>
+      <w:pPr>
+        <w:spacing w:after="0" w:line="240" w:lineRule="auto"/>
+        <w:rPr>
+          <w:rFonts w:ascii="Times New Roman" w:hAnsi="Times New Roman" w:cs="Times New Roman"/>
+          <w:sz w:val="24"/>
+          <w:szCs w:val="24"/>
+        </w:rPr>
+      </w:pPr>
+    </w:p>
+    <w:p>
+      <w:pPr>
+        <w:spacing w:after="0" w:line="240" w:lineRule="auto"/>
+        <w:rPr>
+          <w:rFonts w:ascii="Times New Roman" w:hAnsi="Times New Roman" w:cs="Times New Roman"/>
+          <w:sz w:val="24"/>
+          <w:szCs w:val="24"/>
+        </w:rPr>
+      </w:pPr>
+    </w:p>
+    <w:p>
+      <w:pPr>
+        <w:spacing w:after="0" w:line="240" w:lineRule="auto"/>
+        <w:rPr>
+          <w:rFonts w:ascii="Times New Roman" w:hAnsi="Times New Roman" w:cs="Times New Roman"/>
+          <w:sz w:val="24"/>
+          <w:szCs w:val="24"/>
+        </w:rPr>
+      </w:pPr>
+    </w:p>
+    <w:p>
+      <w:pPr>
+        <w:spacing w:after="0" w:line="240" w:lineRule="auto"/>
+        <w:rPr>
+          <w:rFonts w:ascii="Times New Roman" w:hAnsi="Times New Roman" w:cs="Times New Roman"/>
+          <w:sz w:val="24"/>
+          <w:szCs w:val="24"/>
+        </w:rPr>
+      </w:pPr>
+    </w:p>
+    <w:p>
+      <w:pPr>
+        <w:spacing w:after="0" w:line="240" w:lineRule="auto"/>
+        <w:rPr>
+          <w:rFonts w:ascii="Times New Roman" w:hAnsi="Times New Roman" w:cs="Times New Roman"/>
+          <w:sz w:val="24"/>
+          <w:szCs w:val="24"/>
+        </w:rPr>
+      </w:pPr>
+    </w:p>
+    <w:p>
+      <w:pPr>
+        <w:spacing w:after="0" w:line="240" w:lineRule="auto"/>
+        <w:rPr>
+          <w:rFonts w:ascii="Times New Roman" w:hAnsi="Times New Roman" w:cs="Times New Roman"/>
+          <w:sz w:val="24"/>
+          <w:szCs w:val="24"/>
+        </w:rPr>
+      </w:pPr>
+    </w:p>
+    <w:p>
+      <w:pPr>
+        <w:spacing w:after="0" w:line="240" w:lineRule="auto"/>
+        <w:rPr>
+          <w:rFonts w:ascii="Times New Roman" w:hAnsi="Times New Roman" w:cs="Times New Roman"/>
+          <w:sz w:val="24"/>
+          <w:szCs w:val="24"/>
+        </w:rPr>
+      </w:pPr>
+    </w:p>
+    <w:p>
+      <w:pPr>
+        <w:spacing w:after="0" w:line="240" w:lineRule="auto"/>
+        <w:rPr>
+          <w:rFonts w:ascii="Times New Roman" w:hAnsi="Times New Roman" w:cs="Times New Roman"/>
+          <w:sz w:val="24"/>
+          <w:szCs w:val="24"/>
+        </w:rPr>
+      </w:pPr>
+    </w:p>
+    <w:p>
+      <w:pPr>
+        <w:spacing w:after="0" w:line="240" w:lineRule="auto"/>
+        <w:rPr>
+          <w:rFonts w:ascii="Times New Roman" w:hAnsi="Times New Roman" w:cs="Times New Roman"/>
+          <w:sz w:val="24"/>
+          <w:szCs w:val="24"/>
+        </w:rPr>
+      </w:pPr>
+    </w:p>
+    <w:p>
+      <w:pPr>
+        <w:spacing w:after="0" w:line="240" w:lineRule="auto"/>
+        <w:rPr>
+          <w:rFonts w:ascii="Times New Roman" w:hAnsi="Times New Roman" w:cs="Times New Roman"/>
+          <w:sz w:val="24"/>
+          <w:szCs w:val="24"/>
+        </w:rPr>
+      </w:pPr>
+    </w:p>
+    <w:p>
+      <w:pPr>
+        <w:spacing w:after="0" w:line="240" w:lineRule="auto"/>
+        <w:rPr>
+          <w:rFonts w:ascii="Times New Roman" w:hAnsi="Times New Roman" w:cs="Times New Roman"/>
+          <w:sz w:val="24"/>
+          <w:szCs w:val="24"/>
+        </w:rPr>
+      </w:pPr>
+    </w:p>
+    <w:p>
+      <w:pPr>
+        <w:spacing w:after="0" w:line="240" w:lineRule="auto"/>
+        <w:rPr>
+          <w:rFonts w:ascii="Times New Roman" w:hAnsi="Times New Roman" w:cs="Times New Roman"/>
+          <w:sz w:val="24"/>
+          <w:szCs w:val="24"/>
+        </w:rPr>
+      </w:pPr>
+    </w:p>
+    <w:p>
+      <w:pPr>
+        <w:spacing w:after="0" w:line="240" w:lineRule="auto"/>
+        <w:rPr>
+          <w:rFonts w:ascii="Times New Roman" w:hAnsi="Times New Roman" w:cs="Times New Roman"/>
+          <w:sz w:val="24"/>
+          <w:szCs w:val="24"/>
+        </w:rPr>
+      </w:pPr>
+    </w:p>
+    <w:p>
+      <w:pPr>
+        <w:spacing w:after="0" w:line="240" w:lineRule="auto"/>
+        <w:rPr>
+          <w:rFonts w:ascii="Times New Roman" w:hAnsi="Times New Roman" w:cs="Times New Roman"/>
+          <w:sz w:val="24"/>
+          <w:szCs w:val="24"/>
+        </w:rPr>
+      </w:pPr>
+    </w:p>
+    <w:p>
+      <w:pPr>
+        <w:spacing w:after="0" w:line="240" w:lineRule="auto"/>
+        <w:rPr>
+          <w:rFonts w:ascii="Times New Roman" w:hAnsi="Times New Roman" w:cs="Times New Roman"/>
+          <w:sz w:val="24"/>
+          <w:szCs w:val="24"/>
+        </w:rPr>
+      </w:pPr>
+    </w:p>
+    <w:p>
+      <w:pPr>
+        <w:spacing w:after="0" w:line="240" w:lineRule="auto"/>
+        <w:rPr>
+          <w:rFonts w:ascii="Times New Roman" w:hAnsi="Times New Roman" w:cs="Times New Roman"/>
+          <w:sz w:val="24"/>
+          <w:szCs w:val="24"/>
+        </w:rPr>
+      </w:pPr>
+    </w:p>
+    <w:p>
+      <w:pPr>
+        <w:spacing w:after="0" w:line="240" w:lineRule="auto"/>
+        <w:rPr>
+          <w:rFonts w:ascii="Times New Roman" w:hAnsi="Times New Roman" w:cs="Times New Roman"/>
+          <w:sz w:val="24"/>
+          <w:szCs w:val="24"/>
+        </w:rPr>
+      </w:pPr>
+    </w:p>
+    <w:p>
+      <w:pPr>
+        <w:spacing w:after="0" w:line="240" w:lineRule="auto"/>
+        <w:rPr>
+          <w:rFonts w:ascii="Times New Roman" w:hAnsi="Times New Roman" w:cs="Times New Roman"/>
+          <w:sz w:val="24"/>
+          <w:szCs w:val="24"/>
+        </w:rPr>
+      </w:pPr>
+    </w:p>
+    <w:p>
+      <w:pPr>
+        <w:spacing w:after="0" w:line="240" w:lineRule="auto"/>
+        <w:rPr>
+          <w:rFonts w:ascii="Times New Roman" w:hAnsi="Times New Roman" w:cs="Times New Roman"/>
+          <w:sz w:val="24"/>
+          <w:szCs w:val="24"/>
+        </w:rPr>
+      </w:pPr>
+    </w:p>
+    <w:p>
+      <w:pPr>
+        <w:spacing w:after="0" w:line="240" w:lineRule="auto"/>
+        <w:rPr>
+          <w:rFonts w:ascii="Times New Roman" w:hAnsi="Times New Roman" w:cs="Times New Roman"/>
+          <w:sz w:val="24"/>
+          <w:szCs w:val="24"/>
+        </w:rPr>
+      </w:pPr>
+    </w:p>
+    <w:p>
+      <w:pPr>
+        <w:spacing w:after="0" w:line="240" w:lineRule="auto"/>
+        <w:rPr>
+          <w:rFonts w:ascii="Times New Roman" w:hAnsi="Times New Roman" w:cs="Times New Roman"/>
+          <w:sz w:val="24"/>
+          <w:szCs w:val="24"/>
+        </w:rPr>
+      </w:pPr>
+    </w:p>
+    <w:p>
+      <w:pPr>
+        <w:spacing w:after="0" w:line="240" w:lineRule="auto"/>
+        <w:rPr>
+          <w:rFonts w:ascii="Times New Roman" w:hAnsi="Times New Roman" w:cs="Times New Roman"/>
+          <w:sz w:val="24"/>
+          <w:szCs w:val="24"/>
+        </w:rPr>
+      </w:pPr>
+    </w:p>
+    <w:p>
+      <w:pPr>
+        <w:spacing w:after="0" w:line="240" w:lineRule="auto"/>
+        <w:rPr>
+          <w:rFonts w:ascii="Times New Roman" w:hAnsi="Times New Roman" w:cs="Times New Roman"/>
+          <w:sz w:val="24"/>
+          <w:szCs w:val="24"/>
+        </w:rPr>
+      </w:pPr>
+    </w:p>
+    <w:p>
+      <w:pPr>
+        <w:spacing w:after="0" w:line="240" w:lineRule="auto"/>
+        <w:rPr>
+          <w:rFonts w:ascii="Times New Roman" w:hAnsi="Times New Roman" w:cs="Times New Roman"/>
+          <w:sz w:val="24"/>
+          <w:szCs w:val="24"/>
+        </w:rPr>
+      </w:pPr>
+    </w:p>
+    <w:p>
+      <w:pPr>
+        <w:spacing w:after="0" w:line="240" w:lineRule="auto"/>
+        <w:rPr>
+          <w:rFonts w:ascii="Times New Roman" w:hAnsi="Times New Roman" w:cs="Times New Roman"/>
+          <w:sz w:val="24"/>
+          <w:szCs w:val="24"/>
+        </w:rPr>
+      </w:pPr>
+    </w:p>
+    <w:p>
+      <w:pPr>
+        <w:spacing w:after="0" w:line="240" w:lineRule="auto"/>
+        <w:rPr>
+          <w:rFonts w:ascii="Times New Roman" w:hAnsi="Times New Roman" w:cs="Times New Roman"/>
+          <w:sz w:val="24"/>
+          <w:szCs w:val="24"/>
+        </w:rPr>
+      </w:pPr>
+    </w:p>
+    <w:p>
+      <w:pPr>
+        <w:spacing w:after="0" w:line="240" w:lineRule="auto"/>
+        <w:rPr>
+          <w:rFonts w:ascii="Times New Roman" w:hAnsi="Times New Roman" w:cs="Times New Roman"/>
+          <w:sz w:val="24"/>
+          <w:szCs w:val="24"/>
+        </w:rPr>
+      </w:pPr>
+    </w:p>
+    <w:p>
+      <w:pPr>
+        <w:spacing w:after="0" w:line="240" w:lineRule="auto"/>
+        <w:rPr>
+          <w:rFonts w:ascii="Times New Roman" w:hAnsi="Times New Roman" w:cs="Times New Roman"/>
+          <w:sz w:val="24"/>
+          <w:szCs w:val="24"/>
+        </w:rPr>
+      </w:pPr>
+    </w:p>
+    <w:p>
+      <w:pPr>
+        <w:spacing w:after="0" w:line="240" w:lineRule="auto"/>
+        <w:rPr>
+          <w:rFonts w:ascii="Times New Roman" w:hAnsi="Times New Roman" w:cs="Times New Roman"/>
+          <w:sz w:val="24"/>
+          <w:szCs w:val="24"/>
+        </w:rPr>
+      </w:pPr>
+    </w:p>
+    <w:p>
+      <w:pPr>
+        <w:spacing w:after="0" w:line="240" w:lineRule="auto"/>
+        <w:rPr>
+          <w:rFonts w:ascii="Times New Roman" w:hAnsi="Times New Roman" w:cs="Times New Roman"/>
+          <w:sz w:val="24"/>
+          <w:szCs w:val="24"/>
+        </w:rPr>
+      </w:pPr>
+    </w:p>
+    <w:p>
+      <w:pPr>
+        <w:spacing w:after="0" w:line="240" w:lineRule="auto"/>
+        <w:rPr>
+          <w:rFonts w:ascii="Times New Roman" w:hAnsi="Times New Roman" w:cs="Times New Roman"/>
+          <w:sz w:val="24"/>
+          <w:szCs w:val="24"/>
+        </w:rPr>
+      </w:pPr>
+    </w:p>
+    <w:p>
+      <w:pPr>
+        <w:spacing w:after="0" w:line="240" w:lineRule="auto"/>
+        <w:rPr>
+          <w:rFonts w:ascii="Times New Roman" w:hAnsi="Times New Roman" w:cs="Times New Roman"/>
+          <w:sz w:val="24"/>
+          <w:szCs w:val="24"/>
+        </w:rPr>
+      </w:pPr>
+    </w:p>
+    <w:p>
+      <w:pPr>
+        <w:spacing w:after="0" w:line="240" w:lineRule="auto"/>
+        <w:rPr>
+          <w:rFonts w:ascii="Times New Roman" w:hAnsi="Times New Roman" w:cs="Times New Roman"/>
+          <w:sz w:val="24"/>
+          <w:szCs w:val="24"/>
+        </w:rPr>
+      </w:pPr>
+    </w:p>
+    <w:p>
+      <w:pPr>
+        <w:spacing w:after="0" w:line="240" w:lineRule="auto"/>
+        <w:rPr>
+          <w:rFonts w:ascii="Times New Roman" w:hAnsi="Times New Roman" w:cs="Times New Roman"/>
+          <w:sz w:val="24"/>
+          <w:szCs w:val="24"/>
+        </w:rPr>
+      </w:pPr>
+    </w:p>
+    <w:p>
+      <w:pPr>
+        <w:spacing w:after="0" w:line="240" w:lineRule="auto"/>
+        <w:rPr>
+          <w:rFonts w:ascii="Times New Roman" w:hAnsi="Times New Roman" w:cs="Times New Roman"/>
+          <w:sz w:val="24"/>
+          <w:szCs w:val="24"/>
+        </w:rPr>
+      </w:pPr>
+    </w:p>
+    <w:p>
+      <w:pPr>
+        <w:spacing w:after="0" w:line="240" w:lineRule="auto"/>
         <w:rPr>
           <w:rFonts w:ascii="Times New Roman" w:hAnsi="Times New Roman" w:cs="Times New Roman"/>
           <w:sz w:val="24"/>
@@ -580,15 +3571,682 @@
       </w:pPr>
     </w:p>
     <w:sectPr>
+      <w:headerReference w:type="even" r:id="rId16"/>
+      <w:headerReference w:type="default" r:id="rId17"/>
+      <w:headerReference w:type="first" r:id="rId18"/>
+      <w:footerReference w:type="first" r:id="rId19"/>
       <w:pgSz w:w="11906" w:h="16838" w:code="9"/>
-      <w:pgMar w:top="1418" w:right="1418" w:bottom="1418" w:left="1418" w:header="567" w:footer="567" w:gutter="0"/>
-      <w:pgNumType w:start="0"/>
+      <w:pgMar w:top="1418" w:right="1418" w:bottom="1418" w:left="1418" w:header="567" w:footer="227" w:gutter="0"/>
+      <w:pgNumType w:start="1"/>
       <w:cols w:space="708"/>
       <w:titlePg/>
       <w:docGrid w:linePitch="360"/>
     </w:sectPr>
   </w:body>
 </w:document>
+</file>
+
+<file path=word/comments.xml><?xml version="1.0" encoding="utf-8"?>
+<w:comments xmlns:wpc="http://schemas.microsoft.com/office/word/2010/wordprocessingCanvas" xmlns:cx="http://schemas.microsoft.com/office/drawing/2014/chartex" xmlns:cx1="http://schemas.microsoft.com/office/drawing/2015/9/8/chartex" xmlns:cx2="http://schemas.microsoft.com/office/drawing/2015/10/21/chartex" xmlns:cx3="http://schemas.microsoft.com/office/drawing/2016/5/9/chartex" xmlns:cx4="http://schemas.microsoft.com/office/drawing/2016/5/10/chartex" xmlns:cx5="http://schemas.microsoft.com/office/drawing/2016/5/11/chartex" xmlns:cx6="http://schemas.microsoft.com/office/drawing/2016/5/12/chartex" xmlns:cx7="http://schemas.microsoft.com/office/drawing/2016/5/13/chartex" xmlns:cx8="http://schemas.microsoft.com/office/drawing/2016/5/14/chartex" xmlns:mc="http://schemas.openxmlformats.org/markup-compatibility/2006" xmlns:aink="http://schemas.microsoft.com/office/drawing/2016/ink" xmlns:am3d="http://schemas.microsoft.com/office/drawing/2017/model3d" xmlns:o="urn:schemas-microsoft-com:office:office" xmlns:oel="http://schemas.microsoft.com/office/2019/extlst" xmlns:r="http://schemas.openxmlformats.org/officeDocument/2006/relationships" xmlns:m="http://schemas.openxmlformats.org/officeDocument/2006/math" xmlns:v="urn:schemas-microsoft-com:vml" xmlns:wp14="http://schemas.microsoft.com/office/word/2010/wordprocessingDrawing" xmlns:wp="http://schemas.openxmlformats.org/drawingml/2006/wordprocessingDrawing" xmlns:w10="urn:schemas-microsoft-com:office:word" xmlns:w="http://schemas.openxmlformats.org/wordprocessingml/2006/main" xmlns:w14="http://schemas.microsoft.com/office/word/2010/wordml" xmlns:w15="http://schemas.microsoft.com/office/word/2012/wordml" xmlns:w16cex="http://schemas.microsoft.com/office/word/2018/wordml/cex" xmlns:w16cid="http://schemas.microsoft.com/office/word/2016/wordml/cid" xmlns:w16="http://schemas.microsoft.com/office/word/2018/wordml" xmlns:w16du="http://schemas.microsoft.com/office/word/2023/wordml/word16du" xmlns:w16sdtdh="http://schemas.microsoft.com/office/word/2020/wordml/sdtdatahash" xmlns:w16sdtfl="http://schemas.microsoft.com/office/word/2024/wordml/sdtformatlock" xmlns:w16se="http://schemas.microsoft.com/office/word/2015/wordml/symex" xmlns:wpg="http://schemas.microsoft.com/office/word/2010/wordprocessingGroup" xmlns:wpi="http://schemas.microsoft.com/office/word/2010/wordprocessingInk" xmlns:wne="http://schemas.microsoft.com/office/word/2006/wordml" xmlns:wps="http://schemas.microsoft.com/office/word/2010/wordprocessingShape" mc:Ignorable="w14 w15 w16se w16cid w16 w16cex w16sdtdh w16sdtfl w16du wp14">
+  <w:comment w:id="0" w:author="Uri Guzman" w:date="2025-08-25T15:18:00Z" w:initials="UG">
+    <w:p>
+      <w:pPr>
+        <w:pStyle w:val="Textocomentario"/>
+      </w:pPr>
+      <w:r>
+        <w:rPr>
+          <w:rStyle w:val="Refdecomentario"/>
+        </w:rPr>
+        <w:annotationRef/>
+      </w:r>
+      <w:r>
+        <w:t>Revisar futuramente que hayamos trabajado con los casos parciales y no solo con los bloques completos.</w:t>
+      </w:r>
+    </w:p>
+  </w:comment>
+</w:comments>
+</file>
+
+<file path=word/commentsExtended.xml><?xml version="1.0" encoding="utf-8"?>
+<w15:commentsEx xmlns:wpc="http://schemas.microsoft.com/office/word/2010/wordprocessingCanvas" xmlns:cx="http://schemas.microsoft.com/office/drawing/2014/chartex" xmlns:cx1="http://schemas.microsoft.com/office/drawing/2015/9/8/chartex" xmlns:cx2="http://schemas.microsoft.com/office/drawing/2015/10/21/chartex" xmlns:cx3="http://schemas.microsoft.com/office/drawing/2016/5/9/chartex" xmlns:cx4="http://schemas.microsoft.com/office/drawing/2016/5/10/chartex" xmlns:cx5="http://schemas.microsoft.com/office/drawing/2016/5/11/chartex" xmlns:cx6="http://schemas.microsoft.com/office/drawing/2016/5/12/chartex" xmlns:cx7="http://schemas.microsoft.com/office/drawing/2016/5/13/chartex" xmlns:cx8="http://schemas.microsoft.com/office/drawing/2016/5/14/chartex" xmlns:mc="http://schemas.openxmlformats.org/markup-compatibility/2006" xmlns:aink="http://schemas.microsoft.com/office/drawing/2016/ink" xmlns:am3d="http://schemas.microsoft.com/office/drawing/2017/model3d" xmlns:o="urn:schemas-microsoft-com:office:office" xmlns:oel="http://schemas.microsoft.com/office/2019/extlst" xmlns:r="http://schemas.openxmlformats.org/officeDocument/2006/relationships" xmlns:m="http://schemas.openxmlformats.org/officeDocument/2006/math" xmlns:v="urn:schemas-microsoft-com:vml" xmlns:wp14="http://schemas.microsoft.com/office/word/2010/wordprocessingDrawing" xmlns:wp="http://schemas.openxmlformats.org/drawingml/2006/wordprocessingDrawing" xmlns:w10="urn:schemas-microsoft-com:office:word" xmlns:w="http://schemas.openxmlformats.org/wordprocessingml/2006/main" xmlns:w14="http://schemas.microsoft.com/office/word/2010/wordml" xmlns:w15="http://schemas.microsoft.com/office/word/2012/wordml" xmlns:w16cex="http://schemas.microsoft.com/office/word/2018/wordml/cex" xmlns:w16cid="http://schemas.microsoft.com/office/word/2016/wordml/cid" xmlns:w16="http://schemas.microsoft.com/office/word/2018/wordml" xmlns:w16du="http://schemas.microsoft.com/office/word/2023/wordml/word16du" xmlns:w16sdtdh="http://schemas.microsoft.com/office/word/2020/wordml/sdtdatahash" xmlns:w16sdtfl="http://schemas.microsoft.com/office/word/2024/wordml/sdtformatlock" xmlns:w16se="http://schemas.microsoft.com/office/word/2015/wordml/symex" xmlns:wpg="http://schemas.microsoft.com/office/word/2010/wordprocessingGroup" xmlns:wpi="http://schemas.microsoft.com/office/word/2010/wordprocessingInk" xmlns:wne="http://schemas.microsoft.com/office/word/2006/wordml" xmlns:wps="http://schemas.microsoft.com/office/word/2010/wordprocessingShape" mc:Ignorable="w14 w15 w16se w16cid w16 w16cex w16sdtdh w16sdtfl w16du wp14">
+  <w15:commentEx w15:paraId="584552D9" w15:done="0"/>
+</w15:commentsEx>
+</file>
+
+<file path=word/commentsExtensible.xml><?xml version="1.0" encoding="utf-8"?>
+<w16cex:commentsExtensible xmlns:wpc="http://schemas.microsoft.com/office/word/2010/wordprocessingCanvas" xmlns:cx="http://schemas.microsoft.com/office/drawing/2014/chartex" xmlns:cx1="http://schemas.microsoft.com/office/drawing/2015/9/8/chartex" xmlns:cx2="http://schemas.microsoft.com/office/drawing/2015/10/21/chartex" xmlns:cx3="http://schemas.microsoft.com/office/drawing/2016/5/9/chartex" xmlns:cx4="http://schemas.microsoft.com/office/drawing/2016/5/10/chartex" xmlns:cx5="http://schemas.microsoft.com/office/drawing/2016/5/11/chartex" xmlns:cx6="http://schemas.microsoft.com/office/drawing/2016/5/12/chartex" xmlns:cx7="http://schemas.microsoft.com/office/drawing/2016/5/13/chartex" xmlns:cx8="http://schemas.microsoft.com/office/drawing/2016/5/14/chartex" xmlns:cr="http://schemas.microsoft.com/office/comments/2020/reactions" xmlns:mc="http://schemas.openxmlformats.org/markup-compatibility/2006" xmlns:aink="http://schemas.microsoft.com/office/drawing/2016/ink" xmlns:am3d="http://schemas.microsoft.com/office/drawing/2017/model3d" xmlns:o="urn:schemas-microsoft-com:office:office" xmlns:oel="http://schemas.microsoft.com/office/2019/extlst" xmlns:r="http://schemas.openxmlformats.org/officeDocument/2006/relationships" xmlns:m="http://schemas.openxmlformats.org/officeDocument/2006/math" xmlns:v="urn:schemas-microsoft-com:vml" xmlns:wp14="http://schemas.microsoft.com/office/word/2010/wordprocessingDrawing" xmlns:wp="http://schemas.openxmlformats.org/drawingml/2006/wordprocessingDrawing" xmlns:w10="urn:schemas-microsoft-com:office:word" xmlns:w="http://schemas.openxmlformats.org/wordprocessingml/2006/main" xmlns:w14="http://schemas.microsoft.com/office/word/2010/wordml" xmlns:w15="http://schemas.microsoft.com/office/word/2012/wordml" xmlns:w16cex="http://schemas.microsoft.com/office/word/2018/wordml/cex" xmlns:w16cid="http://schemas.microsoft.com/office/word/2016/wordml/cid" xmlns:w16="http://schemas.microsoft.com/office/word/2018/wordml" xmlns:w16du="http://schemas.microsoft.com/office/word/2023/wordml/word16du" xmlns:w16sdtdh="http://schemas.microsoft.com/office/word/2020/wordml/sdtdatahash" xmlns:w16sdtfl="http://schemas.microsoft.com/office/word/2024/wordml/sdtformatlock" xmlns:w16se="http://schemas.microsoft.com/office/word/2015/wordml/symex" xmlns:wpg="http://schemas.microsoft.com/office/word/2010/wordprocessingGroup" xmlns:wpi="http://schemas.microsoft.com/office/word/2010/wordprocessingInk" xmlns:wne="http://schemas.microsoft.com/office/word/2006/wordml" xmlns:wps="http://schemas.microsoft.com/office/word/2010/wordprocessingShape" mc:Ignorable="w14 w15 w16se w16cid w16 w16cex w16sdtdh w16sdtfl cr w16du wp14">
+  <w16cex:commentExtensible w16cex:durableId="2408BD02" w16cex:dateUtc="2025-08-25T18:18:00Z"/>
+</w16cex:commentsExtensible>
+</file>
+
+<file path=word/commentsIds.xml><?xml version="1.0" encoding="utf-8"?>
+<w16cid:commentsIds xmlns:wpc="http://schemas.microsoft.com/office/word/2010/wordprocessingCanvas" xmlns:cx="http://schemas.microsoft.com/office/drawing/2014/chartex" xmlns:cx1="http://schemas.microsoft.com/office/drawing/2015/9/8/chartex" xmlns:cx2="http://schemas.microsoft.com/office/drawing/2015/10/21/chartex" xmlns:cx3="http://schemas.microsoft.com/office/drawing/2016/5/9/chartex" xmlns:cx4="http://schemas.microsoft.com/office/drawing/2016/5/10/chartex" xmlns:cx5="http://schemas.microsoft.com/office/drawing/2016/5/11/chartex" xmlns:cx6="http://schemas.microsoft.com/office/drawing/2016/5/12/chartex" xmlns:cx7="http://schemas.microsoft.com/office/drawing/2016/5/13/chartex" xmlns:cx8="http://schemas.microsoft.com/office/drawing/2016/5/14/chartex" xmlns:mc="http://schemas.openxmlformats.org/markup-compatibility/2006" xmlns:aink="http://schemas.microsoft.com/office/drawing/2016/ink" xmlns:am3d="http://schemas.microsoft.com/office/drawing/2017/model3d" xmlns:o="urn:schemas-microsoft-com:office:office" xmlns:oel="http://schemas.microsoft.com/office/2019/extlst" xmlns:r="http://schemas.openxmlformats.org/officeDocument/2006/relationships" xmlns:m="http://schemas.openxmlformats.org/officeDocument/2006/math" xmlns:v="urn:schemas-microsoft-com:vml" xmlns:wp14="http://schemas.microsoft.com/office/word/2010/wordprocessingDrawing" xmlns:wp="http://schemas.openxmlformats.org/drawingml/2006/wordprocessingDrawing" xmlns:w10="urn:schemas-microsoft-com:office:word" xmlns:w="http://schemas.openxmlformats.org/wordprocessingml/2006/main" xmlns:w14="http://schemas.microsoft.com/office/word/2010/wordml" xmlns:w15="http://schemas.microsoft.com/office/word/2012/wordml" xmlns:w16cex="http://schemas.microsoft.com/office/word/2018/wordml/cex" xmlns:w16cid="http://schemas.microsoft.com/office/word/2016/wordml/cid" xmlns:w16="http://schemas.microsoft.com/office/word/2018/wordml" xmlns:w16du="http://schemas.microsoft.com/office/word/2023/wordml/word16du" xmlns:w16sdtdh="http://schemas.microsoft.com/office/word/2020/wordml/sdtdatahash" xmlns:w16sdtfl="http://schemas.microsoft.com/office/word/2024/wordml/sdtformatlock" xmlns:w16se="http://schemas.microsoft.com/office/word/2015/wordml/symex" xmlns:wpg="http://schemas.microsoft.com/office/word/2010/wordprocessingGroup" xmlns:wpi="http://schemas.microsoft.com/office/word/2010/wordprocessingInk" xmlns:wne="http://schemas.microsoft.com/office/word/2006/wordml" xmlns:wps="http://schemas.microsoft.com/office/word/2010/wordprocessingShape" mc:Ignorable="w14 w15 w16se w16cid w16 w16cex w16sdtdh w16sdtfl w16du wp14">
+  <w16cid:commentId w16cid:paraId="584552D9" w16cid:durableId="2408BD02"/>
+</w16cid:commentsIds>
+</file>
+
+<file path=word/endnotes.xml><?xml version="1.0" encoding="utf-8"?>
+<w:endnotes xmlns:wpc="http://schemas.microsoft.com/office/word/2010/wordprocessingCanvas" xmlns:cx="http://schemas.microsoft.com/office/drawing/2014/chartex" xmlns:cx1="http://schemas.microsoft.com/office/drawing/2015/9/8/chartex" xmlns:cx2="http://schemas.microsoft.com/office/drawing/2015/10/21/chartex" xmlns:cx3="http://schemas.microsoft.com/office/drawing/2016/5/9/chartex" xmlns:cx4="http://schemas.microsoft.com/office/drawing/2016/5/10/chartex" xmlns:cx5="http://schemas.microsoft.com/office/drawing/2016/5/11/chartex" xmlns:cx6="http://schemas.microsoft.com/office/drawing/2016/5/12/chartex" xmlns:cx7="http://schemas.microsoft.com/office/drawing/2016/5/13/chartex" xmlns:cx8="http://schemas.microsoft.com/office/drawing/2016/5/14/chartex" xmlns:mc="http://schemas.openxmlformats.org/markup-compatibility/2006" xmlns:aink="http://schemas.microsoft.com/office/drawing/2016/ink" xmlns:am3d="http://schemas.microsoft.com/office/drawing/2017/model3d" xmlns:o="urn:schemas-microsoft-com:office:office" xmlns:oel="http://schemas.microsoft.com/office/2019/extlst" xmlns:r="http://schemas.openxmlformats.org/officeDocument/2006/relationships" xmlns:m="http://schemas.openxmlformats.org/officeDocument/2006/math" xmlns:v="urn:schemas-microsoft-com:vml" xmlns:wp14="http://schemas.microsoft.com/office/word/2010/wordprocessingDrawing" xmlns:wp="http://schemas.openxmlformats.org/drawingml/2006/wordprocessingDrawing" xmlns:w10="urn:schemas-microsoft-com:office:word" xmlns:w="http://schemas.openxmlformats.org/wordprocessingml/2006/main" xmlns:w14="http://schemas.microsoft.com/office/word/2010/wordml" xmlns:w15="http://schemas.microsoft.com/office/word/2012/wordml" xmlns:w16cex="http://schemas.microsoft.com/office/word/2018/wordml/cex" xmlns:w16cid="http://schemas.microsoft.com/office/word/2016/wordml/cid" xmlns:w16="http://schemas.microsoft.com/office/word/2018/wordml" xmlns:w16du="http://schemas.microsoft.com/office/word/2023/wordml/word16du" xmlns:w16sdtdh="http://schemas.microsoft.com/office/word/2020/wordml/sdtdatahash" xmlns:w16sdtfl="http://schemas.microsoft.com/office/word/2024/wordml/sdtformatlock" xmlns:w16se="http://schemas.microsoft.com/office/word/2015/wordml/symex" xmlns:wpg="http://schemas.microsoft.com/office/word/2010/wordprocessingGroup" xmlns:wpi="http://schemas.microsoft.com/office/word/2010/wordprocessingInk" xmlns:wne="http://schemas.microsoft.com/office/word/2006/wordml" xmlns:wps="http://schemas.microsoft.com/office/word/2010/wordprocessingShape" mc:Ignorable="w14 w15 w16se w16cid w16 w16cex w16sdtdh w16sdtfl w16du wp14">
+  <w:endnote w:type="separator" w:id="-1">
+    <w:p>
+      <w:pPr>
+        <w:spacing w:after="0" w:line="240" w:lineRule="auto"/>
+      </w:pPr>
+      <w:r>
+        <w:separator/>
+      </w:r>
+    </w:p>
+  </w:endnote>
+  <w:endnote w:type="continuationSeparator" w:id="0">
+    <w:p>
+      <w:pPr>
+        <w:spacing w:after="0" w:line="240" w:lineRule="auto"/>
+      </w:pPr>
+      <w:r>
+        <w:continuationSeparator/>
+      </w:r>
+    </w:p>
+  </w:endnote>
+</w:endnotes>
+</file>
+
+<file path=word/footer1.xml><?xml version="1.0" encoding="utf-8"?>
+<w:ftr xmlns:wpc="http://schemas.microsoft.com/office/word/2010/wordprocessingCanvas" xmlns:cx="http://schemas.microsoft.com/office/drawing/2014/chartex" xmlns:cx1="http://schemas.microsoft.com/office/drawing/2015/9/8/chartex" xmlns:cx2="http://schemas.microsoft.com/office/drawing/2015/10/21/chartex" xmlns:cx3="http://schemas.microsoft.com/office/drawing/2016/5/9/chartex" xmlns:cx4="http://schemas.microsoft.com/office/drawing/2016/5/10/chartex" xmlns:cx5="http://schemas.microsoft.com/office/drawing/2016/5/11/chartex" xmlns:cx6="http://schemas.microsoft.com/office/drawing/2016/5/12/chartex" xmlns:cx7="http://schemas.microsoft.com/office/drawing/2016/5/13/chartex" xmlns:cx8="http://schemas.microsoft.com/office/drawing/2016/5/14/chartex" xmlns:mc="http://schemas.openxmlformats.org/markup-compatibility/2006" xmlns:aink="http://schemas.microsoft.com/office/drawing/2016/ink" xmlns:am3d="http://schemas.microsoft.com/office/drawing/2017/model3d" xmlns:o="urn:schemas-microsoft-com:office:office" xmlns:oel="http://schemas.microsoft.com/office/2019/extlst" xmlns:r="http://schemas.openxmlformats.org/officeDocument/2006/relationships" xmlns:m="http://schemas.openxmlformats.org/officeDocument/2006/math" xmlns:v="urn:schemas-microsoft-com:vml" xmlns:wp14="http://schemas.microsoft.com/office/word/2010/wordprocessingDrawing" xmlns:wp="http://schemas.openxmlformats.org/drawingml/2006/wordprocessingDrawing" xmlns:w10="urn:schemas-microsoft-com:office:word" xmlns:w="http://schemas.openxmlformats.org/wordprocessingml/2006/main" xmlns:w14="http://schemas.microsoft.com/office/word/2010/wordml" xmlns:w15="http://schemas.microsoft.com/office/word/2012/wordml" xmlns:w16cex="http://schemas.microsoft.com/office/word/2018/wordml/cex" xmlns:w16cid="http://schemas.microsoft.com/office/word/2016/wordml/cid" xmlns:w16="http://schemas.microsoft.com/office/word/2018/wordml" xmlns:w16du="http://schemas.microsoft.com/office/word/2023/wordml/word16du" xmlns:w16sdtdh="http://schemas.microsoft.com/office/word/2020/wordml/sdtdatahash" xmlns:w16sdtfl="http://schemas.microsoft.com/office/word/2024/wordml/sdtformatlock" xmlns:w16se="http://schemas.microsoft.com/office/word/2015/wordml/symex" xmlns:wpg="http://schemas.microsoft.com/office/word/2010/wordprocessingGroup" xmlns:wpi="http://schemas.microsoft.com/office/word/2010/wordprocessingInk" xmlns:wne="http://schemas.microsoft.com/office/word/2006/wordml" xmlns:wps="http://schemas.microsoft.com/office/word/2010/wordprocessingShape" mc:Ignorable="w14 w15 w16se w16cid w16 w16cex w16sdtdh w16sdtfl w16du wp14">
+  <w:sdt>
+    <w:sdtPr>
+      <w:id w:val="-331222851"/>
+      <w:docPartObj>
+        <w:docPartGallery w:val="Page Numbers (Bottom of Page)"/>
+        <w:docPartUnique/>
+      </w:docPartObj>
+    </w:sdtPr>
+    <w:sdtContent>
+      <w:p>
+        <w:pPr>
+          <w:pStyle w:val="Piedepgina"/>
+          <w:jc w:val="center"/>
+        </w:pPr>
+        <w:r>
+          <w:rPr>
+            <w:noProof/>
+          </w:rPr>
+          <mc:AlternateContent>
+            <mc:Choice Requires="wps">
+              <w:drawing>
+                <wp:inline distT="0" distB="0" distL="0" distR="0" wp14:anchorId="490BE525" wp14:editId="08E7C46B">
+                  <wp:extent cx="5467350" cy="54610"/>
+                  <wp:effectExtent l="9525" t="19050" r="9525" b="12065"/>
+                  <wp:docPr id="1371835461" name="Diagrama de flujo: decisión 8"/>
+                  <wp:cNvGraphicFramePr>
+                    <a:graphicFrameLocks xmlns:a="http://schemas.openxmlformats.org/drawingml/2006/main"/>
+                  </wp:cNvGraphicFramePr>
+                  <a:graphic xmlns:a="http://schemas.openxmlformats.org/drawingml/2006/main">
+                    <a:graphicData uri="http://schemas.microsoft.com/office/word/2010/wordprocessingShape">
+                      <wps:wsp>
+                        <wps:cNvSpPr>
+                          <a:spLocks noChangeArrowheads="1"/>
+                        </wps:cNvSpPr>
+                        <wps:spPr bwMode="auto">
+                          <a:xfrm>
+                            <a:off x="0" y="0"/>
+                            <a:ext cx="5467350" cy="54610"/>
+                          </a:xfrm>
+                          <a:prstGeom prst="flowChartDecision">
+                            <a:avLst/>
+                          </a:prstGeom>
+                          <a:solidFill>
+                            <a:srgbClr val="000000"/>
+                          </a:solidFill>
+                          <a:ln w="9525">
+                            <a:solidFill>
+                              <a:srgbClr val="000000"/>
+                            </a:solidFill>
+                            <a:miter lim="800000"/>
+                            <a:headEnd/>
+                            <a:tailEnd/>
+                          </a:ln>
+                        </wps:spPr>
+                        <wps:bodyPr rot="0" vert="horz" wrap="square" lIns="91440" tIns="45720" rIns="91440" bIns="45720" anchor="t" anchorCtr="0" upright="1">
+                          <a:noAutofit/>
+                        </wps:bodyPr>
+                      </wps:wsp>
+                    </a:graphicData>
+                  </a:graphic>
+                </wp:inline>
+              </w:drawing>
+            </mc:Choice>
+            <mc:Fallback>
+              <w:pict>
+                <v:shapetype w14:anchorId="49B86EEC" id="_x0000_t110" coordsize="21600,21600" o:spt="110" path="m10800,l,10800,10800,21600,21600,10800xe">
+                  <v:stroke joinstyle="miter"/>
+                  <v:path gradientshapeok="t" o:connecttype="rect" textboxrect="5400,5400,16200,16200"/>
+                </v:shapetype>
+                <v:shape id="Diagrama de flujo: decisión 8" o:spid="_x0000_s1026" type="#_x0000_t110" style="width:430.5pt;height:4.3pt;visibility:visible;mso-wrap-style:square;mso-left-percent:-10001;mso-top-percent:-10001;mso-position-horizontal:absolute;mso-position-horizontal-relative:char;mso-position-vertical:absolute;mso-position-vertical-relative:line;mso-left-percent:-10001;mso-top-percent:-10001;v-text-anchor:top" o:gfxdata="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" fillcolor="black">
+                  <w10:anchorlock/>
+                </v:shape>
+              </w:pict>
+            </mc:Fallback>
+          </mc:AlternateContent>
+        </w:r>
+      </w:p>
+      <w:p>
+        <w:pPr>
+          <w:pStyle w:val="Piedepgina"/>
+          <w:jc w:val="center"/>
+        </w:pPr>
+        <w:r>
+          <w:fldChar w:fldCharType="begin"/>
+        </w:r>
+        <w:r>
+          <w:instrText>PAGE    \* MERGEFORMAT</w:instrText>
+        </w:r>
+        <w:r>
+          <w:fldChar w:fldCharType="separate"/>
+        </w:r>
+        <w:r>
+          <w:t>2</w:t>
+        </w:r>
+        <w:r>
+          <w:fldChar w:fldCharType="end"/>
+        </w:r>
+      </w:p>
+    </w:sdtContent>
+  </w:sdt>
+  <w:p>
+    <w:pPr>
+      <w:pStyle w:val="Piedepgina"/>
+    </w:pPr>
+  </w:p>
+</w:ftr>
+</file>
+
+<file path=word/footer2.xml><?xml version="1.0" encoding="utf-8"?>
+<w:ftr xmlns:wpc="http://schemas.microsoft.com/office/word/2010/wordprocessingCanvas" xmlns:cx="http://schemas.microsoft.com/office/drawing/2014/chartex" xmlns:cx1="http://schemas.microsoft.com/office/drawing/2015/9/8/chartex" xmlns:cx2="http://schemas.microsoft.com/office/drawing/2015/10/21/chartex" xmlns:cx3="http://schemas.microsoft.com/office/drawing/2016/5/9/chartex" xmlns:cx4="http://schemas.microsoft.com/office/drawing/2016/5/10/chartex" xmlns:cx5="http://schemas.microsoft.com/office/drawing/2016/5/11/chartex" xmlns:cx6="http://schemas.microsoft.com/office/drawing/2016/5/12/chartex" xmlns:cx7="http://schemas.microsoft.com/office/drawing/2016/5/13/chartex" xmlns:cx8="http://schemas.microsoft.com/office/drawing/2016/5/14/chartex" xmlns:mc="http://schemas.openxmlformats.org/markup-compatibility/2006" xmlns:aink="http://schemas.microsoft.com/office/drawing/2016/ink" xmlns:am3d="http://schemas.microsoft.com/office/drawing/2017/model3d" xmlns:o="urn:schemas-microsoft-com:office:office" xmlns:oel="http://schemas.microsoft.com/office/2019/extlst" xmlns:r="http://schemas.openxmlformats.org/officeDocument/2006/relationships" xmlns:m="http://schemas.openxmlformats.org/officeDocument/2006/math" xmlns:v="urn:schemas-microsoft-com:vml" xmlns:wp14="http://schemas.microsoft.com/office/word/2010/wordprocessingDrawing" xmlns:wp="http://schemas.openxmlformats.org/drawingml/2006/wordprocessingDrawing" xmlns:w10="urn:schemas-microsoft-com:office:word" xmlns:w="http://schemas.openxmlformats.org/wordprocessingml/2006/main" xmlns:w14="http://schemas.microsoft.com/office/word/2010/wordml" xmlns:w15="http://schemas.microsoft.com/office/word/2012/wordml" xmlns:w16cex="http://schemas.microsoft.com/office/word/2018/wordml/cex" xmlns:w16cid="http://schemas.microsoft.com/office/word/2016/wordml/cid" xmlns:w16="http://schemas.microsoft.com/office/word/2018/wordml" xmlns:w16du="http://schemas.microsoft.com/office/word/2023/wordml/word16du" xmlns:w16sdtdh="http://schemas.microsoft.com/office/word/2020/wordml/sdtdatahash" xmlns:w16sdtfl="http://schemas.microsoft.com/office/word/2024/wordml/sdtformatlock" xmlns:w16se="http://schemas.microsoft.com/office/word/2015/wordml/symex" xmlns:wpg="http://schemas.microsoft.com/office/word/2010/wordprocessingGroup" xmlns:wpi="http://schemas.microsoft.com/office/word/2010/wordprocessingInk" xmlns:wne="http://schemas.microsoft.com/office/word/2006/wordml" xmlns:wps="http://schemas.microsoft.com/office/word/2010/wordprocessingShape" mc:Ignorable="w14 w15 w16se w16cid w16 w16cex w16sdtdh w16sdtfl w16du wp14">
+  <w:sdt>
+    <w:sdtPr>
+      <w:id w:val="-1638254306"/>
+      <w:docPartObj>
+        <w:docPartGallery w:val="Page Numbers (Bottom of Page)"/>
+        <w:docPartUnique/>
+      </w:docPartObj>
+    </w:sdtPr>
+    <w:sdtContent>
+      <w:p>
+        <w:pPr>
+          <w:pStyle w:val="Piedepgina"/>
+          <w:jc w:val="center"/>
+        </w:pPr>
+      </w:p>
+      <w:p>
+        <w:pPr>
+          <w:pStyle w:val="Piedepgina"/>
+          <w:jc w:val="center"/>
+        </w:pPr>
+        <w:r>
+          <w:fldChar w:fldCharType="begin"/>
+        </w:r>
+        <w:r>
+          <w:instrText>PAGE    \* MERGEFORMAT</w:instrText>
+        </w:r>
+        <w:r>
+          <w:fldChar w:fldCharType="separate"/>
+        </w:r>
+        <w:r>
+          <w:t>2</w:t>
+        </w:r>
+        <w:r>
+          <w:fldChar w:fldCharType="end"/>
+        </w:r>
+      </w:p>
+    </w:sdtContent>
+  </w:sdt>
+  <w:p>
+    <w:pPr>
+      <w:pStyle w:val="Piedepgina"/>
+    </w:pPr>
+  </w:p>
+</w:ftr>
+</file>
+
+<file path=word/footer3.xml><?xml version="1.0" encoding="utf-8"?>
+<w:ftr xmlns:wpc="http://schemas.microsoft.com/office/word/2010/wordprocessingCanvas" xmlns:cx="http://schemas.microsoft.com/office/drawing/2014/chartex" xmlns:cx1="http://schemas.microsoft.com/office/drawing/2015/9/8/chartex" xmlns:cx2="http://schemas.microsoft.com/office/drawing/2015/10/21/chartex" xmlns:cx3="http://schemas.microsoft.com/office/drawing/2016/5/9/chartex" xmlns:cx4="http://schemas.microsoft.com/office/drawing/2016/5/10/chartex" xmlns:cx5="http://schemas.microsoft.com/office/drawing/2016/5/11/chartex" xmlns:cx6="http://schemas.microsoft.com/office/drawing/2016/5/12/chartex" xmlns:cx7="http://schemas.microsoft.com/office/drawing/2016/5/13/chartex" xmlns:cx8="http://schemas.microsoft.com/office/drawing/2016/5/14/chartex" xmlns:mc="http://schemas.openxmlformats.org/markup-compatibility/2006" xmlns:aink="http://schemas.microsoft.com/office/drawing/2016/ink" xmlns:am3d="http://schemas.microsoft.com/office/drawing/2017/model3d" xmlns:o="urn:schemas-microsoft-com:office:office" xmlns:oel="http://schemas.microsoft.com/office/2019/extlst" xmlns:r="http://schemas.openxmlformats.org/officeDocument/2006/relationships" xmlns:m="http://schemas.openxmlformats.org/officeDocument/2006/math" xmlns:v="urn:schemas-microsoft-com:vml" xmlns:wp14="http://schemas.microsoft.com/office/word/2010/wordprocessingDrawing" xmlns:wp="http://schemas.openxmlformats.org/drawingml/2006/wordprocessingDrawing" xmlns:w10="urn:schemas-microsoft-com:office:word" xmlns:w="http://schemas.openxmlformats.org/wordprocessingml/2006/main" xmlns:w14="http://schemas.microsoft.com/office/word/2010/wordml" xmlns:w15="http://schemas.microsoft.com/office/word/2012/wordml" xmlns:w16cex="http://schemas.microsoft.com/office/word/2018/wordml/cex" xmlns:w16cid="http://schemas.microsoft.com/office/word/2016/wordml/cid" xmlns:w16="http://schemas.microsoft.com/office/word/2018/wordml" xmlns:w16du="http://schemas.microsoft.com/office/word/2023/wordml/word16du" xmlns:w16sdtdh="http://schemas.microsoft.com/office/word/2020/wordml/sdtdatahash" xmlns:w16sdtfl="http://schemas.microsoft.com/office/word/2024/wordml/sdtformatlock" xmlns:w16se="http://schemas.microsoft.com/office/word/2015/wordml/symex" xmlns:wpg="http://schemas.microsoft.com/office/word/2010/wordprocessingGroup" xmlns:wpi="http://schemas.microsoft.com/office/word/2010/wordprocessingInk" xmlns:wne="http://schemas.microsoft.com/office/word/2006/wordml" xmlns:wps="http://schemas.microsoft.com/office/word/2010/wordprocessingShape" mc:Ignorable="w14 w15 w16se w16cid w16 w16cex w16sdtdh w16sdtfl w16du wp14">
+  <w:sdt>
+    <w:sdtPr>
+      <w:id w:val="2008482688"/>
+      <w:docPartObj>
+        <w:docPartGallery w:val="Page Numbers (Bottom of Page)"/>
+        <w:docPartUnique/>
+      </w:docPartObj>
+    </w:sdtPr>
+    <w:sdtContent>
+      <w:p>
+        <w:pPr>
+          <w:pStyle w:val="Piedepgina"/>
+          <w:jc w:val="center"/>
+        </w:pPr>
+        <w:r>
+          <w:rPr>
+            <w:noProof/>
+          </w:rPr>
+          <mc:AlternateContent>
+            <mc:Choice Requires="wps">
+              <w:drawing>
+                <wp:inline distT="0" distB="0" distL="0" distR="0" wp14:anchorId="1B42FEB3" wp14:editId="7431DC03">
+                  <wp:extent cx="5467350" cy="54610"/>
+                  <wp:effectExtent l="9525" t="19050" r="9525" b="12065"/>
+                  <wp:docPr id="1546904217" name="Diagrama de flujo: decisión 9"/>
+                  <wp:cNvGraphicFramePr>
+                    <a:graphicFrameLocks xmlns:a="http://schemas.openxmlformats.org/drawingml/2006/main"/>
+                  </wp:cNvGraphicFramePr>
+                  <a:graphic xmlns:a="http://schemas.openxmlformats.org/drawingml/2006/main">
+                    <a:graphicData uri="http://schemas.microsoft.com/office/word/2010/wordprocessingShape">
+                      <wps:wsp>
+                        <wps:cNvSpPr>
+                          <a:spLocks noChangeArrowheads="1"/>
+                        </wps:cNvSpPr>
+                        <wps:spPr bwMode="auto">
+                          <a:xfrm>
+                            <a:off x="0" y="0"/>
+                            <a:ext cx="5467350" cy="54610"/>
+                          </a:xfrm>
+                          <a:prstGeom prst="flowChartDecision">
+                            <a:avLst/>
+                          </a:prstGeom>
+                          <a:solidFill>
+                            <a:srgbClr val="000000"/>
+                          </a:solidFill>
+                          <a:ln w="9525">
+                            <a:solidFill>
+                              <a:srgbClr val="000000"/>
+                            </a:solidFill>
+                            <a:miter lim="800000"/>
+                            <a:headEnd/>
+                            <a:tailEnd/>
+                          </a:ln>
+                        </wps:spPr>
+                        <wps:bodyPr rot="0" vert="horz" wrap="square" lIns="91440" tIns="45720" rIns="91440" bIns="45720" anchor="t" anchorCtr="0" upright="1">
+                          <a:noAutofit/>
+                        </wps:bodyPr>
+                      </wps:wsp>
+                    </a:graphicData>
+                  </a:graphic>
+                </wp:inline>
+              </w:drawing>
+            </mc:Choice>
+            <mc:Fallback>
+              <w:pict>
+                <v:shapetype w14:anchorId="246E28F0" id="_x0000_t110" coordsize="21600,21600" o:spt="110" path="m10800,l,10800,10800,21600,21600,10800xe">
+                  <v:stroke joinstyle="miter"/>
+                  <v:path gradientshapeok="t" o:connecttype="rect" textboxrect="5400,5400,16200,16200"/>
+                </v:shapetype>
+                <v:shape id="Diagrama de flujo: decisión 9" o:spid="_x0000_s1026" type="#_x0000_t110" style="width:430.5pt;height:4.3pt;visibility:visible;mso-wrap-style:square;mso-left-percent:-10001;mso-top-percent:-10001;mso-position-horizontal:absolute;mso-position-horizontal-relative:char;mso-position-vertical:absolute;mso-position-vertical-relative:line;mso-left-percent:-10001;mso-top-percent:-10001;v-text-anchor:top" o:gfxdata="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" fillcolor="black">
+                  <w10:anchorlock/>
+                </v:shape>
+              </w:pict>
+            </mc:Fallback>
+          </mc:AlternateContent>
+        </w:r>
+      </w:p>
+      <w:p>
+        <w:pPr>
+          <w:pStyle w:val="Piedepgina"/>
+          <w:jc w:val="center"/>
+        </w:pPr>
+        <w:r>
+          <w:fldChar w:fldCharType="begin"/>
+        </w:r>
+        <w:r>
+          <w:instrText>PAGE    \* MERGEFORMAT</w:instrText>
+        </w:r>
+        <w:r>
+          <w:fldChar w:fldCharType="separate"/>
+        </w:r>
+        <w:r>
+          <w:t>2</w:t>
+        </w:r>
+        <w:r>
+          <w:fldChar w:fldCharType="end"/>
+        </w:r>
+      </w:p>
+    </w:sdtContent>
+  </w:sdt>
+  <w:p>
+    <w:pPr>
+      <w:pStyle w:val="Piedepgina"/>
+    </w:pPr>
+  </w:p>
+</w:ftr>
+</file>
+
+<file path=word/footnotes.xml><?xml version="1.0" encoding="utf-8"?>
+<w:footnotes xmlns:wpc="http://schemas.microsoft.com/office/word/2010/wordprocessingCanvas" xmlns:cx="http://schemas.microsoft.com/office/drawing/2014/chartex" xmlns:cx1="http://schemas.microsoft.com/office/drawing/2015/9/8/chartex" xmlns:cx2="http://schemas.microsoft.com/office/drawing/2015/10/21/chartex" xmlns:cx3="http://schemas.microsoft.com/office/drawing/2016/5/9/chartex" xmlns:cx4="http://schemas.microsoft.com/office/drawing/2016/5/10/chartex" xmlns:cx5="http://schemas.microsoft.com/office/drawing/2016/5/11/chartex" xmlns:cx6="http://schemas.microsoft.com/office/drawing/2016/5/12/chartex" xmlns:cx7="http://schemas.microsoft.com/office/drawing/2016/5/13/chartex" xmlns:cx8="http://schemas.microsoft.com/office/drawing/2016/5/14/chartex" xmlns:mc="http://schemas.openxmlformats.org/markup-compatibility/2006" xmlns:aink="http://schemas.microsoft.com/office/drawing/2016/ink" xmlns:am3d="http://schemas.microsoft.com/office/drawing/2017/model3d" xmlns:o="urn:schemas-microsoft-com:office:office" xmlns:oel="http://schemas.microsoft.com/office/2019/extlst" xmlns:r="http://schemas.openxmlformats.org/officeDocument/2006/relationships" xmlns:m="http://schemas.openxmlformats.org/officeDocument/2006/math" xmlns:v="urn:schemas-microsoft-com:vml" xmlns:wp14="http://schemas.microsoft.com/office/word/2010/wordprocessingDrawing" xmlns:wp="http://schemas.openxmlformats.org/drawingml/2006/wordprocessingDrawing" xmlns:w10="urn:schemas-microsoft-com:office:word" xmlns:w="http://schemas.openxmlformats.org/wordprocessingml/2006/main" xmlns:w14="http://schemas.microsoft.com/office/word/2010/wordml" xmlns:w15="http://schemas.microsoft.com/office/word/2012/wordml" xmlns:w16cex="http://schemas.microsoft.com/office/word/2018/wordml/cex" xmlns:w16cid="http://schemas.microsoft.com/office/word/2016/wordml/cid" xmlns:w16="http://schemas.microsoft.com/office/word/2018/wordml" xmlns:w16du="http://schemas.microsoft.com/office/word/2023/wordml/word16du" xmlns:w16sdtdh="http://schemas.microsoft.com/office/word/2020/wordml/sdtdatahash" xmlns:w16sdtfl="http://schemas.microsoft.com/office/word/2024/wordml/sdtformatlock" xmlns:w16se="http://schemas.microsoft.com/office/word/2015/wordml/symex" xmlns:wpg="http://schemas.microsoft.com/office/word/2010/wordprocessingGroup" xmlns:wpi="http://schemas.microsoft.com/office/word/2010/wordprocessingInk" xmlns:wne="http://schemas.microsoft.com/office/word/2006/wordml" xmlns:wps="http://schemas.microsoft.com/office/word/2010/wordprocessingShape" mc:Ignorable="w14 w15 w16se w16cid w16 w16cex w16sdtdh w16sdtfl w16du wp14">
+  <w:footnote w:type="separator" w:id="-1">
+    <w:p>
+      <w:pPr>
+        <w:spacing w:after="0" w:line="240" w:lineRule="auto"/>
+      </w:pPr>
+      <w:r>
+        <w:separator/>
+      </w:r>
+    </w:p>
+  </w:footnote>
+  <w:footnote w:type="continuationSeparator" w:id="0">
+    <w:p>
+      <w:pPr>
+        <w:spacing w:after="0" w:line="240" w:lineRule="auto"/>
+      </w:pPr>
+      <w:r>
+        <w:continuationSeparator/>
+      </w:r>
+    </w:p>
+  </w:footnote>
+  <w:footnote w:id="1">
+    <w:p>
+      <w:pPr>
+        <w:pStyle w:val="Textonotapie"/>
+        <w:rPr>
+          <w:lang w:val="en-US"/>
+        </w:rPr>
+      </w:pPr>
+      <w:r>
+        <w:rPr>
+          <w:rStyle w:val="Refdenotaalpie"/>
+        </w:rPr>
+        <w:footnoteRef/>
+      </w:r>
+      <w:r>
+        <w:rPr>
+          <w:lang w:val="en-US"/>
+        </w:rPr>
+        <w:t xml:space="preserve"> Structures/avl.rs</w:t>
+      </w:r>
+    </w:p>
+  </w:footnote>
+  <w:footnote w:id="2">
+    <w:p>
+      <w:pPr>
+        <w:pStyle w:val="Textonotapie"/>
+        <w:rPr>
+          <w:lang w:val="en-US"/>
+        </w:rPr>
+      </w:pPr>
+      <w:r>
+        <w:rPr>
+          <w:rStyle w:val="Refdenotaalpie"/>
+        </w:rPr>
+        <w:footnoteRef/>
+      </w:r>
+      <w:r>
+        <w:rPr>
+          <w:lang w:val="en-US"/>
+        </w:rPr>
+        <w:t xml:space="preserve"> Structures/stack.rs</w:t>
+      </w:r>
+    </w:p>
+  </w:footnote>
+  <w:footnote w:id="3">
+    <w:p>
+      <w:pPr>
+        <w:pStyle w:val="Textonotapie"/>
+        <w:rPr>
+          <w:lang w:val="en-US"/>
+        </w:rPr>
+      </w:pPr>
+      <w:r>
+        <w:rPr>
+          <w:rStyle w:val="Refdenotaalpie"/>
+        </w:rPr>
+        <w:footnoteRef/>
+      </w:r>
+      <w:r>
+        <w:rPr>
+          <w:lang w:val="en-US"/>
+        </w:rPr>
+        <w:t xml:space="preserve"> Structures/abb.rs</w:t>
+      </w:r>
+    </w:p>
+  </w:footnote>
+  <w:footnote w:id="4">
+    <w:p>
+      <w:pPr>
+        <w:pStyle w:val="Textonotapie"/>
+        <w:rPr>
+          <w:lang w:val="en-US"/>
+        </w:rPr>
+      </w:pPr>
+      <w:r>
+        <w:rPr>
+          <w:rStyle w:val="Refdenotaalpie"/>
+        </w:rPr>
+        <w:footnoteRef/>
+      </w:r>
+      <w:r>
+        <w:rPr>
+          <w:lang w:val="en-US"/>
+        </w:rPr>
+        <w:t xml:space="preserve"> </w:t>
+      </w:r>
+      <w:r>
+        <w:rPr>
+          <w:lang w:val="en-US"/>
+        </w:rPr>
+        <w:t>Structures/avl.rs</w:t>
+      </w:r>
+    </w:p>
+  </w:footnote>
+  <w:footnote w:id="5">
+    <w:p>
+      <w:pPr>
+        <w:pStyle w:val="Textonotapie"/>
+        <w:rPr>
+          <w:lang w:val="en-US"/>
+        </w:rPr>
+      </w:pPr>
+      <w:r>
+        <w:rPr>
+          <w:rStyle w:val="Refdenotaalpie"/>
+        </w:rPr>
+        <w:footnoteRef/>
+      </w:r>
+      <w:r>
+        <w:rPr>
+          <w:lang w:val="en-US"/>
+        </w:rPr>
+        <w:t xml:space="preserve"> gxhash-main/benches/throughput_criterion.rs</w:t>
+      </w:r>
+    </w:p>
+  </w:footnote>
+  <w:footnote w:id="6">
+    <w:p>
+      <w:pPr>
+        <w:pStyle w:val="Textonotapie"/>
+        <w:rPr>
+          <w:lang w:val="en-US"/>
+        </w:rPr>
+      </w:pPr>
+      <w:r>
+        <w:rPr>
+          <w:rStyle w:val="Refdenotaalpie"/>
+        </w:rPr>
+        <w:footnoteRef/>
+      </w:r>
+      <w:r>
+        <w:rPr>
+          <w:lang w:val="en-US"/>
+        </w:rPr>
+        <w:t xml:space="preserve"> hyper-master/src/ffi/http_types.r</w:t>
+      </w:r>
+      <w:r>
+        <w:rPr>
+          <w:lang w:val="en-US"/>
+        </w:rPr>
+        <w:t>s</w:t>
+      </w:r>
+      <w:r>
+        <w:rPr>
+          <w:lang w:val="en-US"/>
+        </w:rPr>
+        <w:t xml:space="preserve"> </w:t>
+      </w:r>
+    </w:p>
+  </w:footnote>
+  <w:footnote w:id="7">
+    <w:p>
+      <w:pPr>
+        <w:pStyle w:val="Textonotapie"/>
+        <w:rPr>
+          <w:lang w:val="en-US"/>
+        </w:rPr>
+      </w:pPr>
+      <w:r>
+        <w:rPr>
+          <w:rStyle w:val="Refdenotaalpie"/>
+        </w:rPr>
+        <w:footnoteRef/>
+      </w:r>
+      <w:r>
+        <w:rPr>
+          <w:lang w:val="en-US"/>
+        </w:rPr>
+        <w:t xml:space="preserve"> lucet-main/lucet-concurrency-tests/src/killswitch.rs</w:t>
+      </w:r>
+    </w:p>
+  </w:footnote>
+  <w:footnote w:id="8">
+    <w:p>
+      <w:pPr>
+        <w:pStyle w:val="Textonotapie"/>
+        <w:rPr>
+          <w:lang w:val="en-US"/>
+        </w:rPr>
+      </w:pPr>
+      <w:r>
+        <w:rPr>
+          <w:rStyle w:val="Refdenotaalpie"/>
+        </w:rPr>
+        <w:footnoteRef/>
+      </w:r>
+      <w:r>
+        <w:rPr>
+          <w:lang w:val="en-US"/>
+        </w:rPr>
+        <w:t xml:space="preserve"> hyper-master/src/rt/io.rs</w:t>
+      </w:r>
+    </w:p>
+  </w:footnote>
+</w:footnotes>
+</file>
+
+<file path=word/header1.xml><?xml version="1.0" encoding="utf-8"?>
+<w:hdr xmlns:wpc="http://schemas.microsoft.com/office/word/2010/wordprocessingCanvas" xmlns:cx="http://schemas.microsoft.com/office/drawing/2014/chartex" xmlns:cx1="http://schemas.microsoft.com/office/drawing/2015/9/8/chartex" xmlns:cx2="http://schemas.microsoft.com/office/drawing/2015/10/21/chartex" xmlns:cx3="http://schemas.microsoft.com/office/drawing/2016/5/9/chartex" xmlns:cx4="http://schemas.microsoft.com/office/drawing/2016/5/10/chartex" xmlns:cx5="http://schemas.microsoft.com/office/drawing/2016/5/11/chartex" xmlns:cx6="http://schemas.microsoft.com/office/drawing/2016/5/12/chartex" xmlns:cx7="http://schemas.microsoft.com/office/drawing/2016/5/13/chartex" xmlns:cx8="http://schemas.microsoft.com/office/drawing/2016/5/14/chartex" xmlns:mc="http://schemas.openxmlformats.org/markup-compatibility/2006" xmlns:aink="http://schemas.microsoft.com/office/drawing/2016/ink" xmlns:am3d="http://schemas.microsoft.com/office/drawing/2017/model3d" xmlns:o="urn:schemas-microsoft-com:office:office" xmlns:oel="http://schemas.microsoft.com/office/2019/extlst" xmlns:r="http://schemas.openxmlformats.org/officeDocument/2006/relationships" xmlns:m="http://schemas.openxmlformats.org/officeDocument/2006/math" xmlns:v="urn:schemas-microsoft-com:vml" xmlns:wp14="http://schemas.microsoft.com/office/word/2010/wordprocessingDrawing" xmlns:wp="http://schemas.openxmlformats.org/drawingml/2006/wordprocessingDrawing" xmlns:w10="urn:schemas-microsoft-com:office:word" xmlns:w="http://schemas.openxmlformats.org/wordprocessingml/2006/main" xmlns:w14="http://schemas.microsoft.com/office/word/2010/wordml" xmlns:w15="http://schemas.microsoft.com/office/word/2012/wordml" xmlns:w16cex="http://schemas.microsoft.com/office/word/2018/wordml/cex" xmlns:w16cid="http://schemas.microsoft.com/office/word/2016/wordml/cid" xmlns:w16="http://schemas.microsoft.com/office/word/2018/wordml" xmlns:w16du="http://schemas.microsoft.com/office/word/2023/wordml/word16du" xmlns:w16sdtdh="http://schemas.microsoft.com/office/word/2020/wordml/sdtdatahash" xmlns:w16sdtfl="http://schemas.microsoft.com/office/word/2024/wordml/sdtformatlock" xmlns:w16se="http://schemas.microsoft.com/office/word/2015/wordml/symex" xmlns:wpg="http://schemas.microsoft.com/office/word/2010/wordprocessingGroup" xmlns:wpi="http://schemas.microsoft.com/office/word/2010/wordprocessingInk" xmlns:wne="http://schemas.microsoft.com/office/word/2006/wordml" xmlns:wps="http://schemas.microsoft.com/office/word/2010/wordprocessingShape" mc:Ignorable="w14 w15 w16se w16cid w16 w16cex w16sdtdh w16sdtfl w16du wp14">
+  <w:p>
+    <w:pPr>
+      <w:pStyle w:val="Encabezado"/>
+    </w:pPr>
+    <w:r>
+      <w:rPr>
+        <w:noProof/>
+      </w:rPr>
+      <w:drawing>
+        <wp:anchor distT="0" distB="0" distL="114300" distR="114300" simplePos="0" relativeHeight="251658240" behindDoc="1" locked="0" layoutInCell="1" allowOverlap="1" wp14:anchorId="1563DB6A" wp14:editId="7BBB78E4">
+          <wp:simplePos x="0" y="0"/>
+          <wp:positionH relativeFrom="column">
+            <wp:posOffset>34925</wp:posOffset>
+          </wp:positionH>
+          <wp:positionV relativeFrom="page">
+            <wp:posOffset>1417955</wp:posOffset>
+          </wp:positionV>
+          <wp:extent cx="5759450" cy="5759450"/>
+          <wp:effectExtent l="0" t="0" r="0" b="0"/>
+          <wp:wrapNone/>
+          <wp:docPr id="1760418027" name="Imagen 3"/>
+          <wp:cNvGraphicFramePr>
+            <a:graphicFrameLocks xmlns:a="http://schemas.openxmlformats.org/drawingml/2006/main" noChangeAspect="1"/>
+          </wp:cNvGraphicFramePr>
+          <a:graphic xmlns:a="http://schemas.openxmlformats.org/drawingml/2006/main">
+            <a:graphicData uri="http://schemas.openxmlformats.org/drawingml/2006/picture">
+              <pic:pic xmlns:pic="http://schemas.openxmlformats.org/drawingml/2006/picture">
+                <pic:nvPicPr>
+                  <pic:cNvPr id="1760418027" name="Imagen 1760418027"/>
+                  <pic:cNvPicPr/>
+                </pic:nvPicPr>
+                <pic:blipFill>
+                  <a:blip r:embed="rId1">
+                    <a:alphaModFix amt="69000"/>
+                    <a:extLst>
+                      <a:ext uri="{BEBA8EAE-BF5A-486C-A8C5-ECC9F3942E4B}">
+                        <a14:imgProps xmlns:a14="http://schemas.microsoft.com/office/drawing/2010/main">
+                          <a14:imgLayer r:embed="rId2">
+                            <a14:imgEffect>
+                              <a14:brightnessContrast bright="-52000"/>
+                            </a14:imgEffect>
+                          </a14:imgLayer>
+                        </a14:imgProps>
+                      </a:ext>
+                      <a:ext uri="{28A0092B-C50C-407E-A947-70E740481C1C}">
+                        <a14:useLocalDpi xmlns:a14="http://schemas.microsoft.com/office/drawing/2010/main" val="0"/>
+                      </a:ext>
+                    </a:extLst>
+                  </a:blip>
+                  <a:stretch>
+                    <a:fillRect/>
+                  </a:stretch>
+                </pic:blipFill>
+                <pic:spPr>
+                  <a:xfrm>
+                    <a:off x="0" y="0"/>
+                    <a:ext cx="5759450" cy="5759450"/>
+                  </a:xfrm>
+                  <a:prstGeom prst="rect">
+                    <a:avLst/>
+                  </a:prstGeom>
+                </pic:spPr>
+              </pic:pic>
+            </a:graphicData>
+          </a:graphic>
+        </wp:anchor>
+      </w:drawing>
+    </w:r>
+  </w:p>
+</w:hdr>
+</file>
+
+<file path=word/header2.xml><?xml version="1.0" encoding="utf-8"?>
+<w:hdr xmlns:wpc="http://schemas.microsoft.com/office/word/2010/wordprocessingCanvas" xmlns:cx="http://schemas.microsoft.com/office/drawing/2014/chartex" xmlns:cx1="http://schemas.microsoft.com/office/drawing/2015/9/8/chartex" xmlns:cx2="http://schemas.microsoft.com/office/drawing/2015/10/21/chartex" xmlns:cx3="http://schemas.microsoft.com/office/drawing/2016/5/9/chartex" xmlns:cx4="http://schemas.microsoft.com/office/drawing/2016/5/10/chartex" xmlns:cx5="http://schemas.microsoft.com/office/drawing/2016/5/11/chartex" xmlns:cx6="http://schemas.microsoft.com/office/drawing/2016/5/12/chartex" xmlns:cx7="http://schemas.microsoft.com/office/drawing/2016/5/13/chartex" xmlns:cx8="http://schemas.microsoft.com/office/drawing/2016/5/14/chartex" xmlns:mc="http://schemas.openxmlformats.org/markup-compatibility/2006" xmlns:aink="http://schemas.microsoft.com/office/drawing/2016/ink" xmlns:am3d="http://schemas.microsoft.com/office/drawing/2017/model3d" xmlns:o="urn:schemas-microsoft-com:office:office" xmlns:oel="http://schemas.microsoft.com/office/2019/extlst" xmlns:r="http://schemas.openxmlformats.org/officeDocument/2006/relationships" xmlns:m="http://schemas.openxmlformats.org/officeDocument/2006/math" xmlns:v="urn:schemas-microsoft-com:vml" xmlns:wp14="http://schemas.microsoft.com/office/word/2010/wordprocessingDrawing" xmlns:wp="http://schemas.openxmlformats.org/drawingml/2006/wordprocessingDrawing" xmlns:w10="urn:schemas-microsoft-com:office:word" xmlns:w="http://schemas.openxmlformats.org/wordprocessingml/2006/main" xmlns:w14="http://schemas.microsoft.com/office/word/2010/wordml" xmlns:w15="http://schemas.microsoft.com/office/word/2012/wordml" xmlns:w16cex="http://schemas.microsoft.com/office/word/2018/wordml/cex" xmlns:w16cid="http://schemas.microsoft.com/office/word/2016/wordml/cid" xmlns:w16="http://schemas.microsoft.com/office/word/2018/wordml" xmlns:w16du="http://schemas.microsoft.com/office/word/2023/wordml/word16du" xmlns:w16sdtdh="http://schemas.microsoft.com/office/word/2020/wordml/sdtdatahash" xmlns:w16sdtfl="http://schemas.microsoft.com/office/word/2024/wordml/sdtformatlock" xmlns:w16se="http://schemas.microsoft.com/office/word/2015/wordml/symex" xmlns:wpg="http://schemas.microsoft.com/office/word/2010/wordprocessingGroup" xmlns:wpi="http://schemas.microsoft.com/office/word/2010/wordprocessingInk" xmlns:wne="http://schemas.microsoft.com/office/word/2006/wordml" xmlns:wps="http://schemas.microsoft.com/office/word/2010/wordprocessingShape" mc:Ignorable="w14 w15 w16se w16cid w16 w16cex w16sdtdh w16sdtfl w16du wp14">
+  <w:p>
+    <w:pPr>
+      <w:pStyle w:val="Encabezado"/>
+    </w:pPr>
+  </w:p>
+</w:hdr>
+</file>
+
+<file path=word/header3.xml><?xml version="1.0" encoding="utf-8"?>
+<w:hdr xmlns:wpc="http://schemas.microsoft.com/office/word/2010/wordprocessingCanvas" xmlns:cx="http://schemas.microsoft.com/office/drawing/2014/chartex" xmlns:cx1="http://schemas.microsoft.com/office/drawing/2015/9/8/chartex" xmlns:cx2="http://schemas.microsoft.com/office/drawing/2015/10/21/chartex" xmlns:cx3="http://schemas.microsoft.com/office/drawing/2016/5/9/chartex" xmlns:cx4="http://schemas.microsoft.com/office/drawing/2016/5/10/chartex" xmlns:cx5="http://schemas.microsoft.com/office/drawing/2016/5/11/chartex" xmlns:cx6="http://schemas.microsoft.com/office/drawing/2016/5/12/chartex" xmlns:cx7="http://schemas.microsoft.com/office/drawing/2016/5/13/chartex" xmlns:cx8="http://schemas.microsoft.com/office/drawing/2016/5/14/chartex" xmlns:mc="http://schemas.openxmlformats.org/markup-compatibility/2006" xmlns:aink="http://schemas.microsoft.com/office/drawing/2016/ink" xmlns:am3d="http://schemas.microsoft.com/office/drawing/2017/model3d" xmlns:o="urn:schemas-microsoft-com:office:office" xmlns:oel="http://schemas.microsoft.com/office/2019/extlst" xmlns:r="http://schemas.openxmlformats.org/officeDocument/2006/relationships" xmlns:m="http://schemas.openxmlformats.org/officeDocument/2006/math" xmlns:v="urn:schemas-microsoft-com:vml" xmlns:wp14="http://schemas.microsoft.com/office/word/2010/wordprocessingDrawing" xmlns:wp="http://schemas.openxmlformats.org/drawingml/2006/wordprocessingDrawing" xmlns:w10="urn:schemas-microsoft-com:office:word" xmlns:w="http://schemas.openxmlformats.org/wordprocessingml/2006/main" xmlns:w14="http://schemas.microsoft.com/office/word/2010/wordml" xmlns:w15="http://schemas.microsoft.com/office/word/2012/wordml" xmlns:w16cex="http://schemas.microsoft.com/office/word/2018/wordml/cex" xmlns:w16cid="http://schemas.microsoft.com/office/word/2016/wordml/cid" xmlns:w16="http://schemas.microsoft.com/office/word/2018/wordml" xmlns:w16du="http://schemas.microsoft.com/office/word/2023/wordml/word16du" xmlns:w16sdtdh="http://schemas.microsoft.com/office/word/2020/wordml/sdtdatahash" xmlns:w16sdtfl="http://schemas.microsoft.com/office/word/2024/wordml/sdtformatlock" xmlns:w16se="http://schemas.microsoft.com/office/word/2015/wordml/symex" xmlns:wpg="http://schemas.microsoft.com/office/word/2010/wordprocessingGroup" xmlns:wpi="http://schemas.microsoft.com/office/word/2010/wordprocessingInk" xmlns:wne="http://schemas.microsoft.com/office/word/2006/wordml" xmlns:wps="http://schemas.microsoft.com/office/word/2010/wordprocessingShape" mc:Ignorable="w14 w15 w16se w16cid w16 w16cex w16sdtdh w16sdtfl w16du wp14">
+  <w:p>
+    <w:pPr>
+      <w:pStyle w:val="Encabezado"/>
+    </w:pPr>
+  </w:p>
+</w:hdr>
+</file>
+
+<file path=word/header4.xml><?xml version="1.0" encoding="utf-8"?>
+<w:hdr xmlns:wpc="http://schemas.microsoft.com/office/word/2010/wordprocessingCanvas" xmlns:cx="http://schemas.microsoft.com/office/drawing/2014/chartex" xmlns:cx1="http://schemas.microsoft.com/office/drawing/2015/9/8/chartex" xmlns:cx2="http://schemas.microsoft.com/office/drawing/2015/10/21/chartex" xmlns:cx3="http://schemas.microsoft.com/office/drawing/2016/5/9/chartex" xmlns:cx4="http://schemas.microsoft.com/office/drawing/2016/5/10/chartex" xmlns:cx5="http://schemas.microsoft.com/office/drawing/2016/5/11/chartex" xmlns:cx6="http://schemas.microsoft.com/office/drawing/2016/5/12/chartex" xmlns:cx7="http://schemas.microsoft.com/office/drawing/2016/5/13/chartex" xmlns:cx8="http://schemas.microsoft.com/office/drawing/2016/5/14/chartex" xmlns:mc="http://schemas.openxmlformats.org/markup-compatibility/2006" xmlns:aink="http://schemas.microsoft.com/office/drawing/2016/ink" xmlns:am3d="http://schemas.microsoft.com/office/drawing/2017/model3d" xmlns:o="urn:schemas-microsoft-com:office:office" xmlns:oel="http://schemas.microsoft.com/office/2019/extlst" xmlns:r="http://schemas.openxmlformats.org/officeDocument/2006/relationships" xmlns:m="http://schemas.openxmlformats.org/officeDocument/2006/math" xmlns:v="urn:schemas-microsoft-com:vml" xmlns:wp14="http://schemas.microsoft.com/office/word/2010/wordprocessingDrawing" xmlns:wp="http://schemas.openxmlformats.org/drawingml/2006/wordprocessingDrawing" xmlns:w10="urn:schemas-microsoft-com:office:word" xmlns:w="http://schemas.openxmlformats.org/wordprocessingml/2006/main" xmlns:w14="http://schemas.microsoft.com/office/word/2010/wordml" xmlns:w15="http://schemas.microsoft.com/office/word/2012/wordml" xmlns:w16cex="http://schemas.microsoft.com/office/word/2018/wordml/cex" xmlns:w16cid="http://schemas.microsoft.com/office/word/2016/wordml/cid" xmlns:w16="http://schemas.microsoft.com/office/word/2018/wordml" xmlns:w16du="http://schemas.microsoft.com/office/word/2023/wordml/word16du" xmlns:w16sdtdh="http://schemas.microsoft.com/office/word/2020/wordml/sdtdatahash" xmlns:w16sdtfl="http://schemas.microsoft.com/office/word/2024/wordml/sdtformatlock" xmlns:w16se="http://schemas.microsoft.com/office/word/2015/wordml/symex" xmlns:wpg="http://schemas.microsoft.com/office/word/2010/wordprocessingGroup" xmlns:wpi="http://schemas.microsoft.com/office/word/2010/wordprocessingInk" xmlns:wne="http://schemas.microsoft.com/office/word/2006/wordml" xmlns:wps="http://schemas.microsoft.com/office/word/2010/wordprocessingShape" mc:Ignorable="w14 w15 w16se w16cid w16 w16cex w16sdtdh w16sdtfl w16du wp14">
+  <w:p>
+    <w:pPr>
+      <w:pStyle w:val="Encabezado"/>
+    </w:pPr>
+  </w:p>
+</w:hdr>
+</file>
+
+<file path=word/people.xml><?xml version="1.0" encoding="utf-8"?>
+<w15:people xmlns:wpc="http://schemas.microsoft.com/office/word/2010/wordprocessingCanvas" xmlns:cx="http://schemas.microsoft.com/office/drawing/2014/chartex" xmlns:cx1="http://schemas.microsoft.com/office/drawing/2015/9/8/chartex" xmlns:cx2="http://schemas.microsoft.com/office/drawing/2015/10/21/chartex" xmlns:cx3="http://schemas.microsoft.com/office/drawing/2016/5/9/chartex" xmlns:cx4="http://schemas.microsoft.com/office/drawing/2016/5/10/chartex" xmlns:cx5="http://schemas.microsoft.com/office/drawing/2016/5/11/chartex" xmlns:cx6="http://schemas.microsoft.com/office/drawing/2016/5/12/chartex" xmlns:cx7="http://schemas.microsoft.com/office/drawing/2016/5/13/chartex" xmlns:cx8="http://schemas.microsoft.com/office/drawing/2016/5/14/chartex" xmlns:mc="http://schemas.openxmlformats.org/markup-compatibility/2006" xmlns:aink="http://schemas.microsoft.com/office/drawing/2016/ink" xmlns:am3d="http://schemas.microsoft.com/office/drawing/2017/model3d" xmlns:o="urn:schemas-microsoft-com:office:office" xmlns:oel="http://schemas.microsoft.com/office/2019/extlst" xmlns:r="http://schemas.openxmlformats.org/officeDocument/2006/relationships" xmlns:m="http://schemas.openxmlformats.org/officeDocument/2006/math" xmlns:v="urn:schemas-microsoft-com:vml" xmlns:wp14="http://schemas.microsoft.com/office/word/2010/wordprocessingDrawing" xmlns:wp="http://schemas.openxmlformats.org/drawingml/2006/wordprocessingDrawing" xmlns:w10="urn:schemas-microsoft-com:office:word" xmlns:w="http://schemas.openxmlformats.org/wordprocessingml/2006/main" xmlns:w14="http://schemas.microsoft.com/office/word/2010/wordml" xmlns:w15="http://schemas.microsoft.com/office/word/2012/wordml" xmlns:w16cex="http://schemas.microsoft.com/office/word/2018/wordml/cex" xmlns:w16cid="http://schemas.microsoft.com/office/word/2016/wordml/cid" xmlns:w16="http://schemas.microsoft.com/office/word/2018/wordml" xmlns:w16du="http://schemas.microsoft.com/office/word/2023/wordml/word16du" xmlns:w16sdtdh="http://schemas.microsoft.com/office/word/2020/wordml/sdtdatahash" xmlns:w16sdtfl="http://schemas.microsoft.com/office/word/2024/wordml/sdtformatlock" xmlns:w16se="http://schemas.microsoft.com/office/word/2015/wordml/symex" xmlns:wpg="http://schemas.microsoft.com/office/word/2010/wordprocessingGroup" xmlns:wpi="http://schemas.microsoft.com/office/word/2010/wordprocessingInk" xmlns:wne="http://schemas.microsoft.com/office/word/2006/wordml" xmlns:wps="http://schemas.microsoft.com/office/word/2010/wordprocessingShape" mc:Ignorable="w14 w15 w16se w16cid w16 w16cex w16sdtdh w16sdtfl w16du wp14">
+  <w15:person w15:author="Uri Guzman">
+    <w15:presenceInfo w15:providerId="Windows Live" w15:userId="ac60f084db8538cd"/>
+  </w15:person>
+</w15:people>
 </file>
 
 <file path=word/styles.xml><?xml version="1.0" encoding="utf-8"?>
@@ -991,6 +4649,7 @@
   <w:style w:type="paragraph" w:default="1" w:styleId="Normal">
     <w:name w:val="Normal"/>
     <w:qFormat/>
+    <w:rsid w:val="003D461E"/>
   </w:style>
   <w:style w:type="paragraph" w:styleId="Ttulo1">
     <w:name w:val="heading 1"/>
@@ -1019,7 +4678,6 @@
     <w:next w:val="Normal"/>
     <w:link w:val="Ttulo2Car"/>
     <w:uiPriority w:val="9"/>
-    <w:semiHidden/>
     <w:unhideWhenUsed/>
     <w:qFormat/>
     <w:rsid w:val="006E54A8"/>
@@ -1042,7 +4700,6 @@
     <w:next w:val="Normal"/>
     <w:link w:val="Ttulo3Car"/>
     <w:uiPriority w:val="9"/>
-    <w:semiHidden/>
     <w:unhideWhenUsed/>
     <w:qFormat/>
     <w:rsid w:val="006E54A8"/>
@@ -1236,7 +4893,6 @@
     <w:basedOn w:val="Fuentedeprrafopredeter"/>
     <w:link w:val="Ttulo2"/>
     <w:uiPriority w:val="9"/>
-    <w:semiHidden/>
     <w:rsid w:val="006E54A8"/>
     <w:rPr>
       <w:rFonts w:asciiTheme="majorHAnsi" w:eastAsiaTheme="majorEastAsia" w:hAnsiTheme="majorHAnsi" w:cstheme="majorBidi"/>
@@ -1250,7 +4906,6 @@
     <w:basedOn w:val="Fuentedeprrafopredeter"/>
     <w:link w:val="Ttulo3"/>
     <w:uiPriority w:val="9"/>
-    <w:semiHidden/>
     <w:rsid w:val="006E54A8"/>
     <w:rPr>
       <w:rFonts w:eastAsiaTheme="majorEastAsia" w:cstheme="majorBidi"/>
@@ -1537,6 +5192,312 @@
       <w14:ligatures w14:val="none"/>
     </w:rPr>
   </w:style>
+  <w:style w:type="paragraph" w:styleId="TtuloTDC">
+    <w:name w:val="TOC Heading"/>
+    <w:basedOn w:val="Ttulo1"/>
+    <w:next w:val="Normal"/>
+    <w:uiPriority w:val="39"/>
+    <w:unhideWhenUsed/>
+    <w:qFormat/>
+    <w:rsid w:val="00993936"/>
+    <w:pPr>
+      <w:spacing w:before="240" w:after="0"/>
+      <w:outlineLvl w:val="9"/>
+    </w:pPr>
+    <w:rPr>
+      <w:kern w:val="0"/>
+      <w:sz w:val="32"/>
+      <w:szCs w:val="32"/>
+      <w:lang w:eastAsia="es-MX"/>
+      <w14:ligatures w14:val="none"/>
+    </w:rPr>
+  </w:style>
+  <w:style w:type="paragraph" w:styleId="TDC2">
+    <w:name w:val="toc 2"/>
+    <w:basedOn w:val="Normal"/>
+    <w:next w:val="Normal"/>
+    <w:autoRedefine/>
+    <w:uiPriority w:val="39"/>
+    <w:unhideWhenUsed/>
+    <w:rsid w:val="00993936"/>
+    <w:pPr>
+      <w:spacing w:after="100"/>
+      <w:ind w:left="220"/>
+    </w:pPr>
+    <w:rPr>
+      <w:rFonts w:eastAsiaTheme="minorEastAsia" w:cs="Times New Roman"/>
+      <w:kern w:val="0"/>
+      <w:lang w:eastAsia="es-MX"/>
+      <w14:ligatures w14:val="none"/>
+    </w:rPr>
+  </w:style>
+  <w:style w:type="paragraph" w:styleId="TDC1">
+    <w:name w:val="toc 1"/>
+    <w:basedOn w:val="Normal"/>
+    <w:next w:val="Normal"/>
+    <w:autoRedefine/>
+    <w:uiPriority w:val="39"/>
+    <w:unhideWhenUsed/>
+    <w:rsid w:val="00993936"/>
+    <w:pPr>
+      <w:spacing w:after="100"/>
+    </w:pPr>
+    <w:rPr>
+      <w:rFonts w:eastAsiaTheme="minorEastAsia" w:cs="Times New Roman"/>
+      <w:kern w:val="0"/>
+      <w:lang w:eastAsia="es-MX"/>
+      <w14:ligatures w14:val="none"/>
+    </w:rPr>
+  </w:style>
+  <w:style w:type="paragraph" w:styleId="TDC3">
+    <w:name w:val="toc 3"/>
+    <w:basedOn w:val="Normal"/>
+    <w:next w:val="Normal"/>
+    <w:autoRedefine/>
+    <w:uiPriority w:val="39"/>
+    <w:unhideWhenUsed/>
+    <w:rsid w:val="00993936"/>
+    <w:pPr>
+      <w:spacing w:after="100"/>
+      <w:ind w:left="440"/>
+    </w:pPr>
+    <w:rPr>
+      <w:rFonts w:eastAsiaTheme="minorEastAsia" w:cs="Times New Roman"/>
+      <w:kern w:val="0"/>
+      <w:lang w:eastAsia="es-MX"/>
+      <w14:ligatures w14:val="none"/>
+    </w:rPr>
+  </w:style>
+  <w:style w:type="character" w:styleId="Hipervnculo">
+    <w:name w:val="Hyperlink"/>
+    <w:basedOn w:val="Fuentedeprrafopredeter"/>
+    <w:uiPriority w:val="99"/>
+    <w:unhideWhenUsed/>
+    <w:rsid w:val="00981248"/>
+    <w:rPr>
+      <w:color w:val="0563C1" w:themeColor="hyperlink"/>
+      <w:u w:val="single"/>
+    </w:rPr>
+  </w:style>
+  <w:style w:type="table" w:styleId="Tablaconcuadrcula">
+    <w:name w:val="Table Grid"/>
+    <w:basedOn w:val="Tablanormal"/>
+    <w:uiPriority w:val="39"/>
+    <w:rsid w:val="00D35ECB"/>
+    <w:pPr>
+      <w:spacing w:after="0" w:line="240" w:lineRule="auto"/>
+    </w:pPr>
+    <w:tblPr>
+      <w:tblBorders>
+        <w:top w:val="single" w:sz="4" w:space="0" w:color="auto"/>
+        <w:left w:val="single" w:sz="4" w:space="0" w:color="auto"/>
+        <w:bottom w:val="single" w:sz="4" w:space="0" w:color="auto"/>
+        <w:right w:val="single" w:sz="4" w:space="0" w:color="auto"/>
+        <w:insideH w:val="single" w:sz="4" w:space="0" w:color="auto"/>
+        <w:insideV w:val="single" w:sz="4" w:space="0" w:color="auto"/>
+      </w:tblBorders>
+    </w:tblPr>
+  </w:style>
+  <w:style w:type="paragraph" w:styleId="Encabezado">
+    <w:name w:val="header"/>
+    <w:basedOn w:val="Normal"/>
+    <w:link w:val="EncabezadoCar"/>
+    <w:uiPriority w:val="99"/>
+    <w:unhideWhenUsed/>
+    <w:rsid w:val="00470915"/>
+    <w:pPr>
+      <w:tabs>
+        <w:tab w:val="center" w:pos="4419"/>
+        <w:tab w:val="right" w:pos="8838"/>
+      </w:tabs>
+      <w:spacing w:after="0" w:line="240" w:lineRule="auto"/>
+    </w:pPr>
+  </w:style>
+  <w:style w:type="character" w:customStyle="1" w:styleId="EncabezadoCar">
+    <w:name w:val="Encabezado Car"/>
+    <w:basedOn w:val="Fuentedeprrafopredeter"/>
+    <w:link w:val="Encabezado"/>
+    <w:uiPriority w:val="99"/>
+    <w:rsid w:val="00470915"/>
+  </w:style>
+  <w:style w:type="paragraph" w:styleId="Piedepgina">
+    <w:name w:val="footer"/>
+    <w:basedOn w:val="Normal"/>
+    <w:link w:val="PiedepginaCar"/>
+    <w:uiPriority w:val="99"/>
+    <w:unhideWhenUsed/>
+    <w:rsid w:val="00470915"/>
+    <w:pPr>
+      <w:tabs>
+        <w:tab w:val="center" w:pos="4419"/>
+        <w:tab w:val="right" w:pos="8838"/>
+      </w:tabs>
+      <w:spacing w:after="0" w:line="240" w:lineRule="auto"/>
+    </w:pPr>
+  </w:style>
+  <w:style w:type="character" w:customStyle="1" w:styleId="PiedepginaCar">
+    <w:name w:val="Pie de página Car"/>
+    <w:basedOn w:val="Fuentedeprrafopredeter"/>
+    <w:link w:val="Piedepgina"/>
+    <w:uiPriority w:val="99"/>
+    <w:rsid w:val="00470915"/>
+  </w:style>
+  <w:style w:type="character" w:styleId="nfasissutil">
+    <w:name w:val="Subtle Emphasis"/>
+    <w:basedOn w:val="Fuentedeprrafopredeter"/>
+    <w:uiPriority w:val="19"/>
+    <w:qFormat/>
+    <w:rsid w:val="00D42DE7"/>
+    <w:rPr>
+      <w:i/>
+      <w:iCs/>
+      <w:color w:val="404040" w:themeColor="text1" w:themeTint="BF"/>
+    </w:rPr>
+  </w:style>
+  <w:style w:type="paragraph" w:styleId="Textonotaalfinal">
+    <w:name w:val="endnote text"/>
+    <w:basedOn w:val="Normal"/>
+    <w:link w:val="TextonotaalfinalCar"/>
+    <w:uiPriority w:val="99"/>
+    <w:semiHidden/>
+    <w:unhideWhenUsed/>
+    <w:rsid w:val="003D657E"/>
+    <w:pPr>
+      <w:spacing w:after="0" w:line="240" w:lineRule="auto"/>
+    </w:pPr>
+    <w:rPr>
+      <w:sz w:val="20"/>
+      <w:szCs w:val="20"/>
+    </w:rPr>
+  </w:style>
+  <w:style w:type="character" w:customStyle="1" w:styleId="TextonotaalfinalCar">
+    <w:name w:val="Texto nota al final Car"/>
+    <w:basedOn w:val="Fuentedeprrafopredeter"/>
+    <w:link w:val="Textonotaalfinal"/>
+    <w:uiPriority w:val="99"/>
+    <w:semiHidden/>
+    <w:rsid w:val="003D657E"/>
+    <w:rPr>
+      <w:sz w:val="20"/>
+      <w:szCs w:val="20"/>
+    </w:rPr>
+  </w:style>
+  <w:style w:type="character" w:styleId="Refdenotaalfinal">
+    <w:name w:val="endnote reference"/>
+    <w:basedOn w:val="Fuentedeprrafopredeter"/>
+    <w:uiPriority w:val="99"/>
+    <w:semiHidden/>
+    <w:unhideWhenUsed/>
+    <w:rsid w:val="003D657E"/>
+    <w:rPr>
+      <w:vertAlign w:val="superscript"/>
+    </w:rPr>
+  </w:style>
+  <w:style w:type="paragraph" w:styleId="Textonotapie">
+    <w:name w:val="footnote text"/>
+    <w:basedOn w:val="Normal"/>
+    <w:link w:val="TextonotapieCar"/>
+    <w:uiPriority w:val="99"/>
+    <w:semiHidden/>
+    <w:unhideWhenUsed/>
+    <w:rsid w:val="003D657E"/>
+    <w:pPr>
+      <w:spacing w:after="0" w:line="240" w:lineRule="auto"/>
+    </w:pPr>
+    <w:rPr>
+      <w:sz w:val="20"/>
+      <w:szCs w:val="20"/>
+    </w:rPr>
+  </w:style>
+  <w:style w:type="character" w:customStyle="1" w:styleId="TextonotapieCar">
+    <w:name w:val="Texto nota pie Car"/>
+    <w:basedOn w:val="Fuentedeprrafopredeter"/>
+    <w:link w:val="Textonotapie"/>
+    <w:uiPriority w:val="99"/>
+    <w:semiHidden/>
+    <w:rsid w:val="003D657E"/>
+    <w:rPr>
+      <w:sz w:val="20"/>
+      <w:szCs w:val="20"/>
+    </w:rPr>
+  </w:style>
+  <w:style w:type="character" w:styleId="Refdenotaalpie">
+    <w:name w:val="footnote reference"/>
+    <w:basedOn w:val="Fuentedeprrafopredeter"/>
+    <w:uiPriority w:val="99"/>
+    <w:semiHidden/>
+    <w:unhideWhenUsed/>
+    <w:rsid w:val="003D657E"/>
+    <w:rPr>
+      <w:vertAlign w:val="superscript"/>
+    </w:rPr>
+  </w:style>
+  <w:style w:type="character" w:styleId="Refdecomentario">
+    <w:name w:val="annotation reference"/>
+    <w:basedOn w:val="Fuentedeprrafopredeter"/>
+    <w:uiPriority w:val="99"/>
+    <w:semiHidden/>
+    <w:unhideWhenUsed/>
+    <w:rsid w:val="00A0701C"/>
+    <w:rPr>
+      <w:sz w:val="16"/>
+      <w:szCs w:val="16"/>
+    </w:rPr>
+  </w:style>
+  <w:style w:type="paragraph" w:styleId="Textocomentario">
+    <w:name w:val="annotation text"/>
+    <w:basedOn w:val="Normal"/>
+    <w:link w:val="TextocomentarioCar"/>
+    <w:uiPriority w:val="99"/>
+    <w:unhideWhenUsed/>
+    <w:rsid w:val="00A0701C"/>
+    <w:pPr>
+      <w:spacing w:line="240" w:lineRule="auto"/>
+    </w:pPr>
+    <w:rPr>
+      <w:sz w:val="20"/>
+      <w:szCs w:val="20"/>
+    </w:rPr>
+  </w:style>
+  <w:style w:type="character" w:customStyle="1" w:styleId="TextocomentarioCar">
+    <w:name w:val="Texto comentario Car"/>
+    <w:basedOn w:val="Fuentedeprrafopredeter"/>
+    <w:link w:val="Textocomentario"/>
+    <w:uiPriority w:val="99"/>
+    <w:rsid w:val="00A0701C"/>
+    <w:rPr>
+      <w:sz w:val="20"/>
+      <w:szCs w:val="20"/>
+    </w:rPr>
+  </w:style>
+  <w:style w:type="paragraph" w:styleId="Asuntodelcomentario">
+    <w:name w:val="annotation subject"/>
+    <w:basedOn w:val="Textocomentario"/>
+    <w:next w:val="Textocomentario"/>
+    <w:link w:val="AsuntodelcomentarioCar"/>
+    <w:uiPriority w:val="99"/>
+    <w:semiHidden/>
+    <w:unhideWhenUsed/>
+    <w:rsid w:val="00A0701C"/>
+    <w:rPr>
+      <w:b/>
+      <w:bCs/>
+    </w:rPr>
+  </w:style>
+  <w:style w:type="character" w:customStyle="1" w:styleId="AsuntodelcomentarioCar">
+    <w:name w:val="Asunto del comentario Car"/>
+    <w:basedOn w:val="TextocomentarioCar"/>
+    <w:link w:val="Asuntodelcomentario"/>
+    <w:uiPriority w:val="99"/>
+    <w:semiHidden/>
+    <w:rsid w:val="00A0701C"/>
+    <w:rPr>
+      <w:b/>
+      <w:bCs/>
+      <w:sz w:val="20"/>
+      <w:szCs w:val="20"/>
+    </w:rPr>
+  </w:style>
 </w:styles>
 </file>
 
@@ -1661,8 +5622,17 @@
   </w:compat>
   <w:rsids>
     <w:rsidRoot w:val="0081647A"/>
+    <w:rsid w:val="000935D0"/>
+    <w:rsid w:val="00467099"/>
+    <w:rsid w:val="005260EB"/>
+    <w:rsid w:val="005A4148"/>
     <w:rsid w:val="0081647A"/>
+    <w:rsid w:val="008165EE"/>
+    <w:rsid w:val="00857D7C"/>
     <w:rsid w:val="008C7FF2"/>
+    <w:rsid w:val="00BA75DF"/>
+    <w:rsid w:val="00C352D1"/>
+    <w:rsid w:val="00C77E5E"/>
     <w:rsid w:val="00E73212"/>
   </w:rsids>
   <m:mathPr>
@@ -2425,4 +6395,16 @@
     </a:ext>
   </a:extLst>
 </a:theme>
+</file>
+
+<file path=customXml/item1.xml><?xml version="1.0" encoding="utf-8"?>
+<b:Sources xmlns:b="http://schemas.openxmlformats.org/officeDocument/2006/bibliography" xmlns="http://schemas.openxmlformats.org/officeDocument/2006/bibliography" SelectedStyle="\APASixthEditionOfficeOnline.xsl" StyleName="APA" Version="6"/>
+</file>
+
+<file path=customXml/itemProps1.xml><?xml version="1.0" encoding="utf-8"?>
+<ds:datastoreItem xmlns:ds="http://schemas.openxmlformats.org/officeDocument/2006/customXml" ds:itemID="{42DF21FA-A8C1-43EF-A9B6-7FC252CF958A}">
+  <ds:schemaRefs>
+    <ds:schemaRef ds:uri="http://schemas.openxmlformats.org/officeDocument/2006/bibliography"/>
+  </ds:schemaRefs>
+</ds:datastoreItem>
 </file>
</xml_diff>

<commit_message>
Actualización de la documentación sobre detección y reemplazo de código unsafe en Rust, incluyendo cambios en el índice y secciones para mayor claridad.
</commit_message>
<xml_diff>
--- a/Documentacion/Detection and Replace of Unsafe Code.docx
+++ b/Documentacion/Detection and Replace of Unsafe Code.docx
@@ -294,7 +294,7 @@
           <w:pPr>
             <w:pStyle w:val="Sinespaciado"/>
             <w:spacing w:line="360" w:lineRule="auto"/>
-            <w:jc w:val="center"/>
+            <w:jc w:val="right"/>
             <w:rPr>
               <w:rFonts w:ascii="Times New Roman" w:hAnsi="Times New Roman" w:cs="Times New Roman"/>
               <w:sz w:val="24"/>
@@ -322,7 +322,7 @@
               <w14:ligatures w14:val="standardContextual"/>
             </w:rPr>
             <w:drawing>
-              <wp:anchor distT="0" distB="0" distL="114300" distR="114300" simplePos="0" relativeHeight="251661312" behindDoc="0" locked="0" layoutInCell="1" allowOverlap="1" wp14:anchorId="2A3E0791" wp14:editId="1C3C036F">
+              <wp:anchor distT="0" distB="0" distL="114300" distR="114300" simplePos="0" relativeHeight="251661312" behindDoc="0" locked="0" layoutInCell="1" allowOverlap="1" wp14:anchorId="2A3E0791" wp14:editId="75E09292">
                 <wp:simplePos x="0" y="0"/>
                 <wp:positionH relativeFrom="column">
                   <wp:posOffset>3154045</wp:posOffset>
@@ -801,7 +801,25 @@
           <w:sz w:val="24"/>
           <w:szCs w:val="24"/>
         </w:rPr>
-        <w:t>el origen, el formato y posiblemente algún ejemplo de los usos mencionados, sin embargo, hay secciones que hacen referencia al material analizado, con lo cual para una mayor compresión, visitar dichos repositorios para comprender mejor el funcionamiento del código.</w:t>
+        <w:t xml:space="preserve">el origen, el formato y posiblemente algún ejemplo de los usos mencionados, sin embargo, hay secciones que hacen referencia al material analizado, con lo </w:t>
+      </w:r>
+      <w:proofErr w:type="gramStart"/>
+      <w:r>
+        <w:rPr>
+          <w:rFonts w:ascii="Times New Roman" w:hAnsi="Times New Roman" w:cs="Times New Roman"/>
+          <w:sz w:val="24"/>
+          <w:szCs w:val="24"/>
+        </w:rPr>
+        <w:t>cual</w:t>
+      </w:r>
+      <w:proofErr w:type="gramEnd"/>
+      <w:r>
+        <w:rPr>
+          <w:rFonts w:ascii="Times New Roman" w:hAnsi="Times New Roman" w:cs="Times New Roman"/>
+          <w:sz w:val="24"/>
+          <w:szCs w:val="24"/>
+        </w:rPr>
+        <w:t xml:space="preserve"> para una mayor compresión, visitar dichos repositorios para comprender mejor el funcionamiento del código.</w:t>
       </w:r>
     </w:p>
     <w:p>
@@ -1156,14 +1174,14 @@
           <w:r>
             <w:fldChar w:fldCharType="separate"/>
           </w:r>
-          <w:hyperlink w:anchor="_Toc207305890" w:history="1">
+          <w:hyperlink w:anchor="_Toc207456352" w:history="1">
             <w:r>
               <w:rPr>
                 <w:rStyle w:val="Hipervnculo"/>
                 <w:rFonts w:ascii="Times New Roman" w:hAnsi="Times New Roman"/>
                 <w:noProof/>
               </w:rPr>
-              <w:t>1. Introducción</w:t>
+              <w:t>1 Introducción</w:t>
             </w:r>
             <w:r>
               <w:rPr>
@@ -1184,7 +1202,7 @@
                 <w:noProof/>
                 <w:webHidden/>
               </w:rPr>
-              <w:instrText xml:space="preserve"> PAGEREF _Toc207305890 \h </w:instrText>
+              <w:instrText xml:space="preserve"> PAGEREF _Toc207456352 \h </w:instrText>
             </w:r>
             <w:r>
               <w:rPr>
@@ -1230,7 +1248,7 @@
               <w14:ligatures w14:val="standardContextual"/>
             </w:rPr>
           </w:pPr>
-          <w:hyperlink w:anchor="_Toc207305891" w:history="1">
+          <w:hyperlink w:anchor="_Toc207456353" w:history="1">
             <w:r>
               <w:rPr>
                 <w:rStyle w:val="Hipervnculo"/>
@@ -1258,7 +1276,7 @@
                 <w:noProof/>
                 <w:webHidden/>
               </w:rPr>
-              <w:instrText xml:space="preserve"> PAGEREF _Toc207305891 \h </w:instrText>
+              <w:instrText xml:space="preserve"> PAGEREF _Toc207456353 \h </w:instrText>
             </w:r>
             <w:r>
               <w:rPr>
@@ -1304,14 +1322,14 @@
               <w14:ligatures w14:val="standardContextual"/>
             </w:rPr>
           </w:pPr>
-          <w:hyperlink w:anchor="_Toc207305892" w:history="1">
+          <w:hyperlink w:anchor="_Toc207456354" w:history="1">
             <w:r>
               <w:rPr>
                 <w:rStyle w:val="Hipervnculo"/>
                 <w:rFonts w:ascii="Times New Roman" w:hAnsi="Times New Roman"/>
                 <w:noProof/>
               </w:rPr>
-              <w:t>1.2 Datos recolectados</w:t>
+              <w:t>1.2 Hipótesis</w:t>
             </w:r>
             <w:r>
               <w:rPr>
@@ -1332,7 +1350,7 @@
                 <w:noProof/>
                 <w:webHidden/>
               </w:rPr>
-              <w:instrText xml:space="preserve"> PAGEREF _Toc207305892 \h </w:instrText>
+              <w:instrText xml:space="preserve"> PAGEREF _Toc207456354 \h </w:instrText>
             </w:r>
             <w:r>
               <w:rPr>
@@ -1378,14 +1396,14 @@
               <w14:ligatures w14:val="standardContextual"/>
             </w:rPr>
           </w:pPr>
-          <w:hyperlink w:anchor="_Toc207305893" w:history="1">
+          <w:hyperlink w:anchor="_Toc207456355" w:history="1">
             <w:r>
               <w:rPr>
                 <w:rStyle w:val="Hipervnculo"/>
                 <w:rFonts w:ascii="Times New Roman" w:hAnsi="Times New Roman"/>
                 <w:noProof/>
               </w:rPr>
-              <w:t>1.3 Posibles reemplazos de código</w:t>
+              <w:t>1.n Datos recolectados</w:t>
             </w:r>
             <w:r>
               <w:rPr>
@@ -1406,7 +1424,7 @@
                 <w:noProof/>
                 <w:webHidden/>
               </w:rPr>
-              <w:instrText xml:space="preserve"> PAGEREF _Toc207305893 \h </w:instrText>
+              <w:instrText xml:space="preserve"> PAGEREF _Toc207456355 \h </w:instrText>
             </w:r>
             <w:r>
               <w:rPr>
@@ -1426,7 +1444,81 @@
                 <w:noProof/>
                 <w:webHidden/>
               </w:rPr>
-              <w:t>2</w:t>
+              <w:t>1</w:t>
+            </w:r>
+            <w:r>
+              <w:rPr>
+                <w:noProof/>
+                <w:webHidden/>
+              </w:rPr>
+              <w:fldChar w:fldCharType="end"/>
+            </w:r>
+          </w:hyperlink>
+        </w:p>
+        <w:p>
+          <w:pPr>
+            <w:pStyle w:val="TDC2"/>
+            <w:tabs>
+              <w:tab w:val="right" w:leader="dot" w:pos="9060"/>
+            </w:tabs>
+            <w:rPr>
+              <w:rFonts w:cstheme="minorBidi"/>
+              <w:noProof/>
+              <w:kern w:val="2"/>
+              <w:sz w:val="24"/>
+              <w:szCs w:val="24"/>
+              <w14:ligatures w14:val="standardContextual"/>
+            </w:rPr>
+          </w:pPr>
+          <w:hyperlink w:anchor="_Toc207456356" w:history="1">
+            <w:r>
+              <w:rPr>
+                <w:rStyle w:val="Hipervnculo"/>
+                <w:rFonts w:ascii="Times New Roman" w:hAnsi="Times New Roman"/>
+                <w:noProof/>
+              </w:rPr>
+              <w:t>1.n Posibles reemplazos de código</w:t>
+            </w:r>
+            <w:r>
+              <w:rPr>
+                <w:noProof/>
+                <w:webHidden/>
+              </w:rPr>
+              <w:tab/>
+            </w:r>
+            <w:r>
+              <w:rPr>
+                <w:noProof/>
+                <w:webHidden/>
+              </w:rPr>
+              <w:fldChar w:fldCharType="begin"/>
+            </w:r>
+            <w:r>
+              <w:rPr>
+                <w:noProof/>
+                <w:webHidden/>
+              </w:rPr>
+              <w:instrText xml:space="preserve"> PAGEREF _Toc207456356 \h </w:instrText>
+            </w:r>
+            <w:r>
+              <w:rPr>
+                <w:noProof/>
+                <w:webHidden/>
+              </w:rPr>
+            </w:r>
+            <w:r>
+              <w:rPr>
+                <w:noProof/>
+                <w:webHidden/>
+              </w:rPr>
+              <w:fldChar w:fldCharType="separate"/>
+            </w:r>
+            <w:r>
+              <w:rPr>
+                <w:noProof/>
+                <w:webHidden/>
+              </w:rPr>
+              <w:t>3</w:t>
             </w:r>
             <w:r>
               <w:rPr>
@@ -1452,7 +1544,7 @@
               <w14:ligatures w14:val="standardContextual"/>
             </w:rPr>
           </w:pPr>
-          <w:hyperlink w:anchor="_Toc207305894" w:history="1">
+          <w:hyperlink w:anchor="_Toc207456357" w:history="1">
             <w:r>
               <w:rPr>
                 <w:rStyle w:val="Hipervnculo"/>
@@ -1466,7 +1558,7 @@
                 <w:rFonts w:ascii="Times New Roman" w:hAnsi="Times New Roman"/>
                 <w:noProof/>
               </w:rPr>
-              <w:t>Posibles cambios para el código visto</w:t>
+              <w:t>Posibles cambios para el código analizado</w:t>
             </w:r>
             <w:r>
               <w:rPr>
@@ -1487,7 +1579,7 @@
                 <w:noProof/>
                 <w:webHidden/>
               </w:rPr>
-              <w:instrText xml:space="preserve"> PAGEREF _Toc207305894 \h </w:instrText>
+              <w:instrText xml:space="preserve"> PAGEREF _Toc207456357 \h </w:instrText>
             </w:r>
             <w:r>
               <w:rPr>
@@ -1507,7 +1599,7 @@
                 <w:noProof/>
                 <w:webHidden/>
               </w:rPr>
-              <w:t>2</w:t>
+              <w:t>3</w:t>
             </w:r>
             <w:r>
               <w:rPr>
@@ -1533,7 +1625,7 @@
               <w14:ligatures w14:val="standardContextual"/>
             </w:rPr>
           </w:pPr>
-          <w:hyperlink w:anchor="_Toc207305895" w:history="1">
+          <w:hyperlink w:anchor="_Toc207456358" w:history="1">
             <w:r>
               <w:rPr>
                 <w:rStyle w:val="Hipervnculo"/>
@@ -1561,7 +1653,7 @@
                 <w:noProof/>
                 <w:webHidden/>
               </w:rPr>
-              <w:instrText xml:space="preserve"> PAGEREF _Toc207305895 \h </w:instrText>
+              <w:instrText xml:space="preserve"> PAGEREF _Toc207456358 \h </w:instrText>
             </w:r>
             <w:r>
               <w:rPr>
@@ -1581,7 +1673,7 @@
                 <w:noProof/>
                 <w:webHidden/>
               </w:rPr>
-              <w:t>3</w:t>
+              <w:t>4</w:t>
             </w:r>
             <w:r>
               <w:rPr>
@@ -1699,35 +1791,28 @@
           <w:color w:val="000000" w:themeColor="text1"/>
         </w:rPr>
       </w:pPr>
-      <w:bookmarkStart w:id="1" w:name="_Toc207305890"/>
+      <w:bookmarkStart w:id="1" w:name="_Toc207456352"/>
       <w:r>
         <w:rPr>
           <w:rFonts w:ascii="Times New Roman" w:hAnsi="Times New Roman" w:cs="Times New Roman"/>
           <w:color w:val="000000" w:themeColor="text1"/>
         </w:rPr>
         <w:lastRenderedPageBreak/>
-        <w:t>1</w:t>
+        <w:t xml:space="preserve">1 </w:t>
       </w:r>
       <w:r>
         <w:rPr>
           <w:rFonts w:ascii="Times New Roman" w:hAnsi="Times New Roman" w:cs="Times New Roman"/>
           <w:color w:val="000000" w:themeColor="text1"/>
         </w:rPr>
-        <w:t>.</w:t>
+        <w:t>I</w:t>
       </w:r>
       <w:r>
         <w:rPr>
           <w:rFonts w:ascii="Times New Roman" w:hAnsi="Times New Roman" w:cs="Times New Roman"/>
           <w:color w:val="000000" w:themeColor="text1"/>
         </w:rPr>
-        <w:t xml:space="preserve"> </w:t>
-      </w:r>
-      <w:r>
-        <w:rPr>
-          <w:rFonts w:ascii="Times New Roman" w:hAnsi="Times New Roman" w:cs="Times New Roman"/>
-          <w:color w:val="000000" w:themeColor="text1"/>
-        </w:rPr>
-        <w:t>Introducción</w:t>
+        <w:t>ntroducción</w:t>
       </w:r>
       <w:bookmarkEnd w:id="1"/>
     </w:p>
@@ -1744,19 +1829,84 @@
     <w:p>
       <w:pPr>
         <w:spacing w:after="0" w:line="240" w:lineRule="auto"/>
-        <w:rPr>
-          <w:rFonts w:ascii="Times New Roman" w:hAnsi="Times New Roman" w:cs="Times New Roman"/>
-          <w:sz w:val="24"/>
-          <w:szCs w:val="24"/>
-        </w:rPr>
-      </w:pPr>
-      <w:r>
-        <w:rPr>
-          <w:rFonts w:ascii="Times New Roman" w:hAnsi="Times New Roman" w:cs="Times New Roman"/>
-          <w:sz w:val="24"/>
-          <w:szCs w:val="24"/>
-        </w:rPr>
-        <w:t>En un principio, todo programador que empieza a introducirse en la programación con el lenguaje rust.</w:t>
+        <w:ind w:left="708" w:hanging="708"/>
+        <w:rPr>
+          <w:rFonts w:ascii="Times New Roman" w:hAnsi="Times New Roman" w:cs="Times New Roman"/>
+          <w:sz w:val="24"/>
+          <w:szCs w:val="24"/>
+        </w:rPr>
+      </w:pPr>
+      <w:r>
+        <w:rPr>
+          <w:rFonts w:ascii="Times New Roman" w:hAnsi="Times New Roman" w:cs="Times New Roman"/>
+          <w:sz w:val="24"/>
+          <w:szCs w:val="24"/>
+        </w:rPr>
+        <w:t xml:space="preserve">En un principio, todo programador que empieza a </w:t>
+      </w:r>
+      <w:r>
+        <w:rPr>
+          <w:rFonts w:ascii="Times New Roman" w:hAnsi="Times New Roman" w:cs="Times New Roman"/>
+          <w:sz w:val="24"/>
+          <w:szCs w:val="24"/>
+        </w:rPr>
+        <w:t>programar con rust debería tener una leve noción acerca de los conceptos de punteros, referencias, acceso a memoria, entre otras, además de contar con la idea de dependencia entre elementos</w:t>
+      </w:r>
+      <w:r>
+        <w:rPr>
+          <w:rFonts w:ascii="Times New Roman" w:hAnsi="Times New Roman" w:cs="Times New Roman"/>
+          <w:sz w:val="24"/>
+          <w:szCs w:val="24"/>
+        </w:rPr>
+        <w:t xml:space="preserve"> (variables) y sus valores</w:t>
+      </w:r>
+      <w:r>
+        <w:rPr>
+          <w:rFonts w:ascii="Times New Roman" w:hAnsi="Times New Roman" w:cs="Times New Roman"/>
+          <w:sz w:val="24"/>
+          <w:szCs w:val="24"/>
+        </w:rPr>
+        <w:t xml:space="preserve">. Esto es necesario para poder trabajar </w:t>
+      </w:r>
+      <w:r>
+        <w:rPr>
+          <w:rFonts w:ascii="Times New Roman" w:hAnsi="Times New Roman" w:cs="Times New Roman"/>
+          <w:sz w:val="24"/>
+          <w:szCs w:val="24"/>
+        </w:rPr>
+        <w:t>con la noción de adueñamiento. A fines prácticos, considerando estos puntos todo programador que haya trabajado en C y haya leído algo sobre cómo trabaja rust, sabrá entender su comportamiento, sin embargo, lo óptimo seria que estos detalles no se vieran</w:t>
+      </w:r>
+      <w:r>
+        <w:rPr>
+          <w:rFonts w:ascii="Times New Roman" w:hAnsi="Times New Roman" w:cs="Times New Roman"/>
+          <w:sz w:val="24"/>
+          <w:szCs w:val="24"/>
+        </w:rPr>
+        <w:t xml:space="preserve"> reflejados</w:t>
+      </w:r>
+      <w:r>
+        <w:rPr>
+          <w:rFonts w:ascii="Times New Roman" w:hAnsi="Times New Roman" w:cs="Times New Roman"/>
+          <w:sz w:val="24"/>
+          <w:szCs w:val="24"/>
+        </w:rPr>
+        <w:t xml:space="preserve"> al menos que </w:t>
+      </w:r>
+      <w:r>
+        <w:rPr>
+          <w:rFonts w:ascii="Times New Roman" w:hAnsi="Times New Roman" w:cs="Times New Roman"/>
+          <w:sz w:val="24"/>
+          <w:szCs w:val="24"/>
+        </w:rPr>
+        <w:t xml:space="preserve">fueran necesarios, pero el caso es que sin saberlo cualquiera puede cometer el error de declarar una variables con un valor determinado (como en cualquier otro lenguaje) y luego querer cambiarle el contenido, </w:t>
+      </w:r>
+      <w:r>
+        <w:rPr>
+          <w:rFonts w:ascii="Times New Roman" w:hAnsi="Times New Roman" w:cs="Times New Roman"/>
+          <w:sz w:val="24"/>
+          <w:szCs w:val="24"/>
+        </w:rPr>
+        <w:t>produciendo un error de compilación por querer acceder a una dirección que es inmutable.</w:t>
       </w:r>
     </w:p>
     <w:p>
@@ -1778,7 +1928,7 @@
           <w:color w:val="auto"/>
         </w:rPr>
       </w:pPr>
-      <w:bookmarkStart w:id="2" w:name="_Toc207305891"/>
+      <w:bookmarkStart w:id="2" w:name="_Toc207456353"/>
       <w:r>
         <w:rPr>
           <w:rFonts w:ascii="Times New Roman" w:hAnsi="Times New Roman" w:cs="Times New Roman"/>
@@ -1932,7 +2082,15 @@
           <w:sz w:val="24"/>
           <w:szCs w:val="24"/>
         </w:rPr>
-        <w:t xml:space="preserve">Diseñar e implementar </w:t>
+        <w:t>I</w:t>
+      </w:r>
+      <w:r>
+        <w:rPr>
+          <w:rFonts w:ascii="Times New Roman" w:hAnsi="Times New Roman" w:cs="Times New Roman"/>
+          <w:sz w:val="24"/>
+          <w:szCs w:val="24"/>
+        </w:rPr>
+        <w:t xml:space="preserve">mplementar </w:t>
       </w:r>
       <w:r>
         <w:rPr>
@@ -2013,41 +2171,175 @@
           <w:sz w:val="24"/>
           <w:szCs w:val="24"/>
         </w:rPr>
+        <w:t xml:space="preserve"> ownership en rust que nos permita generar una efecto en cadena al realizar una des referenciación entre </w:t>
+      </w:r>
+      <w:commentRangeStart w:id="3"/>
+      <w:r>
+        <w:rPr>
+          <w:rFonts w:ascii="Times New Roman" w:hAnsi="Times New Roman" w:cs="Times New Roman"/>
+          <w:sz w:val="24"/>
+          <w:szCs w:val="24"/>
+        </w:rPr>
+        <w:t xml:space="preserve">objetos propietarios y elementos apuntados. </w:t>
+      </w:r>
+      <w:commentRangeEnd w:id="3"/>
+      <w:r>
+        <w:rPr>
+          <w:rStyle w:val="Refdecomentario"/>
+        </w:rPr>
+        <w:commentReference w:id="3"/>
+      </w:r>
+    </w:p>
+    <w:p>
+      <w:pPr>
+        <w:spacing w:after="0" w:line="240" w:lineRule="auto"/>
+        <w:rPr>
+          <w:rFonts w:ascii="Times New Roman" w:hAnsi="Times New Roman" w:cs="Times New Roman"/>
+          <w:sz w:val="24"/>
+          <w:szCs w:val="24"/>
+        </w:rPr>
+      </w:pPr>
+    </w:p>
+    <w:p>
+      <w:pPr>
+        <w:pStyle w:val="Ttulo2"/>
+        <w:tabs>
+          <w:tab w:val="left" w:pos="3576"/>
+        </w:tabs>
+        <w:spacing w:before="0" w:after="0" w:line="240" w:lineRule="auto"/>
+        <w:rPr>
+          <w:rFonts w:ascii="Times New Roman" w:hAnsi="Times New Roman" w:cs="Times New Roman"/>
+          <w:color w:val="auto"/>
+        </w:rPr>
+      </w:pPr>
+      <w:bookmarkStart w:id="4" w:name="_Toc207456354"/>
+      <w:r>
+        <w:rPr>
+          <w:rFonts w:ascii="Times New Roman" w:hAnsi="Times New Roman" w:cs="Times New Roman"/>
+          <w:color w:val="auto"/>
+        </w:rPr>
+        <w:t>1.</w:t>
+      </w:r>
+      <w:r>
+        <w:rPr>
+          <w:rFonts w:ascii="Times New Roman" w:hAnsi="Times New Roman" w:cs="Times New Roman"/>
+          <w:color w:val="auto"/>
+        </w:rPr>
+        <w:t>2</w:t>
+      </w:r>
+      <w:r>
+        <w:rPr>
+          <w:rFonts w:ascii="Times New Roman" w:hAnsi="Times New Roman" w:cs="Times New Roman"/>
+          <w:color w:val="auto"/>
+        </w:rPr>
         <w:t xml:space="preserve"> </w:t>
       </w:r>
-      <w:proofErr w:type="spellStart"/>
-      <w:r>
-        <w:rPr>
-          <w:rFonts w:ascii="Times New Roman" w:hAnsi="Times New Roman" w:cs="Times New Roman"/>
-          <w:sz w:val="24"/>
-          <w:szCs w:val="24"/>
-        </w:rPr>
-        <w:t>ownership</w:t>
-      </w:r>
-      <w:proofErr w:type="spellEnd"/>
-      <w:r>
-        <w:rPr>
-          <w:rFonts w:ascii="Times New Roman" w:hAnsi="Times New Roman" w:cs="Times New Roman"/>
-          <w:sz w:val="24"/>
-          <w:szCs w:val="24"/>
-        </w:rPr>
-        <w:t xml:space="preserve"> en rust que nos permita generar una efecto en cadena al realizar una des referenciación entre </w:t>
-      </w:r>
-      <w:commentRangeStart w:id="3"/>
-      <w:r>
-        <w:rPr>
-          <w:rFonts w:ascii="Times New Roman" w:hAnsi="Times New Roman" w:cs="Times New Roman"/>
-          <w:sz w:val="24"/>
-          <w:szCs w:val="24"/>
-        </w:rPr>
-        <w:t xml:space="preserve">objetos propietarios y elementos apuntados. </w:t>
-      </w:r>
-      <w:commentRangeEnd w:id="3"/>
-      <w:r>
-        <w:rPr>
-          <w:rStyle w:val="Refdecomentario"/>
-        </w:rPr>
-        <w:commentReference w:id="3"/>
+      <w:r>
+        <w:rPr>
+          <w:rFonts w:ascii="Times New Roman" w:hAnsi="Times New Roman" w:cs="Times New Roman"/>
+          <w:color w:val="auto"/>
+        </w:rPr>
+        <w:t>Hipótesis</w:t>
+      </w:r>
+      <w:bookmarkEnd w:id="4"/>
+    </w:p>
+    <w:p>
+      <w:pPr>
+        <w:spacing w:after="0" w:line="240" w:lineRule="auto"/>
+        <w:rPr>
+          <w:rFonts w:ascii="Times New Roman" w:hAnsi="Times New Roman" w:cs="Times New Roman"/>
+          <w:sz w:val="24"/>
+          <w:szCs w:val="24"/>
+        </w:rPr>
+      </w:pPr>
+    </w:p>
+    <w:p>
+      <w:pPr>
+        <w:pStyle w:val="Prrafodelista"/>
+        <w:numPr>
+          <w:ilvl w:val="0"/>
+          <w:numId w:val="2"/>
+        </w:numPr>
+        <w:spacing w:after="0" w:line="240" w:lineRule="auto"/>
+        <w:rPr>
+          <w:rFonts w:ascii="Times New Roman" w:hAnsi="Times New Roman" w:cs="Times New Roman"/>
+          <w:sz w:val="24"/>
+          <w:szCs w:val="24"/>
+        </w:rPr>
+      </w:pPr>
+      <w:r>
+        <w:rPr>
+          <w:rFonts w:ascii="Times New Roman" w:hAnsi="Times New Roman" w:cs="Times New Roman"/>
+          <w:sz w:val="24"/>
+          <w:szCs w:val="24"/>
+        </w:rPr>
+        <w:t>Un gran número de programadores que inician en el lenguaje rust trababan las referencias como en otros lenguajes, tales como C.</w:t>
+      </w:r>
+    </w:p>
+    <w:p>
+      <w:pPr>
+        <w:spacing w:after="0" w:line="240" w:lineRule="auto"/>
+        <w:rPr>
+          <w:rFonts w:ascii="Times New Roman" w:hAnsi="Times New Roman" w:cs="Times New Roman"/>
+          <w:sz w:val="24"/>
+          <w:szCs w:val="24"/>
+        </w:rPr>
+      </w:pPr>
+    </w:p>
+    <w:p>
+      <w:pPr>
+        <w:pStyle w:val="Prrafodelista"/>
+        <w:numPr>
+          <w:ilvl w:val="0"/>
+          <w:numId w:val="2"/>
+        </w:numPr>
+        <w:spacing w:after="0" w:line="240" w:lineRule="auto"/>
+        <w:rPr>
+          <w:rFonts w:ascii="Times New Roman" w:hAnsi="Times New Roman" w:cs="Times New Roman"/>
+          <w:sz w:val="24"/>
+          <w:szCs w:val="24"/>
+        </w:rPr>
+      </w:pPr>
+      <w:r>
+        <w:rPr>
+          <w:rFonts w:ascii="Times New Roman" w:hAnsi="Times New Roman" w:cs="Times New Roman"/>
+          <w:sz w:val="24"/>
+          <w:szCs w:val="24"/>
+        </w:rPr>
+        <w:t>El manejo de las referencias se simplifica cuando no se tiene en consideración la noción de dueño.</w:t>
+      </w:r>
+    </w:p>
+    <w:p>
+      <w:pPr>
+        <w:pStyle w:val="Prrafodelista"/>
+        <w:rPr>
+          <w:rFonts w:ascii="Times New Roman" w:hAnsi="Times New Roman" w:cs="Times New Roman"/>
+          <w:sz w:val="24"/>
+          <w:szCs w:val="24"/>
+        </w:rPr>
+      </w:pPr>
+    </w:p>
+    <w:p>
+      <w:pPr>
+        <w:pStyle w:val="Prrafodelista"/>
+        <w:numPr>
+          <w:ilvl w:val="0"/>
+          <w:numId w:val="2"/>
+        </w:numPr>
+        <w:spacing w:after="0" w:line="240" w:lineRule="auto"/>
+        <w:rPr>
+          <w:rFonts w:ascii="Times New Roman" w:hAnsi="Times New Roman" w:cs="Times New Roman"/>
+          <w:sz w:val="24"/>
+          <w:szCs w:val="24"/>
+        </w:rPr>
+      </w:pPr>
+      <w:r>
+        <w:rPr>
+          <w:rFonts w:ascii="Times New Roman" w:hAnsi="Times New Roman" w:cs="Times New Roman"/>
+          <w:sz w:val="24"/>
+          <w:szCs w:val="24"/>
+        </w:rPr>
+        <w:t>Al modificar un proyecto con los casos vistos el programa resultante es un equivalente en cuanto a funcionalidad.</w:t>
       </w:r>
     </w:p>
     <w:p>
@@ -2069,22 +2361,29 @@
           <w:color w:val="auto"/>
         </w:rPr>
       </w:pPr>
-      <w:bookmarkStart w:id="4" w:name="_Toc207305892"/>
+      <w:bookmarkStart w:id="5" w:name="_Toc207456355"/>
       <w:r>
         <w:rPr>
           <w:rFonts w:ascii="Times New Roman" w:hAnsi="Times New Roman" w:cs="Times New Roman"/>
           <w:color w:val="auto"/>
         </w:rPr>
-        <w:t xml:space="preserve">1.2 </w:t>
+        <w:t>1.n</w:t>
       </w:r>
       <w:r>
         <w:rPr>
           <w:rFonts w:ascii="Times New Roman" w:hAnsi="Times New Roman" w:cs="Times New Roman"/>
           <w:color w:val="auto"/>
         </w:rPr>
+        <w:t xml:space="preserve"> </w:t>
+      </w:r>
+      <w:r>
+        <w:rPr>
+          <w:rFonts w:ascii="Times New Roman" w:hAnsi="Times New Roman" w:cs="Times New Roman"/>
+          <w:color w:val="auto"/>
+        </w:rPr>
         <w:t>Datos recolectados</w:t>
       </w:r>
-      <w:bookmarkEnd w:id="4"/>
+      <w:bookmarkEnd w:id="5"/>
     </w:p>
     <w:p>
       <w:pPr>
@@ -2111,25 +2410,7 @@
           <w:sz w:val="24"/>
           <w:szCs w:val="24"/>
         </w:rPr>
-        <w:t>Partiendo del análisis realizado a una cierta cantidad de repositorios obtenidos de la plataforma ‘</w:t>
-      </w:r>
-      <w:proofErr w:type="spellStart"/>
-      <w:r>
-        <w:rPr>
-          <w:rFonts w:ascii="Times New Roman" w:hAnsi="Times New Roman" w:cs="Times New Roman"/>
-          <w:sz w:val="24"/>
-          <w:szCs w:val="24"/>
-        </w:rPr>
-        <w:t>Github</w:t>
-      </w:r>
-      <w:proofErr w:type="spellEnd"/>
-      <w:r>
-        <w:rPr>
-          <w:rFonts w:ascii="Times New Roman" w:hAnsi="Times New Roman" w:cs="Times New Roman"/>
-          <w:sz w:val="24"/>
-          <w:szCs w:val="24"/>
-        </w:rPr>
-        <w:t>’,</w:t>
+        <w:t>Partiendo del análisis realizado a una cierta cantidad de repositorios obtenidos de la plataforma ‘Github’,</w:t>
       </w:r>
       <w:r>
         <w:rPr>
@@ -2153,7 +2434,16 @@
           <w:sz w:val="24"/>
           <w:szCs w:val="24"/>
         </w:rPr>
-        <w:t xml:space="preserve">, proyectos como sistemas operativos, compiladores y algunos proyectos pequeños tales como estructuras de datos y mini aplicaciones de las mismas, se pudo obtener fragmentos de programas donde se emplean bloques </w:t>
+        <w:t xml:space="preserve">, proyectos como sistemas operativos, compiladores y algunos proyectos pequeños tales como estructuras </w:t>
+      </w:r>
+      <w:r>
+        <w:rPr>
+          <w:rFonts w:ascii="Times New Roman" w:hAnsi="Times New Roman" w:cs="Times New Roman"/>
+          <w:sz w:val="24"/>
+          <w:szCs w:val="24"/>
+        </w:rPr>
+        <w:lastRenderedPageBreak/>
+        <w:t xml:space="preserve">de datos y mini aplicaciones de las mismas, se pudo obtener fragmentos de programas donde se emplean bloques </w:t>
       </w:r>
       <w:r>
         <w:rPr>
@@ -2181,16 +2471,14 @@
         </w:rPr>
         <w:t xml:space="preserve">, la mayoría </w:t>
       </w:r>
-      <w:proofErr w:type="spellStart"/>
-      <w:r>
-        <w:rPr>
-          <w:rFonts w:ascii="Times New Roman" w:hAnsi="Times New Roman" w:cs="Times New Roman"/>
-          <w:sz w:val="24"/>
-          <w:szCs w:val="24"/>
-        </w:rPr>
-        <w:t>esta</w:t>
-      </w:r>
-      <w:proofErr w:type="spellEnd"/>
+      <w:r>
+        <w:rPr>
+          <w:rFonts w:ascii="Times New Roman" w:hAnsi="Times New Roman" w:cs="Times New Roman"/>
+          <w:sz w:val="24"/>
+          <w:szCs w:val="24"/>
+        </w:rPr>
+        <w:t>está</w:t>
+      </w:r>
       <w:r>
         <w:rPr>
           <w:rFonts w:ascii="Times New Roman" w:hAnsi="Times New Roman" w:cs="Times New Roman"/>
@@ -2205,25 +2493,7 @@
           <w:sz w:val="24"/>
           <w:szCs w:val="24"/>
         </w:rPr>
-        <w:t xml:space="preserve"> Esto se ha tenido en cuenta principalmente porque el lenguaje rust no permite modificación de valores por la propiedad de </w:t>
-      </w:r>
-      <w:proofErr w:type="spellStart"/>
-      <w:r>
-        <w:rPr>
-          <w:rFonts w:ascii="Times New Roman" w:hAnsi="Times New Roman" w:cs="Times New Roman"/>
-          <w:sz w:val="24"/>
-          <w:szCs w:val="24"/>
-        </w:rPr>
-        <w:t>ownership</w:t>
-      </w:r>
-      <w:proofErr w:type="spellEnd"/>
-      <w:r>
-        <w:rPr>
-          <w:rFonts w:ascii="Times New Roman" w:hAnsi="Times New Roman" w:cs="Times New Roman"/>
-          <w:sz w:val="24"/>
-          <w:szCs w:val="24"/>
-        </w:rPr>
-        <w:t xml:space="preserve">, la cual maneja </w:t>
+        <w:t xml:space="preserve"> Esto se ha tenido en cuenta principalmente porque el lenguaje rust no permite modificación de valores por la propiedad de ownership, la cual maneja </w:t>
       </w:r>
       <w:r>
         <w:rPr>
@@ -2239,7 +2509,7 @@
           <w:sz w:val="24"/>
           <w:szCs w:val="24"/>
         </w:rPr>
-        <w:t xml:space="preserve"> variable o estructuras</w:t>
+        <w:t>variable o estructuras</w:t>
       </w:r>
       <w:r>
         <w:rPr>
@@ -2249,16 +2519,14 @@
         </w:rPr>
         <w:t xml:space="preserve"> </w:t>
       </w:r>
-      <w:proofErr w:type="spellStart"/>
-      <w:r>
-        <w:rPr>
-          <w:rFonts w:ascii="Times New Roman" w:hAnsi="Times New Roman" w:cs="Times New Roman"/>
-          <w:sz w:val="24"/>
-          <w:szCs w:val="24"/>
-        </w:rPr>
-        <w:t>impidiendoles</w:t>
-      </w:r>
-      <w:proofErr w:type="spellEnd"/>
+      <w:r>
+        <w:rPr>
+          <w:rFonts w:ascii="Times New Roman" w:hAnsi="Times New Roman" w:cs="Times New Roman"/>
+          <w:sz w:val="24"/>
+          <w:szCs w:val="24"/>
+        </w:rPr>
+        <w:t>impidiéndoles</w:t>
+      </w:r>
       <w:r>
         <w:rPr>
           <w:rFonts w:ascii="Times New Roman" w:hAnsi="Times New Roman" w:cs="Times New Roman"/>
@@ -2278,133 +2546,20 @@
     </w:p>
     <w:p>
       <w:pPr>
-        <w:spacing w:after="0" w:line="240" w:lineRule="auto"/>
-        <w:rPr>
-          <w:rFonts w:ascii="Times New Roman" w:hAnsi="Times New Roman" w:cs="Times New Roman"/>
-          <w:sz w:val="24"/>
-          <w:szCs w:val="24"/>
-        </w:rPr>
-      </w:pPr>
-    </w:p>
-    <w:p>
-      <w:pPr>
-        <w:spacing w:after="0" w:line="240" w:lineRule="auto"/>
-        <w:rPr>
-          <w:rFonts w:ascii="Times New Roman" w:hAnsi="Times New Roman" w:cs="Times New Roman"/>
-          <w:sz w:val="24"/>
-          <w:szCs w:val="24"/>
-        </w:rPr>
-      </w:pPr>
-    </w:p>
-    <w:p>
-      <w:pPr>
-        <w:spacing w:after="0" w:line="240" w:lineRule="auto"/>
-        <w:rPr>
-          <w:rFonts w:ascii="Times New Roman" w:hAnsi="Times New Roman" w:cs="Times New Roman"/>
-          <w:sz w:val="24"/>
-          <w:szCs w:val="24"/>
-        </w:rPr>
-      </w:pPr>
-    </w:p>
-    <w:p>
-      <w:pPr>
-        <w:spacing w:after="0" w:line="240" w:lineRule="auto"/>
-        <w:rPr>
-          <w:rFonts w:ascii="Times New Roman" w:hAnsi="Times New Roman" w:cs="Times New Roman"/>
-          <w:sz w:val="24"/>
-          <w:szCs w:val="24"/>
-        </w:rPr>
-      </w:pPr>
-    </w:p>
-    <w:p>
-      <w:pPr>
-        <w:spacing w:after="0" w:line="240" w:lineRule="auto"/>
-        <w:rPr>
-          <w:rFonts w:ascii="Times New Roman" w:hAnsi="Times New Roman" w:cs="Times New Roman"/>
-          <w:sz w:val="24"/>
-          <w:szCs w:val="24"/>
-        </w:rPr>
-      </w:pPr>
-    </w:p>
-    <w:p>
-      <w:pPr>
-        <w:spacing w:after="0" w:line="240" w:lineRule="auto"/>
-        <w:rPr>
-          <w:rFonts w:ascii="Times New Roman" w:hAnsi="Times New Roman" w:cs="Times New Roman"/>
-          <w:sz w:val="24"/>
-          <w:szCs w:val="24"/>
-        </w:rPr>
-      </w:pPr>
-    </w:p>
-    <w:p>
-      <w:pPr>
-        <w:spacing w:after="0" w:line="240" w:lineRule="auto"/>
-        <w:rPr>
-          <w:rFonts w:ascii="Times New Roman" w:hAnsi="Times New Roman" w:cs="Times New Roman"/>
-          <w:sz w:val="24"/>
-          <w:szCs w:val="24"/>
-        </w:rPr>
-      </w:pPr>
-    </w:p>
-    <w:p>
-      <w:pPr>
-        <w:spacing w:after="0" w:line="240" w:lineRule="auto"/>
-        <w:rPr>
-          <w:rFonts w:ascii="Times New Roman" w:hAnsi="Times New Roman" w:cs="Times New Roman"/>
-          <w:sz w:val="24"/>
-          <w:szCs w:val="24"/>
-        </w:rPr>
-      </w:pPr>
-    </w:p>
-    <w:p>
-      <w:pPr>
-        <w:spacing w:after="0" w:line="240" w:lineRule="auto"/>
-        <w:rPr>
-          <w:rFonts w:ascii="Times New Roman" w:hAnsi="Times New Roman" w:cs="Times New Roman"/>
-          <w:sz w:val="24"/>
-          <w:szCs w:val="24"/>
-        </w:rPr>
-      </w:pPr>
-    </w:p>
-    <w:p>
-      <w:pPr>
-        <w:spacing w:after="0" w:line="240" w:lineRule="auto"/>
-        <w:rPr>
-          <w:rFonts w:ascii="Times New Roman" w:hAnsi="Times New Roman" w:cs="Times New Roman"/>
-          <w:sz w:val="24"/>
-          <w:szCs w:val="24"/>
-        </w:rPr>
-      </w:pPr>
-    </w:p>
-    <w:p>
-      <w:pPr>
-        <w:spacing w:after="0" w:line="240" w:lineRule="auto"/>
-        <w:rPr>
-          <w:rFonts w:ascii="Times New Roman" w:hAnsi="Times New Roman" w:cs="Times New Roman"/>
-          <w:sz w:val="24"/>
-          <w:szCs w:val="24"/>
-        </w:rPr>
-      </w:pPr>
-    </w:p>
-    <w:p>
-      <w:pPr>
-        <w:spacing w:after="0" w:line="240" w:lineRule="auto"/>
-        <w:rPr>
-          <w:rFonts w:ascii="Times New Roman" w:hAnsi="Times New Roman" w:cs="Times New Roman"/>
-          <w:sz w:val="24"/>
-          <w:szCs w:val="24"/>
-        </w:rPr>
-      </w:pPr>
-    </w:p>
-    <w:p>
-      <w:pPr>
-        <w:spacing w:after="0" w:line="240" w:lineRule="auto"/>
-        <w:rPr>
-          <w:rFonts w:ascii="Times New Roman" w:hAnsi="Times New Roman" w:cs="Times New Roman"/>
-          <w:sz w:val="24"/>
-          <w:szCs w:val="24"/>
-        </w:rPr>
-      </w:pPr>
+        <w:rPr>
+          <w:rFonts w:ascii="Times New Roman" w:hAnsi="Times New Roman" w:cs="Times New Roman"/>
+          <w:sz w:val="24"/>
+          <w:szCs w:val="24"/>
+        </w:rPr>
+      </w:pPr>
+      <w:r>
+        <w:rPr>
+          <w:rFonts w:ascii="Times New Roman" w:hAnsi="Times New Roman" w:cs="Times New Roman"/>
+          <w:sz w:val="24"/>
+          <w:szCs w:val="24"/>
+        </w:rPr>
+        <w:br w:type="page"/>
+      </w:r>
     </w:p>
     <w:p>
       <w:pPr>
@@ -2415,7 +2570,7 @@
           <w:color w:val="auto"/>
         </w:rPr>
       </w:pPr>
-      <w:bookmarkStart w:id="5" w:name="_Toc207305893"/>
+      <w:bookmarkStart w:id="6" w:name="_Toc207456356"/>
       <w:r>
         <w:rPr>
           <w:rFonts w:ascii="Times New Roman" w:hAnsi="Times New Roman" w:cs="Times New Roman"/>
@@ -2429,7 +2584,7 @@
           <w:rFonts w:ascii="Times New Roman" w:hAnsi="Times New Roman" w:cs="Times New Roman"/>
           <w:color w:val="auto"/>
         </w:rPr>
-        <w:t>3</w:t>
+        <w:t>n</w:t>
       </w:r>
       <w:r>
         <w:rPr>
@@ -2452,7 +2607,7 @@
         </w:rPr>
         <w:t>código</w:t>
       </w:r>
-      <w:bookmarkEnd w:id="5"/>
+      <w:bookmarkEnd w:id="6"/>
       <w:r>
         <w:rPr>
           <w:rFonts w:ascii="Times New Roman" w:hAnsi="Times New Roman" w:cs="Times New Roman"/>
@@ -2763,6 +2918,7 @@
               </w:rPr>
             </w:pPr>
             <w:proofErr w:type="spellStart"/>
+            <w:proofErr w:type="gramStart"/>
             <w:r>
               <w:rPr>
                 <w:rFonts w:ascii="Times New Roman" w:hAnsi="Times New Roman" w:cs="Times New Roman"/>
@@ -2772,6 +2928,7 @@
               <w:t>nodo.altura</w:t>
             </w:r>
             <w:proofErr w:type="spellEnd"/>
+            <w:proofErr w:type="gramEnd"/>
             <w:r>
               <w:rPr>
                 <w:rFonts w:ascii="Times New Roman" w:hAnsi="Times New Roman" w:cs="Times New Roman"/>
@@ -2781,6 +2938,7 @@
               <w:t xml:space="preserve"> = 1 + </w:t>
             </w:r>
             <w:proofErr w:type="spellStart"/>
+            <w:proofErr w:type="gramStart"/>
             <w:r>
               <w:rPr>
                 <w:rFonts w:ascii="Times New Roman" w:hAnsi="Times New Roman" w:cs="Times New Roman"/>
@@ -2834,6 +2992,7 @@
               </w:rPr>
               <w:t>(</w:t>
             </w:r>
+            <w:proofErr w:type="gramEnd"/>
           </w:p>
           <w:p>
             <w:pPr>
@@ -2852,6 +3011,7 @@
               <w:t xml:space="preserve">          </w:t>
             </w:r>
             <w:proofErr w:type="spellStart"/>
+            <w:proofErr w:type="gramStart"/>
             <w:r>
               <w:rPr>
                 <w:rFonts w:ascii="Times New Roman" w:hAnsi="Times New Roman" w:cs="Times New Roman"/>
@@ -2870,6 +3030,7 @@
               <w:t>::</w:t>
             </w:r>
             <w:proofErr w:type="spellStart"/>
+            <w:proofErr w:type="gramEnd"/>
             <w:r>
               <w:rPr>
                 <w:rFonts w:ascii="Times New Roman" w:hAnsi="Times New Roman" w:cs="Times New Roman"/>
@@ -2888,6 +3049,7 @@
               <w:t>(</w:t>
             </w:r>
             <w:proofErr w:type="spellStart"/>
+            <w:proofErr w:type="gramStart"/>
             <w:r>
               <w:rPr>
                 <w:rFonts w:ascii="Times New Roman" w:hAnsi="Times New Roman" w:cs="Times New Roman"/>
@@ -2903,7 +3065,16 @@
                 <w:sz w:val="20"/>
                 <w:szCs w:val="20"/>
               </w:rPr>
-              <w:t xml:space="preserve">),     </w:t>
+              <w:t xml:space="preserve">),   </w:t>
+            </w:r>
+            <w:proofErr w:type="gramEnd"/>
+            <w:r>
+              <w:rPr>
+                <w:rFonts w:ascii="Times New Roman" w:hAnsi="Times New Roman" w:cs="Times New Roman"/>
+                <w:sz w:val="20"/>
+                <w:szCs w:val="20"/>
+              </w:rPr>
+              <w:t xml:space="preserve">  </w:t>
             </w:r>
             <w:r>
               <w:rPr>
@@ -2932,6 +3103,7 @@
               <w:t xml:space="preserve">          </w:t>
             </w:r>
             <w:proofErr w:type="spellStart"/>
+            <w:proofErr w:type="gramStart"/>
             <w:r>
               <w:rPr>
                 <w:rFonts w:ascii="Times New Roman" w:hAnsi="Times New Roman" w:cs="Times New Roman"/>
@@ -2950,6 +3122,7 @@
               <w:t>::</w:t>
             </w:r>
             <w:proofErr w:type="spellStart"/>
+            <w:proofErr w:type="gramEnd"/>
             <w:r>
               <w:rPr>
                 <w:rFonts w:ascii="Times New Roman" w:hAnsi="Times New Roman" w:cs="Times New Roman"/>
@@ -2968,6 +3141,7 @@
               <w:t>(</w:t>
             </w:r>
             <w:proofErr w:type="spellStart"/>
+            <w:proofErr w:type="gramStart"/>
             <w:r>
               <w:rPr>
                 <w:rFonts w:ascii="Times New Roman" w:hAnsi="Times New Roman" w:cs="Times New Roman"/>
@@ -2977,6 +3151,7 @@
               <w:t>nodo.derecha</w:t>
             </w:r>
             <w:proofErr w:type="spellEnd"/>
+            <w:proofErr w:type="gramEnd"/>
             <w:r>
               <w:rPr>
                 <w:rFonts w:ascii="Times New Roman" w:hAnsi="Times New Roman" w:cs="Times New Roman"/>
@@ -3018,16 +3193,28 @@
                 <w:lang w:val="en-US"/>
               </w:rPr>
             </w:pPr>
-            <w:r>
-              <w:rPr>
-                <w:rFonts w:ascii="Times New Roman" w:hAnsi="Times New Roman" w:cs="Times New Roman"/>
-                <w:sz w:val="20"/>
-                <w:szCs w:val="20"/>
-                <w:lang w:val="en-US"/>
-              </w:rPr>
-              <w:t>replace(&amp;</w:t>
+            <w:proofErr w:type="gramStart"/>
+            <w:r>
+              <w:rPr>
+                <w:rFonts w:ascii="Times New Roman" w:hAnsi="Times New Roman" w:cs="Times New Roman"/>
+                <w:sz w:val="20"/>
+                <w:szCs w:val="20"/>
+                <w:lang w:val="en-US"/>
+              </w:rPr>
+              <w:t>replace(</w:t>
+            </w:r>
+            <w:proofErr w:type="gramEnd"/>
+            <w:r>
+              <w:rPr>
+                <w:rFonts w:ascii="Times New Roman" w:hAnsi="Times New Roman" w:cs="Times New Roman"/>
+                <w:sz w:val="20"/>
+                <w:szCs w:val="20"/>
+                <w:lang w:val="en-US"/>
+              </w:rPr>
+              <w:t>&amp;</w:t>
             </w:r>
             <w:proofErr w:type="spellStart"/>
+            <w:proofErr w:type="gramStart"/>
             <w:r>
               <w:rPr>
                 <w:rFonts w:ascii="Times New Roman" w:hAnsi="Times New Roman" w:cs="Times New Roman"/>
@@ -3038,14 +3225,25 @@
               <w:t>nodo.altura</w:t>
             </w:r>
             <w:proofErr w:type="spellEnd"/>
-            <w:r>
-              <w:rPr>
-                <w:rFonts w:ascii="Times New Roman" w:hAnsi="Times New Roman" w:cs="Times New Roman"/>
-                <w:sz w:val="20"/>
-                <w:szCs w:val="20"/>
-                <w:lang w:val="en-US"/>
-              </w:rPr>
-              <w:t>, 1 + std::</w:t>
+            <w:proofErr w:type="gramEnd"/>
+            <w:r>
+              <w:rPr>
+                <w:rFonts w:ascii="Times New Roman" w:hAnsi="Times New Roman" w:cs="Times New Roman"/>
+                <w:sz w:val="20"/>
+                <w:szCs w:val="20"/>
+                <w:lang w:val="en-US"/>
+              </w:rPr>
+              <w:t xml:space="preserve">, 1 + </w:t>
+            </w:r>
+            <w:proofErr w:type="gramStart"/>
+            <w:r>
+              <w:rPr>
+                <w:rFonts w:ascii="Times New Roman" w:hAnsi="Times New Roman" w:cs="Times New Roman"/>
+                <w:sz w:val="20"/>
+                <w:szCs w:val="20"/>
+                <w:lang w:val="en-US"/>
+              </w:rPr>
+              <w:t>std::</w:t>
             </w:r>
             <w:proofErr w:type="spellStart"/>
             <w:r>
@@ -3067,6 +3265,7 @@
               </w:rPr>
               <w:t>::max(</w:t>
             </w:r>
+            <w:proofErr w:type="gramEnd"/>
           </w:p>
           <w:p>
             <w:pPr>
@@ -3077,6 +3276,7 @@
               </w:rPr>
             </w:pPr>
             <w:proofErr w:type="spellStart"/>
+            <w:proofErr w:type="gramStart"/>
             <w:r>
               <w:rPr>
                 <w:rFonts w:ascii="Times New Roman" w:hAnsi="Times New Roman" w:cs="Times New Roman"/>
@@ -3095,6 +3295,7 @@
               <w:t>::</w:t>
             </w:r>
             <w:proofErr w:type="spellStart"/>
+            <w:proofErr w:type="gramEnd"/>
             <w:r>
               <w:rPr>
                 <w:rFonts w:ascii="Times New Roman" w:hAnsi="Times New Roman" w:cs="Times New Roman"/>
@@ -3113,6 +3314,7 @@
               <w:t>(</w:t>
             </w:r>
             <w:proofErr w:type="spellStart"/>
+            <w:proofErr w:type="gramStart"/>
             <w:r>
               <w:rPr>
                 <w:rFonts w:ascii="Times New Roman" w:hAnsi="Times New Roman" w:cs="Times New Roman"/>
@@ -3122,6 +3324,7 @@
               <w:t>nodo.izquierda</w:t>
             </w:r>
             <w:proofErr w:type="spellEnd"/>
+            <w:proofErr w:type="gramEnd"/>
             <w:r>
               <w:rPr>
                 <w:rFonts w:ascii="Times New Roman" w:hAnsi="Times New Roman" w:cs="Times New Roman"/>
@@ -3140,6 +3343,7 @@
               </w:rPr>
             </w:pPr>
             <w:proofErr w:type="spellStart"/>
+            <w:proofErr w:type="gramStart"/>
             <w:r>
               <w:rPr>
                 <w:rFonts w:ascii="Times New Roman" w:hAnsi="Times New Roman" w:cs="Times New Roman"/>
@@ -3158,6 +3362,7 @@
               <w:t>::</w:t>
             </w:r>
             <w:proofErr w:type="spellStart"/>
+            <w:proofErr w:type="gramEnd"/>
             <w:r>
               <w:rPr>
                 <w:rFonts w:ascii="Times New Roman" w:hAnsi="Times New Roman" w:cs="Times New Roman"/>
@@ -3176,6 +3381,7 @@
               <w:t>(</w:t>
             </w:r>
             <w:proofErr w:type="spellStart"/>
+            <w:proofErr w:type="gramStart"/>
             <w:r>
               <w:rPr>
                 <w:rFonts w:ascii="Times New Roman" w:hAnsi="Times New Roman" w:cs="Times New Roman"/>
@@ -3185,6 +3391,7 @@
               <w:t>nodo.derecha</w:t>
             </w:r>
             <w:proofErr w:type="spellEnd"/>
+            <w:proofErr w:type="gramEnd"/>
             <w:r>
               <w:rPr>
                 <w:rFonts w:ascii="Times New Roman" w:hAnsi="Times New Roman" w:cs="Times New Roman"/>
@@ -3308,6 +3515,7 @@
               <w:t xml:space="preserve"> = </w:t>
             </w:r>
             <w:proofErr w:type="spellStart"/>
+            <w:proofErr w:type="gramStart"/>
             <w:r>
               <w:rPr>
                 <w:rFonts w:ascii="Times New Roman" w:hAnsi="Times New Roman" w:cs="Times New Roman"/>
@@ -3338,6 +3546,7 @@
               <w:t>self.tamano</w:t>
             </w:r>
             <w:proofErr w:type="spellEnd"/>
+            <w:proofErr w:type="gramEnd"/>
             <w:r>
               <w:rPr>
                 <w:rFonts w:ascii="Times New Roman" w:hAnsi="Times New Roman" w:cs="Times New Roman"/>
@@ -3366,6 +3575,7 @@
               <w:t>Some(&amp;*</w:t>
             </w:r>
             <w:proofErr w:type="spellStart"/>
+            <w:proofErr w:type="gramStart"/>
             <w:r>
               <w:rPr>
                 <w:rFonts w:ascii="Times New Roman" w:hAnsi="Times New Roman" w:cs="Times New Roman"/>
@@ -3392,7 +3602,17 @@
                 <w:szCs w:val="20"/>
                 <w:lang w:val="en-US"/>
               </w:rPr>
-              <w:t xml:space="preserve">      </w:t>
+              <w:t xml:space="preserve">   </w:t>
+            </w:r>
+            <w:proofErr w:type="gramEnd"/>
+            <w:r>
+              <w:rPr>
+                <w:rFonts w:ascii="Times New Roman" w:hAnsi="Times New Roman" w:cs="Times New Roman"/>
+                <w:sz w:val="20"/>
+                <w:szCs w:val="20"/>
+                <w:lang w:val="en-US"/>
+              </w:rPr>
+              <w:t xml:space="preserve">   </w:t>
             </w:r>
             <w:r>
               <w:rPr>
@@ -3441,7 +3661,25 @@
                 <w:sz w:val="20"/>
                 <w:szCs w:val="20"/>
               </w:rPr>
-              <w:t xml:space="preserve">   Ok(): …</w:t>
+              <w:t xml:space="preserve">   </w:t>
+            </w:r>
+            <w:proofErr w:type="gramStart"/>
+            <w:r>
+              <w:rPr>
+                <w:rFonts w:ascii="Times New Roman" w:hAnsi="Times New Roman" w:cs="Times New Roman"/>
+                <w:sz w:val="20"/>
+                <w:szCs w:val="20"/>
+              </w:rPr>
+              <w:t>Ok(</w:t>
+            </w:r>
+            <w:proofErr w:type="gramEnd"/>
+            <w:r>
+              <w:rPr>
+                <w:rFonts w:ascii="Times New Roman" w:hAnsi="Times New Roman" w:cs="Times New Roman"/>
+                <w:sz w:val="20"/>
+                <w:szCs w:val="20"/>
+              </w:rPr>
+              <w:t>): …</w:t>
             </w:r>
           </w:p>
           <w:p>
@@ -3560,8 +3798,18 @@
                 <w:sz w:val="20"/>
                 <w:szCs w:val="20"/>
               </w:rPr>
-              <w:t>(*nodo).derecha</w:t>
-            </w:r>
+              <w:t>(*nodo</w:t>
+            </w:r>
+            <w:proofErr w:type="gramStart"/>
+            <w:r>
+              <w:rPr>
+                <w:rFonts w:ascii="Times New Roman" w:hAnsi="Times New Roman" w:cs="Times New Roman"/>
+                <w:sz w:val="20"/>
+                <w:szCs w:val="20"/>
+              </w:rPr>
+              <w:t>).derecha</w:t>
+            </w:r>
+            <w:proofErr w:type="gramEnd"/>
             <w:r>
               <w:rPr>
                 <w:rFonts w:ascii="Times New Roman" w:hAnsi="Times New Roman" w:cs="Times New Roman"/>
@@ -3885,6 +4133,7 @@
               </w:rPr>
               <w:t xml:space="preserve">  </w:t>
             </w:r>
+            <w:proofErr w:type="gramStart"/>
             <w:r>
               <w:rPr>
                 <w:rFonts w:ascii="Times New Roman" w:hAnsi="Times New Roman" w:cs="Times New Roman"/>
@@ -3895,6 +4144,7 @@
               <w:t>slice::</w:t>
             </w:r>
             <w:proofErr w:type="spellStart"/>
+            <w:proofErr w:type="gramEnd"/>
             <w:r>
               <w:rPr>
                 <w:rFonts w:ascii="Times New Roman" w:hAnsi="Times New Roman" w:cs="Times New Roman"/>
@@ -3922,7 +4172,17 @@
                 <w:szCs w:val="20"/>
                 <w:lang w:val="en-US"/>
               </w:rPr>
-              <w:t>d.as_ptr</w:t>
+              <w:t>d.as_</w:t>
+            </w:r>
+            <w:proofErr w:type="gramStart"/>
+            <w:r>
+              <w:rPr>
+                <w:rFonts w:ascii="Times New Roman" w:hAnsi="Times New Roman" w:cs="Times New Roman"/>
+                <w:sz w:val="20"/>
+                <w:szCs w:val="20"/>
+                <w:lang w:val="en-US"/>
+              </w:rPr>
+              <w:t>ptr</w:t>
             </w:r>
             <w:proofErr w:type="spellEnd"/>
             <w:r>
@@ -3932,7 +4192,17 @@
                 <w:szCs w:val="20"/>
                 <w:lang w:val="en-US"/>
               </w:rPr>
-              <w:t xml:space="preserve">() as *const u8, </w:t>
+              <w:t>(</w:t>
+            </w:r>
+            <w:proofErr w:type="gramEnd"/>
+            <w:r>
+              <w:rPr>
+                <w:rFonts w:ascii="Times New Roman" w:hAnsi="Times New Roman" w:cs="Times New Roman"/>
+                <w:sz w:val="20"/>
+                <w:szCs w:val="20"/>
+                <w:lang w:val="en-US"/>
+              </w:rPr>
+              <w:t xml:space="preserve">) as *const u8, </w:t>
             </w:r>
             <w:proofErr w:type="spellStart"/>
             <w:r>
@@ -4021,9 +4291,20 @@
                 <w:szCs w:val="20"/>
                 <w:lang w:val="en-US"/>
               </w:rPr>
-              <w:t>let perm_u8 = Box::</w:t>
+              <w:t xml:space="preserve">let perm_u8 = </w:t>
+            </w:r>
+            <w:proofErr w:type="gramStart"/>
+            <w:r>
+              <w:rPr>
+                <w:rFonts w:ascii="Times New Roman" w:hAnsi="Times New Roman" w:cs="Times New Roman"/>
+                <w:sz w:val="20"/>
+                <w:szCs w:val="20"/>
+                <w:lang w:val="en-US"/>
+              </w:rPr>
+              <w:t>Box::</w:t>
             </w:r>
             <w:proofErr w:type="spellStart"/>
+            <w:proofErr w:type="gramEnd"/>
             <w:r>
               <w:rPr>
                 <w:rFonts w:ascii="Times New Roman" w:hAnsi="Times New Roman" w:cs="Times New Roman"/>
@@ -4040,7 +4321,17 @@
                 <w:szCs w:val="20"/>
                 <w:lang w:val="en-US"/>
               </w:rPr>
-              <w:t>rom_raw</w:t>
+              <w:t>rom_</w:t>
+            </w:r>
+            <w:proofErr w:type="gramStart"/>
+            <w:r>
+              <w:rPr>
+                <w:rFonts w:ascii="Times New Roman" w:hAnsi="Times New Roman" w:cs="Times New Roman"/>
+                <w:sz w:val="20"/>
+                <w:szCs w:val="20"/>
+                <w:lang w:val="en-US"/>
+              </w:rPr>
+              <w:t>raw</w:t>
             </w:r>
             <w:proofErr w:type="spellEnd"/>
             <w:r>
@@ -4062,6 +4353,7 @@
               <w:t xml:space="preserve"> slice::</w:t>
             </w:r>
             <w:proofErr w:type="spellStart"/>
+            <w:proofErr w:type="gramEnd"/>
             <w:r>
               <w:rPr>
                 <w:rFonts w:ascii="Times New Roman" w:hAnsi="Times New Roman" w:cs="Times New Roman"/>
@@ -4089,7 +4381,17 @@
                 <w:szCs w:val="20"/>
                 <w:lang w:val="en-US"/>
               </w:rPr>
-              <w:t>d.as_ptr</w:t>
+              <w:t>d.as_</w:t>
+            </w:r>
+            <w:proofErr w:type="gramStart"/>
+            <w:r>
+              <w:rPr>
+                <w:rFonts w:ascii="Times New Roman" w:hAnsi="Times New Roman" w:cs="Times New Roman"/>
+                <w:sz w:val="20"/>
+                <w:szCs w:val="20"/>
+                <w:lang w:val="en-US"/>
+              </w:rPr>
+              <w:t>ptr</w:t>
             </w:r>
             <w:proofErr w:type="spellEnd"/>
             <w:r>
@@ -4099,7 +4401,17 @@
                 <w:szCs w:val="20"/>
                 <w:lang w:val="en-US"/>
               </w:rPr>
-              <w:t xml:space="preserve">() as *const u8, </w:t>
+              <w:t>(</w:t>
+            </w:r>
+            <w:proofErr w:type="gramEnd"/>
+            <w:r>
+              <w:rPr>
+                <w:rFonts w:ascii="Times New Roman" w:hAnsi="Times New Roman" w:cs="Times New Roman"/>
+                <w:sz w:val="20"/>
+                <w:szCs w:val="20"/>
+                <w:lang w:val="en-US"/>
+              </w:rPr>
+              <w:t xml:space="preserve">) as *const u8, </w:t>
             </w:r>
             <w:proofErr w:type="spellStart"/>
             <w:r>
@@ -4224,16 +4536,116 @@
                 <w:szCs w:val="20"/>
                 <w:lang w:val="en-US"/>
               </w:rPr>
-              <w:t>*unsafe { &amp;mut *req }.0.uri_mut() = u;</w:t>
-            </w:r>
-            <w:r>
-              <w:rPr>
-                <w:rFonts w:ascii="Times New Roman" w:hAnsi="Times New Roman" w:cs="Times New Roman"/>
-                <w:sz w:val="20"/>
-                <w:szCs w:val="20"/>
-                <w:lang w:val="en-US"/>
-              </w:rPr>
-              <w:t xml:space="preserve">    </w:t>
+              <w:t>*</w:t>
+            </w:r>
+            <w:proofErr w:type="gramStart"/>
+            <w:r>
+              <w:rPr>
+                <w:rFonts w:ascii="Times New Roman" w:hAnsi="Times New Roman" w:cs="Times New Roman"/>
+                <w:sz w:val="20"/>
+                <w:szCs w:val="20"/>
+                <w:lang w:val="en-US"/>
+              </w:rPr>
+              <w:t>unsafe</w:t>
+            </w:r>
+            <w:proofErr w:type="gramEnd"/>
+            <w:r>
+              <w:rPr>
+                <w:rFonts w:ascii="Times New Roman" w:hAnsi="Times New Roman" w:cs="Times New Roman"/>
+                <w:sz w:val="20"/>
+                <w:szCs w:val="20"/>
+                <w:lang w:val="en-US"/>
+              </w:rPr>
+              <w:t xml:space="preserve"> </w:t>
+            </w:r>
+            <w:proofErr w:type="gramStart"/>
+            <w:r>
+              <w:rPr>
+                <w:rFonts w:ascii="Times New Roman" w:hAnsi="Times New Roman" w:cs="Times New Roman"/>
+                <w:sz w:val="20"/>
+                <w:szCs w:val="20"/>
+                <w:lang w:val="en-US"/>
+              </w:rPr>
+              <w:t>{ &amp;</w:t>
+            </w:r>
+            <w:proofErr w:type="gramEnd"/>
+            <w:r>
+              <w:rPr>
+                <w:rFonts w:ascii="Times New Roman" w:hAnsi="Times New Roman" w:cs="Times New Roman"/>
+                <w:sz w:val="20"/>
+                <w:szCs w:val="20"/>
+                <w:lang w:val="en-US"/>
+              </w:rPr>
+              <w:t>mut *</w:t>
+            </w:r>
+            <w:proofErr w:type="gramStart"/>
+            <w:r>
+              <w:rPr>
+                <w:rFonts w:ascii="Times New Roman" w:hAnsi="Times New Roman" w:cs="Times New Roman"/>
+                <w:sz w:val="20"/>
+                <w:szCs w:val="20"/>
+                <w:lang w:val="en-US"/>
+              </w:rPr>
+              <w:t>req }.0.uri</w:t>
+            </w:r>
+            <w:proofErr w:type="gramEnd"/>
+            <w:r>
+              <w:rPr>
+                <w:rFonts w:ascii="Times New Roman" w:hAnsi="Times New Roman" w:cs="Times New Roman"/>
+                <w:sz w:val="20"/>
+                <w:szCs w:val="20"/>
+                <w:lang w:val="en-US"/>
+              </w:rPr>
+              <w:t>_</w:t>
+            </w:r>
+            <w:proofErr w:type="gramStart"/>
+            <w:r>
+              <w:rPr>
+                <w:rFonts w:ascii="Times New Roman" w:hAnsi="Times New Roman" w:cs="Times New Roman"/>
+                <w:sz w:val="20"/>
+                <w:szCs w:val="20"/>
+                <w:lang w:val="en-US"/>
+              </w:rPr>
+              <w:t>mut(</w:t>
+            </w:r>
+            <w:proofErr w:type="gramEnd"/>
+            <w:r>
+              <w:rPr>
+                <w:rFonts w:ascii="Times New Roman" w:hAnsi="Times New Roman" w:cs="Times New Roman"/>
+                <w:sz w:val="20"/>
+                <w:szCs w:val="20"/>
+                <w:lang w:val="en-US"/>
+              </w:rPr>
+              <w:t xml:space="preserve">) = </w:t>
+            </w:r>
+            <w:proofErr w:type="gramStart"/>
+            <w:r>
+              <w:rPr>
+                <w:rFonts w:ascii="Times New Roman" w:hAnsi="Times New Roman" w:cs="Times New Roman"/>
+                <w:sz w:val="20"/>
+                <w:szCs w:val="20"/>
+                <w:lang w:val="en-US"/>
+              </w:rPr>
+              <w:t>u;</w:t>
+            </w:r>
+            <w:r>
+              <w:rPr>
+                <w:rFonts w:ascii="Times New Roman" w:hAnsi="Times New Roman" w:cs="Times New Roman"/>
+                <w:sz w:val="20"/>
+                <w:szCs w:val="20"/>
+                <w:lang w:val="en-US"/>
+              </w:rPr>
+              <w:t xml:space="preserve">   </w:t>
+            </w:r>
+            <w:proofErr w:type="gramEnd"/>
+            <w:r>
+              <w:rPr>
+                <w:rFonts w:ascii="Times New Roman" w:hAnsi="Times New Roman" w:cs="Times New Roman"/>
+                <w:sz w:val="20"/>
+                <w:szCs w:val="20"/>
+                <w:lang w:val="en-US"/>
+              </w:rPr>
+              <w:t xml:space="preserve"> </w:t>
             </w:r>
             <w:r>
               <w:rPr>
@@ -4349,7 +4761,17 @@
                 <w:szCs w:val="20"/>
                 <w:lang w:val="en-US"/>
               </w:rPr>
-              <w:t>run_guest</w:t>
+              <w:t>run_</w:t>
+            </w:r>
+            <w:proofErr w:type="gramStart"/>
+            <w:r>
+              <w:rPr>
+                <w:rFonts w:ascii="Times New Roman" w:hAnsi="Times New Roman" w:cs="Times New Roman"/>
+                <w:sz w:val="20"/>
+                <w:szCs w:val="20"/>
+                <w:lang w:val="en-US"/>
+              </w:rPr>
+              <w:t>guest</w:t>
             </w:r>
             <w:proofErr w:type="spellEnd"/>
             <w:r>
@@ -4359,7 +4781,17 @@
                 <w:szCs w:val="20"/>
                 <w:lang w:val="en-US"/>
               </w:rPr>
-              <w:t>(_</w:t>
+              <w:t>(</w:t>
+            </w:r>
+            <w:proofErr w:type="gramEnd"/>
+            <w:r>
+              <w:rPr>
+                <w:rFonts w:ascii="Times New Roman" w:hAnsi="Times New Roman" w:cs="Times New Roman"/>
+                <w:sz w:val="20"/>
+                <w:szCs w:val="20"/>
+                <w:lang w:val="en-US"/>
+              </w:rPr>
+              <w:t>_</w:t>
             </w:r>
             <w:proofErr w:type="spellStart"/>
             <w:r>
@@ -4506,7 +4938,17 @@
                 <w:szCs w:val="20"/>
                 <w:lang w:val="en-US"/>
               </w:rPr>
-              <w:t>ENTERING_GUEST.as_ref</w:t>
+              <w:t>ENTERING_GUEST.as_</w:t>
+            </w:r>
+            <w:proofErr w:type="gramStart"/>
+            <w:r>
+              <w:rPr>
+                <w:rFonts w:ascii="Times New Roman" w:hAnsi="Times New Roman" w:cs="Times New Roman"/>
+                <w:sz w:val="20"/>
+                <w:szCs w:val="20"/>
+                <w:lang w:val="en-US"/>
+              </w:rPr>
+              <w:t>ref</w:t>
             </w:r>
             <w:proofErr w:type="spellEnd"/>
             <w:r>
@@ -4516,16 +4958,46 @@
                 <w:szCs w:val="20"/>
                 <w:lang w:val="en-US"/>
               </w:rPr>
-              <w:t>() {</w:t>
-            </w:r>
-            <w:r>
-              <w:rPr>
-                <w:rFonts w:ascii="Times New Roman" w:hAnsi="Times New Roman" w:cs="Times New Roman"/>
-                <w:sz w:val="20"/>
-                <w:szCs w:val="20"/>
-                <w:lang w:val="en-US"/>
-              </w:rPr>
-              <w:t xml:space="preserve">            </w:t>
+              <w:t>(</w:t>
+            </w:r>
+            <w:proofErr w:type="gramEnd"/>
+            <w:r>
+              <w:rPr>
+                <w:rFonts w:ascii="Times New Roman" w:hAnsi="Times New Roman" w:cs="Times New Roman"/>
+                <w:sz w:val="20"/>
+                <w:szCs w:val="20"/>
+                <w:lang w:val="en-US"/>
+              </w:rPr>
+              <w:t xml:space="preserve">) </w:t>
+            </w:r>
+            <w:proofErr w:type="gramStart"/>
+            <w:r>
+              <w:rPr>
+                <w:rFonts w:ascii="Times New Roman" w:hAnsi="Times New Roman" w:cs="Times New Roman"/>
+                <w:sz w:val="20"/>
+                <w:szCs w:val="20"/>
+                <w:lang w:val="en-US"/>
+              </w:rPr>
+              <w:t>{</w:t>
+            </w:r>
+            <w:r>
+              <w:rPr>
+                <w:rFonts w:ascii="Times New Roman" w:hAnsi="Times New Roman" w:cs="Times New Roman"/>
+                <w:sz w:val="20"/>
+                <w:szCs w:val="20"/>
+                <w:lang w:val="en-US"/>
+              </w:rPr>
+              <w:t xml:space="preserve">  </w:t>
+            </w:r>
+            <w:proofErr w:type="gramEnd"/>
+            <w:r>
+              <w:rPr>
+                <w:rFonts w:ascii="Times New Roman" w:hAnsi="Times New Roman" w:cs="Times New Roman"/>
+                <w:sz w:val="20"/>
+                <w:szCs w:val="20"/>
+                <w:lang w:val="en-US"/>
+              </w:rPr>
+              <w:t xml:space="preserve">          </w:t>
             </w:r>
             <w:r>
               <w:rPr>
@@ -4562,9 +5034,19 @@
                 <w:sz w:val="20"/>
                 <w:szCs w:val="20"/>
               </w:rPr>
-              <w:t>entering_guest.check</w:t>
+              <w:t>entering_</w:t>
+            </w:r>
+            <w:proofErr w:type="gramStart"/>
+            <w:r>
+              <w:rPr>
+                <w:rFonts w:ascii="Times New Roman" w:hAnsi="Times New Roman" w:cs="Times New Roman"/>
+                <w:sz w:val="20"/>
+                <w:szCs w:val="20"/>
+              </w:rPr>
+              <w:t>guest.check</w:t>
             </w:r>
             <w:proofErr w:type="spellEnd"/>
+            <w:proofErr w:type="gramEnd"/>
             <w:r>
               <w:rPr>
                 <w:rFonts w:ascii="Times New Roman" w:hAnsi="Times New Roman" w:cs="Times New Roman"/>
@@ -4781,6 +5263,7 @@
               <w:t>MaybeUninit</w:t>
             </w:r>
             <w:proofErr w:type="spellEnd"/>
+            <w:proofErr w:type="gramStart"/>
             <w:r>
               <w:rPr>
                 <w:rFonts w:ascii="Times New Roman" w:hAnsi="Times New Roman" w:cs="Times New Roman"/>
@@ -4799,6 +5282,7 @@
               </w:rPr>
               <w:t xml:space="preserve">   </w:t>
             </w:r>
+            <w:proofErr w:type="gramEnd"/>
             <w:r>
               <w:rPr>
                 <w:rStyle w:val="Refdenotaalfinal"/>
@@ -4842,7 +5326,17 @@
                 <w:szCs w:val="20"/>
                 <w:lang w:val="en-US"/>
               </w:rPr>
-              <w:t>raw.as_mut_ptr</w:t>
+              <w:t>raw.as_mut_</w:t>
+            </w:r>
+            <w:proofErr w:type="gramStart"/>
+            <w:r>
+              <w:rPr>
+                <w:rFonts w:ascii="Times New Roman" w:hAnsi="Times New Roman" w:cs="Times New Roman"/>
+                <w:sz w:val="20"/>
+                <w:szCs w:val="20"/>
+                <w:lang w:val="en-US"/>
+              </w:rPr>
+              <w:t>ptr</w:t>
             </w:r>
             <w:proofErr w:type="spellEnd"/>
             <w:r>
@@ -4852,7 +5346,17 @@
                 <w:szCs w:val="20"/>
                 <w:lang w:val="en-US"/>
               </w:rPr>
-              <w:t>()</w:t>
+              <w:t>(</w:t>
+            </w:r>
+            <w:proofErr w:type="gramEnd"/>
+            <w:r>
+              <w:rPr>
+                <w:rFonts w:ascii="Times New Roman" w:hAnsi="Times New Roman" w:cs="Times New Roman"/>
+                <w:sz w:val="20"/>
+                <w:szCs w:val="20"/>
+                <w:lang w:val="en-US"/>
+              </w:rPr>
+              <w:t>)</w:t>
             </w:r>
           </w:p>
         </w:tc>
@@ -4878,7 +5382,7 @@
           <w:color w:val="000000" w:themeColor="text1"/>
         </w:rPr>
       </w:pPr>
-      <w:bookmarkStart w:id="6" w:name="_Toc207305894"/>
+      <w:bookmarkStart w:id="7" w:name="_Toc207456357"/>
       <w:r>
         <w:rPr>
           <w:rStyle w:val="nfasissutil"/>
@@ -4960,59 +5464,23 @@
           <w:rFonts w:ascii="Times New Roman" w:hAnsi="Times New Roman" w:cs="Times New Roman"/>
           <w:color w:val="000000" w:themeColor="text1"/>
         </w:rPr>
-        <w:t xml:space="preserve"> visto</w:t>
-      </w:r>
-      <w:bookmarkEnd w:id="6"/>
-    </w:p>
-    <w:p>
-      <w:pPr>
-        <w:spacing w:after="0" w:line="240" w:lineRule="auto"/>
-        <w:rPr>
-          <w:rFonts w:ascii="Times New Roman" w:hAnsi="Times New Roman" w:cs="Times New Roman"/>
-          <w:sz w:val="24"/>
-          <w:szCs w:val="24"/>
-        </w:rPr>
-      </w:pPr>
-    </w:p>
-    <w:p>
-      <w:pPr>
-        <w:spacing w:after="0" w:line="240" w:lineRule="auto"/>
-        <w:rPr>
-          <w:rFonts w:ascii="Times New Roman" w:hAnsi="Times New Roman" w:cs="Times New Roman"/>
-          <w:sz w:val="24"/>
-          <w:szCs w:val="24"/>
-        </w:rPr>
-      </w:pPr>
-    </w:p>
-    <w:p>
-      <w:pPr>
-        <w:spacing w:after="0" w:line="240" w:lineRule="auto"/>
-        <w:rPr>
-          <w:rFonts w:ascii="Times New Roman" w:hAnsi="Times New Roman" w:cs="Times New Roman"/>
-          <w:sz w:val="24"/>
-          <w:szCs w:val="24"/>
-        </w:rPr>
-      </w:pPr>
-    </w:p>
-    <w:p>
-      <w:pPr>
-        <w:spacing w:after="0" w:line="240" w:lineRule="auto"/>
-        <w:rPr>
-          <w:rFonts w:ascii="Times New Roman" w:hAnsi="Times New Roman" w:cs="Times New Roman"/>
-          <w:sz w:val="24"/>
-          <w:szCs w:val="24"/>
-        </w:rPr>
-      </w:pPr>
-    </w:p>
-    <w:p>
-      <w:pPr>
-        <w:spacing w:after="0" w:line="240" w:lineRule="auto"/>
-        <w:rPr>
-          <w:rFonts w:ascii="Times New Roman" w:hAnsi="Times New Roman" w:cs="Times New Roman"/>
-          <w:sz w:val="24"/>
-          <w:szCs w:val="24"/>
-        </w:rPr>
-      </w:pPr>
+        <w:t xml:space="preserve"> </w:t>
+      </w:r>
+      <w:r>
+        <w:rPr>
+          <w:rFonts w:ascii="Times New Roman" w:hAnsi="Times New Roman" w:cs="Times New Roman"/>
+          <w:color w:val="000000" w:themeColor="text1"/>
+        </w:rPr>
+        <w:t>analizado</w:t>
+      </w:r>
+      <w:bookmarkEnd w:id="7"/>
+    </w:p>
+    <w:p/>
+    <w:p/>
+    <w:p>
+      <w:r>
+        <w:br w:type="page"/>
+      </w:r>
     </w:p>
     <w:p>
       <w:pPr>
@@ -5022,7 +5490,7 @@
           <w:color w:val="000000" w:themeColor="text1"/>
         </w:rPr>
       </w:pPr>
-      <w:bookmarkStart w:id="7" w:name="_Toc207305895"/>
+      <w:bookmarkStart w:id="8" w:name="_Toc207456358"/>
       <w:r>
         <w:rPr>
           <w:rFonts w:ascii="Times New Roman" w:hAnsi="Times New Roman" w:cs="Times New Roman"/>
@@ -5038,7 +5506,7 @@
         </w:rPr>
         <w:t>Referencias</w:t>
       </w:r>
-      <w:bookmarkEnd w:id="7"/>
+      <w:bookmarkEnd w:id="8"/>
     </w:p>
     <w:p>
       <w:pPr>
@@ -5210,25 +5678,7 @@
             <w:sz w:val="24"/>
             <w:szCs w:val="24"/>
           </w:rPr>
-          <w:t>https://doc.rust-lang.org/src/core/mem/</w:t>
-        </w:r>
-        <w:r>
-          <w:rPr>
-            <w:rStyle w:val="Hipervnculo"/>
-            <w:rFonts w:ascii="Times New Roman" w:hAnsi="Times New Roman" w:cs="Times New Roman"/>
-            <w:sz w:val="24"/>
-            <w:szCs w:val="24"/>
-          </w:rPr>
-          <w:t>mod</w:t>
-        </w:r>
-        <w:r>
-          <w:rPr>
-            <w:rStyle w:val="Hipervnculo"/>
-            <w:rFonts w:ascii="Times New Roman" w:hAnsi="Times New Roman" w:cs="Times New Roman"/>
-            <w:sz w:val="24"/>
-            <w:szCs w:val="24"/>
-          </w:rPr>
-          <w:t>.rs.html</w:t>
+          <w:t>https://doc.rust-lang.org/src/core/mem/mod.rs.html</w:t>
         </w:r>
       </w:hyperlink>
       <w:r>
@@ -5478,7 +5928,13 @@
         <w:annotationRef/>
       </w:r>
       <w:r>
-        <w:t>Revisar la idea de entre que y que se hace</w:t>
+        <w:t xml:space="preserve">Revisar la idea de entre </w:t>
+      </w:r>
+      <w:r>
+        <w:t>qué</w:t>
+      </w:r>
+      <w:r>
+        <w:t xml:space="preserve"> y que se hace</w:t>
       </w:r>
     </w:p>
   </w:comment>
@@ -5810,6 +6266,9 @@
         </w:pPr>
         <w:sdt>
           <w:sdtPr>
+            <w:rPr>
+              <w:rFonts w:ascii="Times New Roman" w:hAnsi="Times New Roman" w:cs="Times New Roman"/>
+            </w:rPr>
             <w:alias w:val="Autor"/>
             <w:tag w:val=""/>
             <w:id w:val="-99885719"/>
@@ -5821,6 +6280,9 @@
           </w:sdtPr>
           <w:sdtContent>
             <w:r>
+              <w:rPr>
+                <w:rFonts w:ascii="Times New Roman" w:hAnsi="Times New Roman" w:cs="Times New Roman"/>
+              </w:rPr>
               <w:t>Guzman, Alexis Uriel</w:t>
             </w:r>
           </w:sdtContent>
@@ -6326,7 +6788,7 @@
         <w:noProof/>
       </w:rPr>
       <w:drawing>
-        <wp:anchor distT="0" distB="0" distL="114300" distR="114300" simplePos="0" relativeHeight="251658240" behindDoc="1" locked="0" layoutInCell="1" allowOverlap="1" wp14:anchorId="1563DB6A" wp14:editId="7BBB78E4">
+        <wp:anchor distT="0" distB="0" distL="114300" distR="114300" simplePos="0" relativeHeight="251658240" behindDoc="1" locked="0" layoutInCell="1" allowOverlap="1" wp14:anchorId="1563DB6A" wp14:editId="23866515">
           <wp:simplePos x="0" y="0"/>
           <wp:positionH relativeFrom="column">
             <wp:posOffset>34925</wp:posOffset>
@@ -6350,7 +6812,7 @@
                 </pic:nvPicPr>
                 <pic:blipFill>
                   <a:blip r:embed="rId1">
-                    <a:alphaModFix amt="69000"/>
+                    <a:alphaModFix amt="35000"/>
                     <a:extLst>
                       <a:ext uri="{BEBA8EAE-BF5A-486C-A8C5-ECC9F3942E4B}">
                         <a14:imgProps xmlns:a14="http://schemas.microsoft.com/office/drawing/2010/main">
@@ -6459,9 +6921,6 @@
                             <w:alias w:val="Título"/>
                             <w:tag w:val=""/>
                             <w:id w:val="114869462"/>
-                            <w:placeholder>
-                              <w:docPart w:val="9F619BC380864A009E9C1231D5FEA2AD"/>
-                            </w:placeholder>
                             <w:dataBinding w:prefixMappings="xmlns:ns0='http://purl.org/dc/elements/1.1/' xmlns:ns1='http://schemas.openxmlformats.org/package/2006/metadata/core-properties' " w:xpath="/ns1:coreProperties[1]/ns0:title[1]" w:storeItemID="{6C3C8BC8-F283-45AE-878A-BAB7291924A1}"/>
                             <w:text/>
                           </w:sdtPr>
@@ -6519,9 +6978,6 @@
                       <w:alias w:val="Título"/>
                       <w:tag w:val=""/>
                       <w:id w:val="114869462"/>
-                      <w:placeholder>
-                        <w:docPart w:val="9F619BC380864A009E9C1231D5FEA2AD"/>
-                      </w:placeholder>
                       <w:dataBinding w:prefixMappings="xmlns:ns0='http://purl.org/dc/elements/1.1/' xmlns:ns1='http://schemas.openxmlformats.org/package/2006/metadata/core-properties' " w:xpath="/ns1:coreProperties[1]/ns0:title[1]" w:storeItemID="{6C3C8BC8-F283-45AE-878A-BAB7291924A1}"/>
                       <w:text/>
                     </w:sdtPr>
@@ -6797,13 +7253,7 @@
           <w:rPr>
             <w:rFonts w:ascii="Times New Roman" w:hAnsi="Times New Roman" w:cs="Times New Roman"/>
           </w:rPr>
-          <w:t xml:space="preserve">, </w:t>
-        </w:r>
-        <w:r>
-          <w:rPr>
-            <w:rFonts w:ascii="Times New Roman" w:hAnsi="Times New Roman" w:cs="Times New Roman"/>
-          </w:rPr>
-          <w:t>Alexis Uriel</w:t>
+          <w:t>, Alexis Uriel</w:t>
         </w:r>
       </w:sdtContent>
     </w:sdt>
@@ -6828,6 +7278,95 @@
 <file path=word/numbering.xml><?xml version="1.0" encoding="utf-8"?>
 <w:numbering xmlns:wpc="http://schemas.microsoft.com/office/word/2010/wordprocessingCanvas" xmlns:cx="http://schemas.microsoft.com/office/drawing/2014/chartex" xmlns:cx1="http://schemas.microsoft.com/office/drawing/2015/9/8/chartex" xmlns:cx2="http://schemas.microsoft.com/office/drawing/2015/10/21/chartex" xmlns:cx3="http://schemas.microsoft.com/office/drawing/2016/5/9/chartex" xmlns:cx4="http://schemas.microsoft.com/office/drawing/2016/5/10/chartex" xmlns:cx5="http://schemas.microsoft.com/office/drawing/2016/5/11/chartex" xmlns:cx6="http://schemas.microsoft.com/office/drawing/2016/5/12/chartex" xmlns:cx7="http://schemas.microsoft.com/office/drawing/2016/5/13/chartex" xmlns:cx8="http://schemas.microsoft.com/office/drawing/2016/5/14/chartex" xmlns:mc="http://schemas.openxmlformats.org/markup-compatibility/2006" xmlns:aink="http://schemas.microsoft.com/office/drawing/2016/ink" xmlns:am3d="http://schemas.microsoft.com/office/drawing/2017/model3d" xmlns:o="urn:schemas-microsoft-com:office:office" xmlns:oel="http://schemas.microsoft.com/office/2019/extlst" xmlns:r="http://schemas.openxmlformats.org/officeDocument/2006/relationships" xmlns:m="http://schemas.openxmlformats.org/officeDocument/2006/math" xmlns:v="urn:schemas-microsoft-com:vml" xmlns:wp14="http://schemas.microsoft.com/office/word/2010/wordprocessingDrawing" xmlns:wp="http://schemas.openxmlformats.org/drawingml/2006/wordprocessingDrawing" xmlns:w10="urn:schemas-microsoft-com:office:word" xmlns:w="http://schemas.openxmlformats.org/wordprocessingml/2006/main" xmlns:w14="http://schemas.microsoft.com/office/word/2010/wordml" xmlns:w15="http://schemas.microsoft.com/office/word/2012/wordml" xmlns:w16cex="http://schemas.microsoft.com/office/word/2018/wordml/cex" xmlns:w16cid="http://schemas.microsoft.com/office/word/2016/wordml/cid" xmlns:w16="http://schemas.microsoft.com/office/word/2018/wordml" xmlns:w16du="http://schemas.microsoft.com/office/word/2023/wordml/word16du" xmlns:w16sdtdh="http://schemas.microsoft.com/office/word/2020/wordml/sdtdatahash" xmlns:w16sdtfl="http://schemas.microsoft.com/office/word/2024/wordml/sdtformatlock" xmlns:w16se="http://schemas.microsoft.com/office/word/2015/wordml/symex" xmlns:wpg="http://schemas.microsoft.com/office/word/2010/wordprocessingGroup" xmlns:wpi="http://schemas.microsoft.com/office/word/2010/wordprocessingInk" xmlns:wne="http://schemas.microsoft.com/office/word/2006/wordml" xmlns:wps="http://schemas.microsoft.com/office/word/2010/wordprocessingShape" mc:Ignorable="w14 w15 w16se w16cid w16 w16cex w16sdtdh w16sdtfl w16du wp14">
   <w:abstractNum w:abstractNumId="0" w15:restartNumberingAfterBreak="0">
+    <w:nsid w:val="177C247E"/>
+    <w:multiLevelType w:val="hybridMultilevel"/>
+    <w:tmpl w:val="1CAE9834"/>
+    <w:lvl w:ilvl="0" w:tplc="080A000F">
+      <w:start w:val="1"/>
+      <w:numFmt w:val="decimal"/>
+      <w:lvlText w:val="%1."/>
+      <w:lvlJc w:val="left"/>
+      <w:pPr>
+        <w:ind w:left="720" w:hanging="360"/>
+      </w:pPr>
+      <w:rPr>
+        <w:rFonts w:hint="default"/>
+      </w:rPr>
+    </w:lvl>
+    <w:lvl w:ilvl="1" w:tplc="080A0019" w:tentative="1">
+      <w:start w:val="1"/>
+      <w:numFmt w:val="lowerLetter"/>
+      <w:lvlText w:val="%2."/>
+      <w:lvlJc w:val="left"/>
+      <w:pPr>
+        <w:ind w:left="1440" w:hanging="360"/>
+      </w:pPr>
+    </w:lvl>
+    <w:lvl w:ilvl="2" w:tplc="080A001B" w:tentative="1">
+      <w:start w:val="1"/>
+      <w:numFmt w:val="lowerRoman"/>
+      <w:lvlText w:val="%3."/>
+      <w:lvlJc w:val="right"/>
+      <w:pPr>
+        <w:ind w:left="2160" w:hanging="180"/>
+      </w:pPr>
+    </w:lvl>
+    <w:lvl w:ilvl="3" w:tplc="080A000F" w:tentative="1">
+      <w:start w:val="1"/>
+      <w:numFmt w:val="decimal"/>
+      <w:lvlText w:val="%4."/>
+      <w:lvlJc w:val="left"/>
+      <w:pPr>
+        <w:ind w:left="2880" w:hanging="360"/>
+      </w:pPr>
+    </w:lvl>
+    <w:lvl w:ilvl="4" w:tplc="080A0019" w:tentative="1">
+      <w:start w:val="1"/>
+      <w:numFmt w:val="lowerLetter"/>
+      <w:lvlText w:val="%5."/>
+      <w:lvlJc w:val="left"/>
+      <w:pPr>
+        <w:ind w:left="3600" w:hanging="360"/>
+      </w:pPr>
+    </w:lvl>
+    <w:lvl w:ilvl="5" w:tplc="080A001B" w:tentative="1">
+      <w:start w:val="1"/>
+      <w:numFmt w:val="lowerRoman"/>
+      <w:lvlText w:val="%6."/>
+      <w:lvlJc w:val="right"/>
+      <w:pPr>
+        <w:ind w:left="4320" w:hanging="180"/>
+      </w:pPr>
+    </w:lvl>
+    <w:lvl w:ilvl="6" w:tplc="080A000F" w:tentative="1">
+      <w:start w:val="1"/>
+      <w:numFmt w:val="decimal"/>
+      <w:lvlText w:val="%7."/>
+      <w:lvlJc w:val="left"/>
+      <w:pPr>
+        <w:ind w:left="5040" w:hanging="360"/>
+      </w:pPr>
+    </w:lvl>
+    <w:lvl w:ilvl="7" w:tplc="080A0019" w:tentative="1">
+      <w:start w:val="1"/>
+      <w:numFmt w:val="lowerLetter"/>
+      <w:lvlText w:val="%8."/>
+      <w:lvlJc w:val="left"/>
+      <w:pPr>
+        <w:ind w:left="5760" w:hanging="360"/>
+      </w:pPr>
+    </w:lvl>
+    <w:lvl w:ilvl="8" w:tplc="080A001B" w:tentative="1">
+      <w:start w:val="1"/>
+      <w:numFmt w:val="lowerRoman"/>
+      <w:lvlText w:val="%9."/>
+      <w:lvlJc w:val="right"/>
+      <w:pPr>
+        <w:ind w:left="6480" w:hanging="180"/>
+      </w:pPr>
+    </w:lvl>
+  </w:abstractNum>
+  <w:abstractNum w:abstractNumId="1" w15:restartNumberingAfterBreak="0">
     <w:nsid w:val="38CB7B9A"/>
     <w:multiLevelType w:val="hybridMultilevel"/>
     <w:tmpl w:val="137A7156"/>
@@ -6914,6 +7453,9 @@
     </w:lvl>
   </w:abstractNum>
   <w:num w:numId="1" w16cid:durableId="1768192703">
+    <w:abstractNumId w:val="1"/>
+  </w:num>
+  <w:num w:numId="2" w16cid:durableId="1735469762">
     <w:abstractNumId w:val="0"/>
   </w:num>
 </w:numbering>
@@ -7529,6 +8071,7 @@
   <w:style w:type="character" w:default="1" w:styleId="Fuentedeprrafopredeter">
     <w:name w:val="Default Paragraph Font"/>
     <w:uiPriority w:val="1"/>
+    <w:semiHidden/>
     <w:unhideWhenUsed/>
   </w:style>
   <w:style w:type="table" w:default="1" w:styleId="Tablanormal">
@@ -8405,9 +8948,11 @@
     <w:rsid w:val="000556CB"/>
     <w:rsid w:val="00084826"/>
     <w:rsid w:val="000935D0"/>
+    <w:rsid w:val="003A59FF"/>
     <w:rsid w:val="00467099"/>
     <w:rsid w:val="005260EB"/>
     <w:rsid w:val="005A4148"/>
+    <w:rsid w:val="00813A64"/>
     <w:rsid w:val="0081647A"/>
     <w:rsid w:val="008165EE"/>
     <w:rsid w:val="00857D7C"/>
@@ -8416,6 +8961,7 @@
     <w:rsid w:val="00BA75DF"/>
     <w:rsid w:val="00C352D1"/>
     <w:rsid w:val="00C77E5E"/>
+    <w:rsid w:val="00E2172B"/>
     <w:rsid w:val="00E73212"/>
   </w:rsids>
   <m:mathPr>
@@ -8885,30 +9431,6 @@
       <w:color w:val="666666"/>
     </w:rPr>
   </w:style>
-  <w:style w:type="paragraph" w:customStyle="1" w:styleId="76B770E7F2774BDD9E82EA95FAB9E9F3">
-    <w:name w:val="76B770E7F2774BDD9E82EA95FAB9E9F3"/>
-    <w:rsid w:val="008C63B1"/>
-  </w:style>
-  <w:style w:type="paragraph" w:customStyle="1" w:styleId="3FE949746B5A489F9B6847C4D84800FA">
-    <w:name w:val="3FE949746B5A489F9B6847C4D84800FA"/>
-    <w:rsid w:val="008C63B1"/>
-  </w:style>
-  <w:style w:type="paragraph" w:customStyle="1" w:styleId="2D5A1FA7FA21483BA5F8BA4FCD74413A">
-    <w:name w:val="2D5A1FA7FA21483BA5F8BA4FCD74413A"/>
-    <w:rsid w:val="008C63B1"/>
-  </w:style>
-  <w:style w:type="paragraph" w:customStyle="1" w:styleId="732B76251E4847098D12EABAE9EDAC56">
-    <w:name w:val="732B76251E4847098D12EABAE9EDAC56"/>
-    <w:rsid w:val="008C63B1"/>
-  </w:style>
-  <w:style w:type="paragraph" w:customStyle="1" w:styleId="36C0F3B8853D4D769C6888044631AF89">
-    <w:name w:val="36C0F3B8853D4D769C6888044631AF89"/>
-    <w:rsid w:val="008C63B1"/>
-  </w:style>
-  <w:style w:type="paragraph" w:customStyle="1" w:styleId="B86BAB4E6827421BBC00F1C5E8CED598">
-    <w:name w:val="B86BAB4E6827421BBC00F1C5E8CED598"/>
-    <w:rsid w:val="008C63B1"/>
-  </w:style>
   <w:style w:type="paragraph" w:customStyle="1" w:styleId="5EBE477A5DDF4089BFFD78941B2C5F86">
     <w:name w:val="5EBE477A5DDF4089BFFD78941B2C5F86"/>
     <w:rsid w:val="008C63B1"/>

</xml_diff>